<commit_message>
Publish local PT60-Candidate v1.0.1 release candidate
</commit_message>
<xml_diff>
--- a/paper/PT60-Candidate_Scientific_Data_draft.docx
+++ b/paper/PT60-Candidate_Scientific_Data_draft.docx
@@ -39,7 +39,7 @@
         <w:pStyle w:val="Abstract"/>
       </w:pPr>
       <w:r>
-        <w:t xml:space="preserve">Open infrastructure portals often provide geospatial power-network records without explicit bus–branch connectivity or machine-readable distinctions between observed, derived, inferred, and missing information. We assembled</w:t>
+        <w:t xml:space="preserve">Public distribution-network records rarely provide explicit bus–branch topology. We present</w:t>
       </w:r>
       <w:r>
         <w:t xml:space="preserve"> </w:t>
@@ -51,21 +51,7 @@
         <w:t xml:space="preserve">PT60-Candidate</w:t>
       </w:r>
       <w:r>
-        <w:t xml:space="preserve">, a provenance-tracked candidate dataset for Portuguese 60 kV topology reconstruction from E-REDES Open Data. A fail-closed workflow processed 5,334 line features and 586 relevant facility records across 216 reconstruction settings. Version 1.0.0 contains a 484-facility candidate multigraph, 358 retained inter-facility branch records, a complete 1,342-row retained/downgraded/rejected circuit ledger, the sensitivity sweep, provenance records, schemas, checksums, and branch-level public-source triangulation. Internal validation reports 23 passes and two documented warnings across 25 checks. Endpoint-name corruption reduced strong name-based public evidence from 183/358 to 9/358, while spatial displacement reduced corridor evidence from 290/358 to 1/358. Comparison with Portuguese 60 kV OSM/OpenInfraMap records assigns 247 retained branches to strong, 104 to medium, and seven to weak public-evidence categories. These results test record consistency and matcher selectivity; they are not truth labels and do not estimate topology precision or recall. The dataset is intended for topology-reconstruction research, geospatial integration, provenance-aware network analysis, and sensitivity studies. It is not operator validated, is not an operational grid model, and lacks the electrical parameters and operating data required for AC power-flow or OPF studies. The versioned dataset is deposited in figshare under DOI</w:t>
-      </w:r>
-      <w:r>
-        <w:t xml:space="preserve"> </w:t>
-      </w:r>
-      <w:hyperlink r:id="rId20">
-        <w:r>
-          <w:rPr>
-            <w:rStyle w:val="Hyperlink"/>
-          </w:rPr>
-          <w:t xml:space="preserve">10.6084/m9.figshare.32984021</w:t>
-        </w:r>
-      </w:hyperlink>
-      <w:r>
-        <w:t xml:space="preserve">.</w:t>
+        <w:t xml:space="preserve">, a provenance-tracked candidate dataset for the Portuguese E-REDES 60 kV layer and its fail-closed construction pipeline. From 5,334 line features and 586 facility records, the selected configuration yields 1,342 classified circuit candidates: 358 retained inter-facility branches and 984 downgraded or rejected records with reasons. Version 1.0.1 includes a 484-node multigraph, 216-configuration sensitivity sweep, source manifests, corrected schemas and data dictionary, checksums, and branch-level public-source evidence. Internal validation tests geometry, identifiers, graph–table parity, schema coverage, missingness, and archive integrity. OpenStreetMap/OpenInfraMap triangulation provides inspectable name or corridor evidence for every retained branch; endpoint-name permutation and displaced-geometry controls reduce the corresponding evidence rates by 95.1% and 99.7%. These results test matcher selectivity and public-data concordance, not physical topology accuracy. The dataset is not operator validated, precision and recall are unavailable, and electrical parameters remain incomplete. It supports topology-reconstruction, provenance, geospatial-integration, and interface research, not operational grid studies. Versioned data and code are provided separately.</w:t>
       </w:r>
     </w:p>
     <w:p>
@@ -86,7 +72,7 @@
         <w:t xml:space="preserve">power-grid dataset; data provenance; topology reconstruction; distribution networks; technical validation; open data</w:t>
       </w:r>
     </w:p>
-    <w:bookmarkStart w:id="21" w:name="background-summary"/>
+    <w:bookmarkStart w:id="20" w:name="background-summary"/>
     <w:p>
       <w:pPr>
         <w:pStyle w:val="Heading1"/>
@@ -176,23 +162,115 @@
         <w:t xml:space="preserve">extends that tradition to a Portuguese 60 kV distribution-layer reconstruction problem while making rejected circuits, semantic status fields, and downstream release contracts explicit.</w:t>
       </w:r>
     </w:p>
+    <w:bookmarkEnd w:id="20"/>
+    <w:bookmarkStart w:id="34" w:name="methods"/>
+    <w:p>
+      <w:pPr>
+        <w:pStyle w:val="Heading1"/>
+      </w:pPr>
+      <w:r>
+        <w:t xml:space="preserve">Methods</w:t>
+      </w:r>
+    </w:p>
+    <w:bookmarkStart w:id="21" w:name="source-datasets"/>
+    <w:p>
+      <w:pPr>
+        <w:pStyle w:val="Heading2"/>
+      </w:pPr>
+      <w:r>
+        <w:t xml:space="preserve">Source datasets</w:t>
+      </w:r>
+    </w:p>
+    <w:p>
+      <w:pPr>
+        <w:pStyle w:val="FirstParagraph"/>
+      </w:pPr>
+      <w:r>
+        <w:t xml:space="preserve">The source snapshot combines AT line geometries, AT substations, switching facilities, MT-substation context, network-characteristics tables, substation-load records, reception-capacity context, and load-diagram indices from the E-REDES Open Data Portal</w:t>
+      </w:r>
+      <w:r>
+        <w:t xml:space="preserve"> </w:t>
+      </w:r>
+      <w:r>
+        <w:t xml:space="preserve">(E-REDES 2026)</w:t>
+      </w:r>
+      <w:r>
+        <w:t xml:space="preserve">. The topology-critical inputs are</w:t>
+      </w:r>
+      <w:r>
+        <w:t xml:space="preserve"> </w:t>
+      </w:r>
+      <w:r>
+        <w:rPr>
+          <w:rStyle w:val="VerbatimChar"/>
+        </w:rPr>
+        <w:t xml:space="preserve">rede-at-teste</w:t>
+      </w:r>
+      <w:r>
+        <w:t xml:space="preserve"> </w:t>
+      </w:r>
+      <w:r>
+        <w:t xml:space="preserve">(5,334 records; checked 2026-07-13 14:15:57 UTC),</w:t>
+      </w:r>
+      <w:r>
+        <w:t xml:space="preserve"> </w:t>
+      </w:r>
+      <w:r>
+        <w:rPr>
+          <w:rStyle w:val="VerbatimChar"/>
+        </w:rPr>
+        <w:t xml:space="preserve">se-at_2025</w:t>
+      </w:r>
+      <w:r>
+        <w:t xml:space="preserve"> </w:t>
+      </w:r>
+      <w:r>
+        <w:t xml:space="preserve">(410 records; checked 2026-07-13 14:16:08 UTC), and</w:t>
+      </w:r>
+      <w:r>
+        <w:t xml:space="preserve"> </w:t>
+      </w:r>
+      <w:r>
+        <w:rPr>
+          <w:rStyle w:val="VerbatimChar"/>
+        </w:rPr>
+        <w:t xml:space="preserve">pc-at_2025</w:t>
+      </w:r>
+      <w:r>
+        <w:t xml:space="preserve"> </w:t>
+      </w:r>
+      <w:r>
+        <w:t xml:space="preserve">(76 records; checked 2026-07-13 14:15:31 UTC); their catalog, portal, CSV-export, and GeoJSON-export URLs are preserved in the source manifest. For the documented snapshot, the topology stage loads 586 technically relevant facilities, comprising 409 AT substations and 177 additional facilities. The same snapshot contains 5,334 valid AT line features, of which 5,323 are labeled 60 kV and 11 are labeled 130 kV in the current local build.</w:t>
+      </w:r>
+    </w:p>
+    <w:p>
+      <w:pPr>
+        <w:pStyle w:val="BodyText"/>
+      </w:pPr>
+      <w:r>
+        <w:t xml:space="preserve">The release uses the portal-level license statement reported by E-REDES for distributable data artifacts. The dataset package records publisher attribution, portal URL, source dataset identifiers, access dates, and transformation notices separately from the repository’s MIT code license. Where topology-critical API catalog responses did not repeat an explicit license field, the release policy follows the recorded portal-level statement rather than inferring a different license from the omission. The topology-critical catalog records were checked on 13 July 2026; per-source timestamps are preserved in</w:t>
+      </w:r>
+      <w:r>
+        <w:t xml:space="preserve"> </w:t>
+      </w:r>
+      <w:r>
+        <w:rPr>
+          <w:rStyle w:val="VerbatimChar"/>
+        </w:rPr>
+        <w:t xml:space="preserve">provenance/reproduction_source_manifest.json</w:t>
+      </w:r>
+      <w:r>
+        <w:t xml:space="preserve">.</w:t>
+      </w:r>
+    </w:p>
     <w:bookmarkEnd w:id="21"/>
-    <w:bookmarkStart w:id="35" w:name="methods"/>
-    <w:p>
-      <w:pPr>
-        <w:pStyle w:val="Heading1"/>
-      </w:pPr>
-      <w:r>
-        <w:t xml:space="preserve">Methods</w:t>
-      </w:r>
-    </w:p>
-    <w:bookmarkStart w:id="22" w:name="source-datasets"/>
+    <w:bookmarkStart w:id="22" w:name="data-acquisition"/>
     <w:p>
       <w:pPr>
         <w:pStyle w:val="Heading2"/>
       </w:pPr>
       <w:r>
-        <w:t xml:space="preserve">Source datasets</w:t>
+        <w:t xml:space="preserve">Data acquisition</w:t>
       </w:r>
     </w:p>
     <w:p>
@@ -200,16 +278,7 @@
         <w:pStyle w:val="FirstParagraph"/>
       </w:pPr>
       <w:r>
-        <w:t xml:space="preserve">The source snapshot combines AT line geometries, AT substations, switching facilities, MT-substation context, network-characteristics tables, substation-load records, reception-capacity context, and load-diagram indices from the E-REDES Open Data Portal</w:t>
-      </w:r>
-      <w:r>
-        <w:t xml:space="preserve"> </w:t>
-      </w:r>
-      <w:r>
-        <w:t xml:space="preserve">(E-REDES 2026)</w:t>
-      </w:r>
-      <w:r>
-        <w:t xml:space="preserve">. For the documented snapshot, the topology stage loads 586 technically relevant facilities, comprising 409 AT substations and 177 additional facilities. The same snapshot contains 5,334 valid AT line features, of which 5,323 are labeled 60 kV and 11 are labeled 130 kV in the current local build.</w:t>
+        <w:t xml:space="preserve">Source files are downloaded and validated through a reproducible workflow that records dataset roles, retrieval checks, and release metadata in a source manifest. The source manifest currently covers 13 datasets and is intended to accompany any public release. Geometry parsing and machine-readability checks occur before reconstruction so that parse failures become explicit blocking states rather than silent exclusions.</w:t>
       </w:r>
     </w:p>
     <w:p>
@@ -217,29 +286,17 @@
         <w:pStyle w:val="BodyText"/>
       </w:pPr>
       <w:r>
-        <w:t xml:space="preserve">The release uses the portal-level license statement reported by E-REDES for distributable data artifacts. The dataset package records publisher attribution, portal URL, source dataset identifiers, access dates, and transformation notices separately from the repository’s MIT code license. Where topology-critical API catalog responses did not repeat an explicit license field, the release policy follows the recorded portal-level statement rather than inferring a different license from the omission. The topology-critical catalog records were checked on 13 July 2026; per-source timestamps are preserved in</w:t>
-      </w:r>
-      <w:r>
-        <w:t xml:space="preserve"> </w:t>
-      </w:r>
-      <w:r>
-        <w:rPr>
-          <w:rStyle w:val="VerbatimChar"/>
-        </w:rPr>
-        <w:t xml:space="preserve">provenance/reproduction_source_manifest.json</w:t>
-      </w:r>
-      <w:r>
-        <w:t xml:space="preserve">.</w:t>
+        <w:t xml:space="preserve">The acquisition scope is limited to the E-REDES AT layer represented in the documented snapshot. It does not include a verified REN transmission boundary, complete national generation, measured operating conditions, or authoritative switching-state data. These omissions are treated as scope boundaries of the dataset rather than as gaps to be silently imputed.</w:t>
       </w:r>
     </w:p>
     <w:bookmarkEnd w:id="22"/>
-    <w:bookmarkStart w:id="23" w:name="data-acquisition"/>
+    <w:bookmarkStart w:id="23" w:name="data-preprocessing"/>
     <w:p>
       <w:pPr>
         <w:pStyle w:val="Heading2"/>
       </w:pPr>
       <w:r>
-        <w:t xml:space="preserve">Data acquisition</w:t>
+        <w:t xml:space="preserve">Data preprocessing</w:t>
       </w:r>
     </w:p>
     <w:p>
@@ -247,7 +304,7 @@
         <w:pStyle w:val="FirstParagraph"/>
       </w:pPr>
       <w:r>
-        <w:t xml:space="preserve">Source files are downloaded and validated through a reproducible workflow that records dataset roles, retrieval checks, and release metadata in a source manifest. The source manifest currently covers 13 datasets and is intended to accompany any public release. Geometry parsing and machine-readability checks occur before reconstruction so that parse failures become explicit blocking states rather than silent exclusions.</w:t>
+        <w:t xml:space="preserve">Preprocessing harmonizes source geometries, facility identifiers, and facility classes before topology inference. The workflow validates geometry type and validity, repairs parseable geometry issues where permitted by the loader, performs coordinate-reference conversions needed for endpoint and corridor calculations, and derives geometry-based quantities such as length. These transformations are recorded as derived rather than observed values.</w:t>
       </w:r>
     </w:p>
     <w:p>
@@ -255,37 +312,11 @@
         <w:pStyle w:val="BodyText"/>
       </w:pPr>
       <w:r>
-        <w:t xml:space="preserve">The acquisition scope is limited to the E-REDES AT layer represented in the documented snapshot. It does not include a verified REN transmission boundary, complete national generation, measured operating conditions, or authoritative switching-state data. These omissions are treated as scope boundaries of the dataset rather than as gaps to be silently imputed.</w:t>
+        <w:t xml:space="preserve">Facilities are standardized into node candidates with associated codes, names, types, source roles, and footprint-ready geometries. Source line features are standardized into endpoint-bearing line records. Ambiguous matches and unresolved endpoints are retained as explicit states for later classification. This preprocessing stage therefore prepares line and facility inputs for reconstruction without asserting that each input line already corresponds to a valid inter-facility branch.</w:t>
       </w:r>
     </w:p>
     <w:bookmarkEnd w:id="23"/>
-    <w:bookmarkStart w:id="24" w:name="data-preprocessing"/>
-    <w:p>
-      <w:pPr>
-        <w:pStyle w:val="Heading2"/>
-      </w:pPr>
-      <w:r>
-        <w:t xml:space="preserve">Data preprocessing</w:t>
-      </w:r>
-    </w:p>
-    <w:p>
-      <w:pPr>
-        <w:pStyle w:val="FirstParagraph"/>
-      </w:pPr>
-      <w:r>
-        <w:t xml:space="preserve">Preprocessing harmonizes source geometries, facility identifiers, and facility classes before topology inference. The workflow validates geometry type and validity, repairs parseable geometry issues where permitted by the loader, performs coordinate-reference conversions needed for endpoint and corridor calculations, and derives geometry-based quantities such as length. These transformations are recorded as derived rather than observed values.</w:t>
-      </w:r>
-    </w:p>
-    <w:p>
-      <w:pPr>
-        <w:pStyle w:val="BodyText"/>
-      </w:pPr>
-      <w:r>
-        <w:t xml:space="preserve">Facilities are standardized into node candidates with associated codes, names, types, source roles, and footprint-ready geometries. Source line features are standardized into endpoint-bearing line records. Ambiguous matches and unresolved endpoints are retained as explicit states for later classification. This preprocessing stage therefore prepares line and facility inputs for reconstruction without asserting that each input line already corresponds to a valid inter-facility branch.</w:t>
-      </w:r>
-    </w:p>
-    <w:bookmarkEnd w:id="24"/>
-    <w:bookmarkStart w:id="26" w:name="provenance-model"/>
+    <w:bookmarkStart w:id="25" w:name="provenance-model"/>
     <w:p>
       <w:pPr>
         <w:pStyle w:val="Heading2"/>
@@ -503,7 +534,7 @@
         <w:t xml:space="preserve">an exclusion or blocking reason.</w:t>
       </w:r>
     </w:p>
-    <w:bookmarkStart w:id="25" w:name="tab:semantics"/>
+    <w:bookmarkStart w:id="24" w:name="tab:semantics"/>
     <w:p>
       <w:pPr>
         <w:pStyle w:val="TableCaption"/>
@@ -776,82 +807,104 @@
         </w:tc>
       </w:tr>
     </w:tbl>
+    <w:bookmarkEnd w:id="24"/>
+    <w:p>
+      <w:pPr>
+        <w:pStyle w:val="BodyText"/>
+      </w:pPr>
+      <w:r>
+        <w:t xml:space="preserve">Table </w:t>
+      </w:r>
+      <w:hyperlink w:anchor="tab:semantics">
+        <w:r>
+          <w:rPr>
+            <w:rStyle w:val="Hyperlink"/>
+          </w:rPr>
+          <w:t xml:space="preserve">1</w:t>
+        </w:r>
+      </w:hyperlink>
+      <w:r>
+        <w:t xml:space="preserve"> </w:t>
+      </w:r>
+      <w:r>
+        <w:t xml:space="preserve">summarizes the evidence distinctions carried into the released records and metadata so that consumers can apply explicit admissibility rules. The complete field-level dictionary is provided as</w:t>
+      </w:r>
+      <w:r>
+        <w:t xml:space="preserve"> </w:t>
+      </w:r>
+      <w:r>
+        <w:rPr>
+          <w:rStyle w:val="VerbatimChar"/>
+        </w:rPr>
+        <w:t xml:space="preserve">schema/data_dictionary.csv</w:t>
+      </w:r>
+      <w:r>
+        <w:t xml:space="preserve">;</w:t>
+      </w:r>
+      <w:r>
+        <w:t xml:space="preserve"> </w:t>
+      </w:r>
+      <w:r>
+        <w:rPr>
+          <w:rStyle w:val="VerbatimChar"/>
+        </w:rPr>
+        <w:t xml:space="preserve">schema/file_schema_summary.csv</w:t>
+      </w:r>
+      <w:r>
+        <w:t xml:space="preserve">,</w:t>
+      </w:r>
+      <w:r>
+        <w:t xml:space="preserve"> </w:t>
+      </w:r>
+      <w:r>
+        <w:rPr>
+          <w:rStyle w:val="VerbatimChar"/>
+        </w:rPr>
+        <w:t xml:space="preserve">schema/join_relationships.csv</w:t>
+      </w:r>
+      <w:r>
+        <w:t xml:space="preserve">, and</w:t>
+      </w:r>
+      <w:r>
+        <w:t xml:space="preserve"> </w:t>
+      </w:r>
+      <w:r>
+        <w:rPr>
+          <w:rStyle w:val="VerbatimChar"/>
+        </w:rPr>
+        <w:t xml:space="preserve">manifest.json</w:t>
+      </w:r>
+      <w:r>
+        <w:t xml:space="preserve"> </w:t>
+      </w:r>
+      <w:r>
+        <w:t xml:space="preserve">provide file-level structure, joins, versions, roles, and checksums.</w:t>
+      </w:r>
+    </w:p>
     <w:bookmarkEnd w:id="25"/>
+    <w:bookmarkStart w:id="30" w:name="reconstruction-pipeline"/>
+    <w:p>
+      <w:pPr>
+        <w:pStyle w:val="Heading2"/>
+      </w:pPr>
+      <w:r>
+        <w:t xml:space="preserve">Reconstruction pipeline</w:t>
+      </w:r>
+    </w:p>
+    <w:p>
+      <w:pPr>
+        <w:pStyle w:val="FirstParagraph"/>
+      </w:pPr>
+      <w:r>
+        <w:t xml:space="preserve">Facility records are converted to circular footprints with radii of 50, 100, 250, and 500 m. Three node sets are evaluated: set A contains 409 AT substations, set B contains 484 AT substations and switching facilities, and set C contains all 586 technically relevant facilities. Each source line contributes two endpoints. When an endpoint intersects multiple footprints, the workflow resolves membership by centroid distance and records ambiguity where needed rather than forcing an unqualified assignment.</w:t>
+      </w:r>
+    </w:p>
     <w:p>
       <w:pPr>
         <w:pStyle w:val="BodyText"/>
       </w:pPr>
       <w:r>
-        <w:t xml:space="preserve">These statuses are carried into the released records and metadata so that consumers can apply explicit admissibility rules. The complete field-level dictionary is provided as</w:t>
-      </w:r>
-      <w:r>
-        <w:t xml:space="preserve"> </w:t>
-      </w:r>
-      <w:r>
-        <w:rPr>
-          <w:rStyle w:val="VerbatimChar"/>
-        </w:rPr>
-        <w:t xml:space="preserve">schema/data_dictionary.csv</w:t>
-      </w:r>
-      <w:r>
-        <w:t xml:space="preserve">;</w:t>
-      </w:r>
-      <w:r>
-        <w:t xml:space="preserve"> </w:t>
-      </w:r>
-      <w:r>
-        <w:rPr>
-          <w:rStyle w:val="VerbatimChar"/>
-        </w:rPr>
-        <w:t xml:space="preserve">schema/file_schema_summary.csv</w:t>
-      </w:r>
-      <w:r>
-        <w:t xml:space="preserve">,</w:t>
-      </w:r>
-      <w:r>
-        <w:t xml:space="preserve"> </w:t>
-      </w:r>
-      <w:r>
-        <w:rPr>
-          <w:rStyle w:val="VerbatimChar"/>
-        </w:rPr>
-        <w:t xml:space="preserve">schema/join_relationships.csv</w:t>
-      </w:r>
-      <w:r>
-        <w:t xml:space="preserve">, and</w:t>
-      </w:r>
-      <w:r>
-        <w:t xml:space="preserve"> </w:t>
-      </w:r>
-      <w:r>
-        <w:rPr>
-          <w:rStyle w:val="VerbatimChar"/>
-        </w:rPr>
-        <w:t xml:space="preserve">manifest.json</w:t>
-      </w:r>
-      <w:r>
-        <w:t xml:space="preserve"> </w:t>
-      </w:r>
-      <w:r>
-        <w:t xml:space="preserve">provide file-level structure, joins, versions, roles, and checksums.</w:t>
-      </w:r>
-    </w:p>
-    <w:bookmarkEnd w:id="26"/>
-    <w:bookmarkStart w:id="31" w:name="reconstruction-pipeline"/>
-    <w:p>
-      <w:pPr>
-        <w:pStyle w:val="Heading2"/>
-      </w:pPr>
-      <w:r>
-        <w:t xml:space="preserve">Reconstruction pipeline</w:t>
-      </w:r>
-    </w:p>
-    <w:p>
-      <w:pPr>
-        <w:pStyle w:val="FirstParagraph"/>
-      </w:pPr>
-      <w:r>
-        <w:t xml:space="preserve">Facility records are converted to circular footprints with radii of 50, 100, 250, and 500 m. Three node sets are evaluated: set A contains 409 AT substations, set B contains 484 AT substations and switching facilities, and set C contains all 586 technically relevant facilities. Each source line contributes two endpoints. When an endpoint intersects multiple footprints, the workflow resolves membership by centroid distance and records ambiguity where needed rather than forcing an unqualified assignment.</w:t>
+        <w:t xml:space="preserve">Endpoints are then clustered at 0.5, 1, 5, 10, 25, and 50 m. Union–find merging groups features into circuit candidates under geometry-only, voltage-aware, or voltage-plus-status-aware compatibility rules. Explicit conflicts block merging in the corresponding compatibility mode. Endpoint-cluster degree is then used to distinguish ordinary terminal pairs from loop, self-loop, isolated, and tap or multi-terminal patterns.</w:t>
       </w:r>
     </w:p>
     <w:p>
@@ -859,10 +912,24 @@
         <w:pStyle w:val="BodyText"/>
       </w:pPr>
       <w:r>
-        <w:t xml:space="preserve">Endpoints are then clustered at 0.5, 1, 5, 10, 25, and 50 m. Union–find merging groups features into circuit candidates under geometry-only, voltage-aware, or voltage-plus-status-aware compatibility rules. Explicit conflicts block merging in the corresponding compatibility mode. Endpoint-cluster degree is then used to distinguish ordinary terminal pairs from loop, self-loop, isolated, and tap or multi-terminal patterns.</w:t>
-      </w:r>
-    </w:p>
-    <w:bookmarkStart w:id="30" w:name="fig:pipeline"/>
+        <w:t xml:space="preserve">Figure </w:t>
+      </w:r>
+      <w:hyperlink w:anchor="fig:pipeline">
+        <w:r>
+          <w:rPr>
+            <w:rStyle w:val="Hyperlink"/>
+          </w:rPr>
+          <w:t xml:space="preserve">1</w:t>
+        </w:r>
+      </w:hyperlink>
+      <w:r>
+        <w:t xml:space="preserve"> </w:t>
+      </w:r>
+      <w:r>
+        <w:t xml:space="preserve">shows how retained and downgraded records pass through common validation and release-contract stages.</w:t>
+      </w:r>
+    </w:p>
+    <w:bookmarkStart w:id="29" w:name="fig:pipeline"/>
     <w:p>
       <w:pPr>
         <w:pStyle w:val="CaptionedFigure"/>
@@ -872,18 +939,18 @@
           <wp:inline>
             <wp:extent cx="5334000" cy="2667771"/>
             <wp:effectExtent b="0" l="0" r="0" t="0"/>
-            <wp:docPr descr="" title="" id="28" name="Picture"/>
+            <wp:docPr descr="" title="" id="27" name="Picture"/>
             <a:graphic>
               <a:graphicData uri="http://schemas.openxmlformats.org/drawingml/2006/picture">
                 <pic:pic>
                   <pic:nvPicPr>
-                    <pic:cNvPr descr="fig1_pipeline_overview.png" id="29" name="Picture"/>
+                    <pic:cNvPr descr="fig1_pipeline_overview.png" id="28" name="Picture"/>
                     <pic:cNvPicPr>
                       <a:picLocks noChangeArrowheads="1" noChangeAspect="1"/>
                     </pic:cNvPicPr>
                   </pic:nvPicPr>
                   <pic:blipFill>
-                    <a:blip r:embed="rId27"/>
+                    <a:blip r:embed="rId26"/>
                     <a:stretch>
                       <a:fillRect/>
                     </a:stretch>
@@ -930,15 +997,41 @@
         <w:t xml:space="preserve">. Blue boxes denote transformations or validation, the yellow diamond is the declared retention gate, green boxes are deposited release layers, the red box preserves downgraded/rejected records, and the purple box records provenance and reuse contracts. The diagram summarizes workflow structure and claim boundaries rather than measured performance.</w:t>
       </w:r>
     </w:p>
+    <w:bookmarkEnd w:id="29"/>
     <w:bookmarkEnd w:id="30"/>
+    <w:bookmarkStart w:id="31" w:name="candidate-selection"/>
+    <w:p>
+      <w:pPr>
+        <w:pStyle w:val="Heading2"/>
+      </w:pPr>
+      <w:r>
+        <w:t xml:space="preserve">Candidate selection</w:t>
+      </w:r>
+    </w:p>
+    <w:p>
+      <w:pPr>
+        <w:pStyle w:val="FirstParagraph"/>
+      </w:pPr>
+      <w:r>
+        <w:t xml:space="preserve">A merged group is retained as an inter-facility candidate branch only when it has exactly two terminals, both terminals match facilities without disqualifying ambiguity, and the two facilities are distinct. Outcomes failing these conditions remain available in the circuit-classification ledger as loop, self-loop, single-facility, isolated, tap or multi-terminal, ambiguous, or otherwise downgraded records.</w:t>
+      </w:r>
+    </w:p>
+    <w:p>
+      <w:pPr>
+        <w:pStyle w:val="BodyText"/>
+      </w:pPr>
+      <w:r>
+        <w:t xml:space="preserve">This selection policy is intentionally conservative. It favors explicit preservation of non-retained outcomes over optimistic retention. Mixed voltage or status conflicts, suspicious spatial matches, and unresolved facility mappings are retained as audit information instead of being absorbed into a simplified final graph.</w:t>
+      </w:r>
+    </w:p>
     <w:bookmarkEnd w:id="31"/>
-    <w:bookmarkStart w:id="32" w:name="candidate-selection"/>
+    <w:bookmarkStart w:id="32" w:name="parameter-sweep"/>
     <w:p>
       <w:pPr>
         <w:pStyle w:val="Heading2"/>
       </w:pPr>
       <w:r>
-        <w:t xml:space="preserve">Candidate selection</w:t>
+        <w:t xml:space="preserve">Parameter sweep</w:t>
       </w:r>
     </w:p>
     <w:p>
@@ -946,7 +1039,7 @@
         <w:pStyle w:val="FirstParagraph"/>
       </w:pPr>
       <w:r>
-        <w:t xml:space="preserve">A merged group is retained as an inter-facility candidate branch only when it has exactly two terminals, both terminals match facilities without disqualifying ambiguity, and the two facilities are distinct. Outcomes failing these conditions remain available in the circuit-classification ledger as loop, self-loop, single-facility, isolated, tap or multi-terminal, ambiguous, or otherwise downgraded records.</w:t>
+        <w:t xml:space="preserve">The reconstruction workflow evaluates 216 settings generated by combining three facility sets, four footprint buffers, six endpoint snap thresholds, and three merge modes. The selection rule rewards retained inter-facility yield and interpretable component structure while penalizing ambiguity, explicit conflicts, suspicious matches, and the broadest thresholds. The selected release setting uses node set B, a 100 m facility buffer, a 0.5 m endpoint snap threshold, and voltage-plus-status-aware merging.</w:t>
       </w:r>
     </w:p>
     <w:p>
@@ -954,17 +1047,25 @@
         <w:pStyle w:val="BodyText"/>
       </w:pPr>
       <w:r>
-        <w:t xml:space="preserve">This selection policy is intentionally conservative. It favors explicit preservation of non-retained outcomes over optimistic retention. Mixed voltage or status conflicts, suspicious spatial matches, and unresolved facility mappings are retained as audit information instead of being absorbed into a simplified final graph.</w:t>
+        <w:t xml:space="preserve">The score is a reproducible engineering rule used to choose one documented release point from the 216-setting sweep. It is not a calibrated probability of correctness and is not presented as an external optimum.</w:t>
+      </w:r>
+    </w:p>
+    <w:p>
+      <w:pPr>
+        <w:pStyle w:val="BodyText"/>
+      </w:pPr>
+      <w:r>
+        <w:t xml:space="preserve">Large-language-model assistance was used for code review, structural editing, and release-checklist support. The authors inspected the generated changes and remain responsible for the methods, numerical results, citations, release files, and claims. This disclosure must be confirmed against the authors’ actual use before submission.</w:t>
       </w:r>
     </w:p>
     <w:bookmarkEnd w:id="32"/>
-    <w:bookmarkStart w:id="33" w:name="parameter-sweep"/>
+    <w:bookmarkStart w:id="33" w:name="dataset-generation"/>
     <w:p>
       <w:pPr>
         <w:pStyle w:val="Heading2"/>
       </w:pPr>
       <w:r>
-        <w:t xml:space="preserve">Parameter sweep</w:t>
+        <w:t xml:space="preserve">Dataset generation</w:t>
       </w:r>
     </w:p>
     <w:p>
@@ -972,7 +1073,7 @@
         <w:pStyle w:val="FirstParagraph"/>
       </w:pPr>
       <w:r>
-        <w:t xml:space="preserve">The reconstruction workflow evaluates 216 settings generated by combining three facility sets, four footprint buffers, six endpoint snap thresholds, and three merge modes. The selection rule rewards retained inter-facility yield and interpretable component structure while penalizing ambiguity, explicit conflicts, suspicious matches, and the broadest thresholds. The selected release setting uses node set B, a 100 m facility buffer, a 0.5 m endpoint snap threshold, and voltage-plus-status-aware merging.</w:t>
+        <w:t xml:space="preserve">The selected setting converts 5,334 source line features into 1,342 circuit candidates. Of these, 358 satisfy the declared inter-facility rules and are released as retained candidate branches. The remaining 984 circuit candidates are preserved as downgraded records rather than discarded. The selected all-facility GraphML preserves isolated facilities as nodes so that graph outputs remain consistent with the declared isolate policy.</w:t>
       </w:r>
     </w:p>
     <w:p>
@@ -980,17 +1081,27 @@
         <w:pStyle w:val="BodyText"/>
       </w:pPr>
       <w:r>
-        <w:t xml:space="preserve">The score is a reproducible engineering rule used to choose one documented release point from the 216-setting sweep. It is not a calibrated probability of correctness and is not presented as an external optimum.</w:t>
+        <w:t xml:space="preserve">The same workflow packages the reconstruction-sensitivity table, public-source triangulation outputs, negative controls, an independence-risk audit, internal-validation results, source manifests, schemas, and checksum-linked inventory. Electrical diagnostics and Stage 1–5 learning interfaces are excluded from the main v1.0.1 public archive because they depend on incomplete, proxy, benchmark-only, or scenario-derived information.</w:t>
       </w:r>
     </w:p>
     <w:bookmarkEnd w:id="33"/>
-    <w:bookmarkStart w:id="34" w:name="dataset-generation"/>
+    <w:bookmarkEnd w:id="34"/>
+    <w:bookmarkStart w:id="48" w:name="data-records"/>
+    <w:p>
+      <w:pPr>
+        <w:pStyle w:val="Heading1"/>
+      </w:pPr>
+      <w:r>
+        <w:t xml:space="preserve">Data Records</w:t>
+      </w:r>
+    </w:p>
+    <w:bookmarkStart w:id="36" w:name="repository-overview"/>
     <w:p>
       <w:pPr>
         <w:pStyle w:val="Heading2"/>
       </w:pPr>
       <w:r>
-        <w:t xml:space="preserve">Dataset generation</w:t>
+        <w:t xml:space="preserve">Repository overview</w:t>
       </w:r>
     </w:p>
     <w:p>
@@ -998,42 +1109,6 @@
         <w:pStyle w:val="FirstParagraph"/>
       </w:pPr>
       <w:r>
-        <w:t xml:space="preserve">The selected setting converts 5,334 source line features into 1,342 circuit candidates. Of these, 358 satisfy the declared inter-facility rules and are released as retained candidate branches. The remaining 984 circuit candidates are preserved as downgraded records rather than discarded. The selected all-facility GraphML preserves isolated facilities as nodes so that graph outputs remain consistent with the declared isolate policy.</w:t>
-      </w:r>
-    </w:p>
-    <w:p>
-      <w:pPr>
-        <w:pStyle w:val="BodyText"/>
-      </w:pPr>
-      <w:r>
-        <w:t xml:space="preserve">The same workflow packages the reconstruction-sensitivity table, public-source triangulation outputs, negative controls, an independence-risk audit, internal-validation results, source manifests, schemas, and checksum-linked inventory. Electrical diagnostics and Stage 1–5 learning interfaces are excluded from the main v1.0.0 public archive because they depend on incomplete, proxy, benchmark-only, or scenario-derived information.</w:t>
-      </w:r>
-    </w:p>
-    <w:bookmarkEnd w:id="34"/>
-    <w:bookmarkEnd w:id="35"/>
-    <w:bookmarkStart w:id="48" w:name="data-record"/>
-    <w:p>
-      <w:pPr>
-        <w:pStyle w:val="Heading1"/>
-      </w:pPr>
-      <w:r>
-        <w:t xml:space="preserve">Data Record</w:t>
-      </w:r>
-    </w:p>
-    <w:bookmarkStart w:id="36" w:name="repository-overview"/>
-    <w:p>
-      <w:pPr>
-        <w:pStyle w:val="Heading2"/>
-      </w:pPr>
-      <w:r>
-        <w:t xml:space="preserve">Repository overview</w:t>
-      </w:r>
-    </w:p>
-    <w:p>
-      <w:pPr>
-        <w:pStyle w:val="FirstParagraph"/>
-      </w:pPr>
-      <w:r>
         <w:rPr>
           <w:smallCaps/>
         </w:rPr>
@@ -1043,33 +1118,21 @@
         <w:t xml:space="preserve"> </w:t>
       </w:r>
       <w:r>
-        <w:t xml:space="preserve">version 1.0.0 is deposited in figshare</w:t>
-      </w:r>
-      <w:r>
-        <w:t xml:space="preserve"> </w:t>
-      </w:r>
-      <w:r>
-        <w:t xml:space="preserve">(PortugueseOPD contributors 2026)</w:t>
-      </w:r>
-      <w:r>
-        <w:t xml:space="preserve"> </w:t>
-      </w:r>
-      <w:r>
-        <w:t xml:space="preserve">under DOI</w:t>
-      </w:r>
-      <w:r>
-        <w:t xml:space="preserve"> </w:t>
-      </w:r>
-      <w:hyperlink r:id="rId20">
+        <w:t xml:space="preserve">version 1.0.1 has been prepared for a reserved figshare record. Its DOI is</w:t>
+      </w:r>
+      <w:r>
+        <w:t xml:space="preserve"> </w:t>
+      </w:r>
+      <w:hyperlink r:id="rId35">
         <w:r>
           <w:rPr>
             <w:rStyle w:val="Hyperlink"/>
           </w:rPr>
-          <w:t xml:space="preserve">10.6084/m9.figshare.32984021</w:t>
+          <w:t xml:space="preserve">https://doi.org/10.6084/m9.figshare.32984021</w:t>
         </w:r>
       </w:hyperlink>
       <w:r>
-        <w:t xml:space="preserve">. The repository item contains the frozen release archive</w:t>
+        <w:t xml:space="preserve">. The archive</w:t>
       </w:r>
       <w:r>
         <w:t xml:space="preserve"> </w:t>
@@ -1078,10 +1141,13 @@
         <w:rPr>
           <w:rStyle w:val="VerbatimChar"/>
         </w:rPr>
-        <w:t xml:space="preserve">PT60-Candidate-v1.0.0.tar.gz</w:t>
-      </w:r>
-      <w:r>
-        <w:t xml:space="preserve">. The deposited archive has SHA-256</w:t>
+        <w:t xml:space="preserve">PT60-Candidate-v1.0.1.tar.gz</w:t>
+      </w:r>
+      <w:r>
+        <w:t xml:space="preserve"> </w:t>
+      </w:r>
+      <w:r>
+        <w:t xml:space="preserve">has SHA-256</w:t>
       </w:r>
       <w:r>
         <w:t xml:space="preserve"> </w:t>
@@ -1090,10 +1156,10 @@
         <w:rPr>
           <w:rStyle w:val="VerbatimChar"/>
         </w:rPr>
-        <w:t xml:space="preserve">b4a6c370fbf15c078e15b80a3bbc7f517750fdb763d59147b24f59cd160358d7</w:t>
-      </w:r>
-      <w:r>
-        <w:t xml:space="preserve">.</w:t>
+        <w:t xml:space="preserve">f6af1d29af1487b4138eb2ada4ace9a3fa267faac4ea4e51adc8629388f18e3c</w:t>
+      </w:r>
+      <w:r>
+        <w:t xml:space="preserve">. The v1.0.1 file must replace the earlier uploaded draft before the item is published.</w:t>
       </w:r>
     </w:p>
     <w:p>
@@ -1257,7 +1323,21 @@
         <w:t xml:space="preserve"> </w:t>
       </w:r>
       <w:r>
-        <w:t xml:space="preserve">identify every released file and verify package integrity.</w:t>
+        <w:t xml:space="preserve">identify every released file and verify package integrity. Table </w:t>
+      </w:r>
+      <w:hyperlink w:anchor="tab:archive-layout">
+        <w:r>
+          <w:rPr>
+            <w:rStyle w:val="Hyperlink"/>
+          </w:rPr>
+          <w:t xml:space="preserve">2</w:t>
+        </w:r>
+      </w:hyperlink>
+      <w:r>
+        <w:t xml:space="preserve"> </w:t>
+      </w:r>
+      <w:r>
+        <w:t xml:space="preserve">summarizes the directory-level organization.</w:t>
       </w:r>
     </w:p>
     <w:bookmarkStart w:id="37" w:name="tab:archive-layout"/>
@@ -1266,7 +1346,7 @@
         <w:pStyle w:val="TableCaption"/>
       </w:pPr>
       <w:r>
-        <w:t xml:space="preserve">Directory structure of the deposited</w:t>
+        <w:t xml:space="preserve">Directory structure of the</w:t>
       </w:r>
       <w:r>
         <w:t xml:space="preserve"> </w:t>
@@ -1281,7 +1361,7 @@
         <w:t xml:space="preserve"> </w:t>
       </w:r>
       <w:r>
-        <w:t xml:space="preserve">v1.0.0 archive. Counts refer to files, not data rows.</w:t>
+        <w:t xml:space="preserve">v1.0.1 archive. Counts refer to files, not data rows.</w:t>
       </w:r>
     </w:p>
     <w:tbl>
@@ -1289,7 +1369,7 @@
         <w:tblStyle w:val="Table"/>
         <w:tblW w:type="auto" w:w="0"/>
         <w:tblLook w:firstRow="1" w:lastRow="0" w:firstColumn="0" w:lastColumn="0" w:noHBand="0" w:noVBand="0" w:val="0020"/>
-        <w:tblCaption w:val="Directory structure of the deposited PT60-Candidate v1.0.0 archive. Counts refer to files, not data rows."/>
+        <w:tblCaption w:val="Directory structure of the PT60-Candidate v1.0.1 archive. Counts refer to files, not data rows."/>
       </w:tblPr>
       <w:tblGrid>
         <w:gridCol w:w="2640"/>
@@ -1590,6 +1670,28 @@
       </w:pPr>
       <w:r>
         <w:t xml:space="preserve">Released artifacts</w:t>
+      </w:r>
+    </w:p>
+    <w:p>
+      <w:pPr>
+        <w:pStyle w:val="FirstParagraph"/>
+      </w:pPr>
+      <w:r>
+        <w:t xml:space="preserve">Table </w:t>
+      </w:r>
+      <w:hyperlink w:anchor="tab:composition">
+        <w:r>
+          <w:rPr>
+            <w:rStyle w:val="Hyperlink"/>
+          </w:rPr>
+          <w:t xml:space="preserve">3</w:t>
+        </w:r>
+      </w:hyperlink>
+      <w:r>
+        <w:t xml:space="preserve"> </w:t>
+      </w:r>
+      <w:r>
+        <w:t xml:space="preserve">identifies the principal machine-readable records and their roles.</w:t>
       </w:r>
     </w:p>
     <w:bookmarkStart w:id="39" w:name="tab:composition"/>
@@ -2281,7 +2383,7 @@
         <w:t xml:space="preserve"> </w:t>
       </w:r>
       <w:r>
-        <w:t xml:space="preserve">defines type, nullability, unit, observed missing representation, allowed values, semantic status, derivation, and key role.</w:t>
+        <w:t xml:space="preserve">defines type, nullability, unit, observed missing representation, allowed values, semantic status, derivation, and key role. Version 1.0.1 corrects the earlier substring-based inference of coordinate, geometry, boolean, and count fields and adds fail-closed semantic checks plus regression tests for those failure modes.</w:t>
       </w:r>
       <w:r>
         <w:t xml:space="preserve"> </w:t>
@@ -2405,7 +2507,35 @@
         <w:pStyle w:val="FirstParagraph"/>
       </w:pPr>
       <w:r>
-        <w:t xml:space="preserve">For the selected setting, the release accounts for all 1,342 reconstructed circuit candidates: 358 are retained as inter-facility candidate branches and 984 remain in the ledger with downgrade or rejection dispositions. This overview describes the contents of the deposited files; it does not estimate the correctness or completeness of the physical Portuguese network.</w:t>
+        <w:t xml:space="preserve">For the selected setting, the release accounts for all 1,342 reconstructed circuit candidates: 358 are retained as inter-facility candidate branches and 984 remain in the ledger with downgrade or rejection dispositions. Figure </w:t>
+      </w:r>
+      <w:hyperlink w:anchor="fig:funnel">
+        <w:r>
+          <w:rPr>
+            <w:rStyle w:val="Hyperlink"/>
+          </w:rPr>
+          <w:t xml:space="preserve">2</w:t>
+        </w:r>
+      </w:hyperlink>
+      <w:r>
+        <w:t xml:space="preserve"> </w:t>
+      </w:r>
+      <w:r>
+        <w:t xml:space="preserve">reports the complete disposition, and Fig. </w:t>
+      </w:r>
+      <w:hyperlink w:anchor="fig:topology-quality">
+        <w:r>
+          <w:rPr>
+            <w:rStyle w:val="Hyperlink"/>
+          </w:rPr>
+          <w:t xml:space="preserve">3</w:t>
+        </w:r>
+      </w:hyperlink>
+      <w:r>
+        <w:t xml:space="preserve"> </w:t>
+      </w:r>
+      <w:r>
+        <w:t xml:space="preserve">reports aggregate graph structure. This overview describes the contents of the deposited files; it does not estimate the correctness or completeness of the physical Portuguese network.</w:t>
       </w:r>
     </w:p>
     <w:bookmarkStart w:id="52" w:name="fig:funnel"/>
@@ -2610,7 +2740,7 @@
         <w:t xml:space="preserve">PASS_WITH_WARNINGS</w:t>
       </w:r>
       <w:r>
-        <w:t xml:space="preserve">: 23 checks pass and two checks are release-review warnings rather than data-consistency failures. The release geometry and processing workspace are now documented in Data Record, while the exact wording of the upstream portal CRS remains unverified. The deterministic final-tag rebuild reproduces the deposited archive hash from the frozen derived inputs; raw/API reacquisition remains subject to the limitation stated in Usage Notes. The same export records 5,334 valid source geometries and zero invalid/dropped geometries; zero missing required retained-branch fields; zero missing required ledger fields; 358 retained branches; 984 downgraded or rejected records; 1,342 ledger rows; 64,008 endpoint-index rows across six snap thresholds; and 216 sensitivity rows.</w:t>
+        <w:t xml:space="preserve">: 23 checks pass and two checks are release-review warnings rather than data-consistency failures. The release geometry and processing workspace are now documented in Data Records, while the exact wording of the upstream portal CRS remains unverified. Clean-room extraction validation of the v1.0.1 archive reports no manifest, checksum, dictionary-coverage, or headline-count failures. The earlier v1.0.0 tag rebuild remains the evidence for byte-for-byte reconstruction from frozen derived inputs; a v1.0.1 tagged rebuild is still required, and raw/API reacquisition remains subject to the limitation stated in Usage Notes. The same export records 5,334 valid source geometries and zero invalid/dropped geometries; zero missing required retained-branch fields; zero missing required ledger fields; 358 retained branches; 984 downgraded or rejected records; 1,342 ledger rows; 64,008 endpoint-index rows across six snap thresholds; and 216 sensitivity rows.</w:t>
       </w:r>
     </w:p>
     <w:bookmarkEnd w:id="60"/>
@@ -2728,7 +2858,21 @@
         <w:pStyle w:val="BodyText"/>
       </w:pPr>
       <w:r>
-        <w:t xml:space="preserve">Across the 216-setting sweep, increasing the facility buffer from 100 m to 500 m at a 0.5 m endpoint snap threshold raises retained branches from 358 to 369 but also increases ambiguity from 61 to 89 and reduces the largest component from 53 to 27. At 50 m endpoint snapping, only three inter-facility circuits remain for each tested buffer. These results support the claim that reconstruction outputs are sensitive to plausible preprocessing settings and that the selected operating point is a documented trade-off rather than a uniquely correct solution.</w:t>
+        <w:t xml:space="preserve">Across the 216-setting sweep, increasing the facility buffer from 100 m to 500 m at a 0.5 m endpoint snap threshold raises retained branches from 358 to 369 but also increases ambiguity from 61 to 89 and reduces the largest component from 53 to 27. At 50 m endpoint snapping, only three inter-facility circuits remain for each tested buffer. Figure </w:t>
+      </w:r>
+      <w:hyperlink w:anchor="fig:sensitivity">
+        <w:r>
+          <w:rPr>
+            <w:rStyle w:val="Hyperlink"/>
+          </w:rPr>
+          <w:t xml:space="preserve">4</w:t>
+        </w:r>
+      </w:hyperlink>
+      <w:r>
+        <w:t xml:space="preserve"> </w:t>
+      </w:r>
+      <w:r>
+        <w:t xml:space="preserve">shows these trade-offs and the selected operating point. These results support the claim that reconstruction outputs are sensitive to plausible preprocessing settings rather than identifying a uniquely correct solution.</w:t>
       </w:r>
     </w:p>
     <w:bookmarkStart w:id="66" w:name="fig:sensitivity"/>
@@ -2803,7 +2947,7 @@
         <w:pStyle w:val="FirstParagraph"/>
       </w:pPr>
       <w:r>
-        <w:t xml:space="preserve">The external triangulation workflow searches for branch-level public evidence outside the selected reconstruction rule. The current implementation uses OSM/OpenInfraMap 60 kV</w:t>
+        <w:t xml:space="preserve">The external triangulation workflow searches for branch-level public evidence outside the selected reconstruction rule. The current implementation uses OpenStreetMap/OpenInfraMap 60 kV</w:t>
       </w:r>
       <w:r>
         <w:t xml:space="preserve"> </w:t>
@@ -2833,7 +2977,28 @@
         <w:t xml:space="preserve"> </w:t>
       </w:r>
       <w:r>
-        <w:t xml:space="preserve">records in Portugal, caches the raw Overpass response, parses voltage, operator, name, reference, circuit, and geometry fields, and compares each retained branch against these public records by endpoint-name overlap and corridor proximity.</w:t>
+        <w:t xml:space="preserve">records in Portugal</w:t>
+      </w:r>
+      <w:r>
+        <w:t xml:space="preserve"> </w:t>
+      </w:r>
+      <w:r>
+        <w:t xml:space="preserve">(OpenStreetMap contributors 2026; OpenInfraMap contributors 2026)</w:t>
+      </w:r>
+      <w:r>
+        <w:t xml:space="preserve">, parses voltage, operator, name, reference, circuit, and geometry fields, and compares each retained branch by endpoint-name overlap and corridor proximity. A name score must be at least 0.8. Strong spatial evidence requires minimum distance no greater than 250 m, median branch-to-OSM distance no greater than 500 m, and branch or OSM coverage of at least 0.5 within 500 m; weak proximity is limited to 1,000 m. The operator condition requires a normalized tag containing</w:t>
+      </w:r>
+      <w:r>
+        <w:t xml:space="preserve"> </w:t>
+      </w:r>
+      <w:r>
+        <w:rPr>
+          <w:rStyle w:val="VerbatimChar"/>
+        </w:rPr>
+        <w:t xml:space="preserve">e redes</w:t>
+      </w:r>
+      <w:r>
+        <w:t xml:space="preserve">.</w:t>
       </w:r>
     </w:p>
     <w:bookmarkStart w:id="68" w:name="tab:osm-triangulation"/>
@@ -3151,7 +3316,21 @@
         <w:pStyle w:val="BodyText"/>
       </w:pPr>
       <w:r>
-        <w:t xml:space="preserve">For the current snapshot, 5,551 Portuguese 60 kV public ways are cached and all 358 retained candidate branches receive a non-empty public-evidence category, with 247 strong, 104 medium, and seven weak matches. This result provides public-source concordance and a branch-level evidence index. It does not establish operator validation or branch accuracy, because OSM coverage and tagging are non-authoritative. To audit provenance risk, the release records current OSM metadata for the 5,551 cached public ways and full version histories for the 271 unique OSM ways matched to retained branches, covering 2,326 historical versions. The branch-level audit classifies 266 retained branches as having stronger inspectable public evidence, 87 as unknown independence, and five as possibly same-source or operator-tag-only evidence. These categories distinguish public concordance from more inspectable public corroboration, but they still must not be interpreted as precision, recall, or confirmation of every retained branch.</w:t>
+        <w:t xml:space="preserve">Table </w:t>
+      </w:r>
+      <w:hyperlink w:anchor="tab:osm-triangulation">
+        <w:r>
+          <w:rPr>
+            <w:rStyle w:val="Hyperlink"/>
+          </w:rPr>
+          <w:t xml:space="preserve">4</w:t>
+        </w:r>
+      </w:hyperlink>
+      <w:r>
+        <w:t xml:space="preserve"> </w:t>
+      </w:r>
+      <w:r>
+        <w:t xml:space="preserve">gives the category counts. For the current snapshot, 5,551 Portuguese 60 kV public ways were evaluated and all 358 retained candidate branches receive a non-empty public-evidence category, with 247 strong, 104 medium, and seven weak matches. This result provides public-source concordance and a branch-level evidence index. It does not establish operator validation or branch accuracy, because OSM coverage and tagging are non-authoritative. The internal independence audit inspected histories for the 271 unique matched OSM ways, covering 2,326 historical versions, and classifies 266 retained branches as having more-independent public evidence, 87 as unknown independence, and five as possibly same-source. The public archive contains only summary counts, evidence tables, and a sanitized branch-level audit; raw caches, user identifiers, changesets, and element-history dumps are excluded. These categories must not be interpreted as precision, recall, or confirmation of every retained branch.</w:t>
       </w:r>
     </w:p>
     <w:bookmarkEnd w:id="69"/>
@@ -3197,7 +3376,21 @@
         </m:sSub>
       </m:oMath>
       <w:r>
-        <w:t xml:space="preserve">, or confidence intervals. Precision is not independently estimated, and national or real-network recall is not estimable because neither an authoritative branch census nor a probability sample of true Portuguese 60 kV connections is available.</w:t>
+        <w:t xml:space="preserve">, or confidence intervals. Precision is not independently estimated, and national or real-network recall is not estimable because neither an authoritative branch census nor a probability sample of true Portuguese 60 kV connections is available. Table </w:t>
+      </w:r>
+      <w:hyperlink w:anchor="tab:claim-bounded-validation">
+        <w:r>
+          <w:rPr>
+            <w:rStyle w:val="Hyperlink"/>
+          </w:rPr>
+          <w:t xml:space="preserve">5</w:t>
+        </w:r>
+      </w:hyperlink>
+      <w:r>
+        <w:t xml:space="preserve"> </w:t>
+      </w:r>
+      <w:r>
+        <w:t xml:space="preserve">states the supported and excluded interpretation for each validation layer.</w:t>
       </w:r>
     </w:p>
     <w:bookmarkStart w:id="70" w:name="tab:claim-bounded-validation"/>
@@ -3650,24 +3843,12 @@
         <w:t xml:space="preserve"> </w:t>
       </w:r>
       <w:r>
-        <w:t xml:space="preserve">version 1.0.0 is deposited in figshare</w:t>
-      </w:r>
-      <w:r>
-        <w:t xml:space="preserve"> </w:t>
-      </w:r>
-      <w:r>
-        <w:t xml:space="preserve">(PortugueseOPD contributors 2026)</w:t>
-      </w:r>
-      <w:r>
-        <w:t xml:space="preserve"> </w:t>
-      </w:r>
-      <w:r>
-        <w:t xml:space="preserve">at</w:t>
-      </w:r>
-      <w:r>
-        <w:t xml:space="preserve"> </w:t>
-      </w:r>
-      <w:hyperlink r:id="rId20">
+        <w:t xml:space="preserve">version 1.0.1 is prepared for the reserved figshare DOI</w:t>
+      </w:r>
+      <w:r>
+        <w:t xml:space="preserve"> </w:t>
+      </w:r>
+      <w:hyperlink r:id="rId35">
         <w:r>
           <w:rPr>
             <w:rStyle w:val="Hyperlink"/>
@@ -3676,7 +3857,7 @@
         </w:r>
       </w:hyperlink>
       <w:r>
-        <w:t xml:space="preserve">. The deposited file is</w:t>
+        <w:t xml:space="preserve">. The file</w:t>
       </w:r>
       <w:r>
         <w:t xml:space="preserve"> </w:t>
@@ -3685,7 +3866,7 @@
         <w:rPr>
           <w:rStyle w:val="VerbatimChar"/>
         </w:rPr>
-        <w:t xml:space="preserve">PT60-Candidate-v1.0.0.tar.gz</w:t>
+        <w:t xml:space="preserve">PT60-Candidate-v1.0.1.tar.gz</w:t>
       </w:r>
       <w:r>
         <w:t xml:space="preserve">, SHA-256</w:t>
@@ -3697,10 +3878,10 @@
         <w:rPr>
           <w:rStyle w:val="VerbatimChar"/>
         </w:rPr>
-        <w:t xml:space="preserve">b4a6c370fbf15c078e15b80a3bbc7f517750fdb763d59147b24f59cd160358d7</w:t>
-      </w:r>
-      <w:r>
-        <w:t xml:space="preserve">. It contains the core topology, full circuit ledger, GraphML, sensitivity sweep, provenance, validation, schema, data-dictionary, licensing, attribution, manifest, and checksum records described in Data Record. Raw source downloads and optional diagnostic/interface artifacts are excluded as documented in</w:t>
+        <w:t xml:space="preserve">f6af1d29af1487b4138eb2ada4ace9a3fa267faac4ea4e51adc8629388f18e3c</w:t>
+      </w:r>
+      <w:r>
+        <w:t xml:space="preserve">, must replace the earlier uploaded draft before publication. It contains the core topology, full circuit ledger, GraphML, sensitivity sweep, provenance, validation, corrected schema/data dictionary, licensing, attribution, manifest, and checksum records described in Data Records. Raw source downloads and optional diagnostic/interface artifacts are excluded as documented in</w:t>
       </w:r>
       <w:r>
         <w:t xml:space="preserve"> </w:t>
@@ -3709,7 +3890,16 @@
         <w:rPr>
           <w:rStyle w:val="VerbatimChar"/>
         </w:rPr>
-        <w:t xml:space="preserve">excluded_artifacts.json</w:t>
+        <w:t xml:space="preserve">excluded</w:t>
+      </w:r>
+      <w:r>
+        <w:br/>
+      </w:r>
+      <w:r>
+        <w:rPr>
+          <w:rStyle w:val="VerbatimChar"/>
+        </w:rPr>
+        <w:t xml:space="preserve">_artifacts.json</w:t>
       </w:r>
       <w:r>
         <w:t xml:space="preserve">. E-REDES-derived records remain subject to the attribution and indication-of-modification terms documented in</w:t>
@@ -3721,7 +3911,16 @@
         <w:rPr>
           <w:rStyle w:val="VerbatimChar"/>
         </w:rPr>
-        <w:t xml:space="preserve">DATA_LICENSE.md</w:t>
+        <w:t xml:space="preserve">DATA</w:t>
+      </w:r>
+      <w:r>
+        <w:br/>
+      </w:r>
+      <w:r>
+        <w:rPr>
+          <w:rStyle w:val="VerbatimChar"/>
+        </w:rPr>
+        <w:t xml:space="preserve">_LICENSE.md</w:t>
       </w:r>
       <w:r>
         <w:t xml:space="preserve"> </w:t>
@@ -3743,13 +3942,13 @@
       </w:r>
     </w:p>
     <w:bookmarkEnd w:id="81"/>
-    <w:bookmarkStart w:id="82" w:name="author-contributions"/>
+    <w:bookmarkStart w:id="83" w:name="code-availability"/>
     <w:p>
       <w:pPr>
         <w:pStyle w:val="Heading1"/>
       </w:pPr>
       <w:r>
-        <w:t xml:space="preserve">Author Contributions</w:t>
+        <w:t xml:space="preserve">Code Availability</w:t>
       </w:r>
     </w:p>
     <w:p>
@@ -3757,84 +3956,12 @@
         <w:pStyle w:val="FirstParagraph"/>
       </w:pPr>
       <w:r>
-        <w:t xml:space="preserve">The author-responsibility statement will be completed when the final author list is supplied and before submission.</w:t>
-      </w:r>
-    </w:p>
-    <w:bookmarkEnd w:id="82"/>
-    <w:bookmarkStart w:id="83" w:name="acknowledgements"/>
-    <w:p>
-      <w:pPr>
-        <w:pStyle w:val="Heading1"/>
-      </w:pPr>
-      <w:r>
-        <w:t xml:space="preserve">Acknowledgements</w:t>
-      </w:r>
-    </w:p>
-    <w:p>
-      <w:pPr>
-        <w:pStyle w:val="FirstParagraph"/>
-      </w:pPr>
-      <w:r>
-        <w:t xml:space="preserve">Acknowledgements, if applicable, will be finalized before submission.</w:t>
-      </w:r>
-    </w:p>
-    <w:bookmarkEnd w:id="83"/>
-    <w:bookmarkStart w:id="84" w:name="funding"/>
-    <w:p>
-      <w:pPr>
-        <w:pStyle w:val="Heading1"/>
-      </w:pPr>
-      <w:r>
-        <w:t xml:space="preserve">Funding</w:t>
-      </w:r>
-    </w:p>
-    <w:p>
-      <w:pPr>
-        <w:pStyle w:val="FirstParagraph"/>
-      </w:pPr>
-      <w:r>
-        <w:t xml:space="preserve">The funding statement will be finalized before submission.</w:t>
-      </w:r>
-    </w:p>
-    <w:bookmarkEnd w:id="84"/>
-    <w:bookmarkStart w:id="85" w:name="competing-interests"/>
-    <w:p>
-      <w:pPr>
-        <w:pStyle w:val="Heading1"/>
-      </w:pPr>
-      <w:r>
-        <w:t xml:space="preserve">Competing Interests</w:t>
-      </w:r>
-    </w:p>
-    <w:p>
-      <w:pPr>
-        <w:pStyle w:val="FirstParagraph"/>
-      </w:pPr>
-      <w:r>
-        <w:t xml:space="preserve">The final competing-interests declaration will be supplied before submission.</w:t>
-      </w:r>
-    </w:p>
-    <w:bookmarkEnd w:id="85"/>
-    <w:bookmarkStart w:id="87" w:name="code-availability"/>
-    <w:p>
-      <w:pPr>
-        <w:pStyle w:val="Heading1"/>
-      </w:pPr>
-      <w:r>
-        <w:t xml:space="preserve">Code Availability</w:t>
-      </w:r>
-    </w:p>
-    <w:p>
-      <w:pPr>
-        <w:pStyle w:val="FirstParagraph"/>
-      </w:pPr>
-      <w:r>
         <w:t xml:space="preserve">The source code is publicly available at</w:t>
       </w:r>
       <w:r>
         <w:t xml:space="preserve"> </w:t>
       </w:r>
-      <w:hyperlink r:id="rId86">
+      <w:hyperlink r:id="rId82">
         <w:r>
           <w:rPr>
             <w:rStyle w:val="Hyperlink"/>
@@ -3843,7 +3970,7 @@
         </w:r>
       </w:hyperlink>
       <w:r>
-        <w:t xml:space="preserve">. The deterministic dataset-release builder is frozen under annotated Git tag</w:t>
+        <w:t xml:space="preserve">. The existing v1.0.0 tags preserve the prior release; an immutable v1.0.1 source tag and DOI-providing software archive remain to be created before submission. The reference environment uses Python 3.12.9 and the versioned</w:t>
       </w:r>
       <w:r>
         <w:t xml:space="preserve"> </w:t>
@@ -3852,53 +3979,86 @@
         <w:rPr>
           <w:rStyle w:val="VerbatimChar"/>
         </w:rPr>
-        <w:t xml:space="preserve">pt60-candidate-v1.0.0</w:t>
-      </w:r>
-      <w:r>
-        <w:t xml:space="preserve"> </w:t>
-      </w:r>
-      <w:r>
-        <w:t xml:space="preserve">at commit</w:t>
-      </w:r>
-      <w:r>
-        <w:t xml:space="preserve"> </w:t>
-      </w:r>
-      <w:r>
-        <w:rPr>
-          <w:rStyle w:val="VerbatimChar"/>
-        </w:rPr>
-        <w:t xml:space="preserve">1eb690302f35f7c0090c14c994d073539cbb5335</w:t>
-      </w:r>
-      <w:r>
-        <w:t xml:space="preserve">; the complete manuscript, validation, packaging, and figure-generation snapshot is frozen under tag</w:t>
-      </w:r>
-      <w:r>
-        <w:t xml:space="preserve"> </w:t>
-      </w:r>
-      <w:r>
-        <w:rPr>
-          <w:rStyle w:val="VerbatimChar"/>
-        </w:rPr>
-        <w:t xml:space="preserve">pt60-candidate-code-v1.0.0</w:t>
-      </w:r>
-      <w:r>
-        <w:t xml:space="preserve">. The reference environment uses Python 3.12.9 and the versioned</w:t>
-      </w:r>
-      <w:r>
-        <w:t xml:space="preserve"> </w:t>
-      </w:r>
-      <w:r>
-        <w:rPr>
-          <w:rStyle w:val="VerbatimChar"/>
-        </w:rPr>
         <w:t xml:space="preserve">requirements.txt</w:t>
       </w:r>
       <w:r>
         <w:t xml:space="preserve">; the software is MIT licensed. The dataset archive is independently usable without installing the generation pipeline, but full regeneration from raw E-REDES/API responses is subject to the source-reacquisition limitation described in Usage Notes.</w:t>
       </w:r>
     </w:p>
+    <w:bookmarkEnd w:id="83"/>
+    <w:bookmarkStart w:id="84" w:name="author-contributions"/>
+    <w:p>
+      <w:pPr>
+        <w:pStyle w:val="Heading1"/>
+      </w:pPr>
+      <w:r>
+        <w:t xml:space="preserve">Author Contributions</w:t>
+      </w:r>
+    </w:p>
+    <w:p>
+      <w:pPr>
+        <w:pStyle w:val="FirstParagraph"/>
+      </w:pPr>
+      <w:r>
+        <w:t xml:space="preserve">The author-responsibility statement will be completed when the final author list is supplied and before submission.</w:t>
+      </w:r>
+    </w:p>
+    <w:bookmarkEnd w:id="84"/>
+    <w:bookmarkStart w:id="85" w:name="competing-interests"/>
+    <w:p>
+      <w:pPr>
+        <w:pStyle w:val="Heading1"/>
+      </w:pPr>
+      <w:r>
+        <w:t xml:space="preserve">Competing Interests</w:t>
+      </w:r>
+    </w:p>
+    <w:p>
+      <w:pPr>
+        <w:pStyle w:val="FirstParagraph"/>
+      </w:pPr>
+      <w:r>
+        <w:t xml:space="preserve">The final competing-interests declaration will be supplied before submission.</w:t>
+      </w:r>
+    </w:p>
+    <w:bookmarkEnd w:id="85"/>
+    <w:bookmarkStart w:id="86" w:name="acknowledgements"/>
+    <w:p>
+      <w:pPr>
+        <w:pStyle w:val="Heading1"/>
+      </w:pPr>
+      <w:r>
+        <w:t xml:space="preserve">Acknowledgements</w:t>
+      </w:r>
+    </w:p>
+    <w:p>
+      <w:pPr>
+        <w:pStyle w:val="FirstParagraph"/>
+      </w:pPr>
+      <w:r>
+        <w:t xml:space="preserve">Acknowledgements, if applicable, will be finalized before submission.</w:t>
+      </w:r>
+    </w:p>
+    <w:bookmarkEnd w:id="86"/>
+    <w:bookmarkStart w:id="87" w:name="funding"/>
+    <w:p>
+      <w:pPr>
+        <w:pStyle w:val="Heading1"/>
+      </w:pPr>
+      <w:r>
+        <w:t xml:space="preserve">Funding</w:t>
+      </w:r>
+    </w:p>
+    <w:p>
+      <w:pPr>
+        <w:pStyle w:val="FirstParagraph"/>
+      </w:pPr>
+      <w:r>
+        <w:t xml:space="preserve">The funding statement will be finalized before submission.</w:t>
+      </w:r>
+    </w:p>
     <w:bookmarkEnd w:id="87"/>
-    <w:bookmarkStart w:id="102" w:name="bibliography"/>
+    <w:bookmarkStart w:id="105" w:name="bibliography"/>
     <w:p>
       <w:pPr>
         <w:pStyle w:val="Heading1"/>
@@ -3907,7 +4067,7 @@
         <w:t xml:space="preserve">References</w:t>
       </w:r>
     </w:p>
-    <w:bookmarkStart w:id="101" w:name="refs"/>
+    <w:bookmarkStart w:id="104" w:name="refs"/>
     <w:bookmarkStart w:id="89" w:name="ref-EREDESOpenData2026"/>
     <w:p>
       <w:pPr>
@@ -4048,13 +4208,13 @@
       </w:r>
     </w:p>
     <w:bookmarkEnd w:id="93"/>
-    <w:bookmarkStart w:id="94" w:name="ref-PT60Candidate2026"/>
+    <w:bookmarkStart w:id="95" w:name="ref-OpenInfraMap2026"/>
     <w:p>
       <w:pPr>
         <w:pStyle w:val="Bibliography"/>
       </w:pPr>
       <w:r>
-        <w:t xml:space="preserve">PortugueseOPD contributors. 2026.</w:t>
+        <w:t xml:space="preserve">OpenInfraMap contributors. 2026.</w:t>
       </w:r>
       <w:r>
         <w:t xml:space="preserve"> </w:t>
@@ -4063,7 +4223,7 @@
         <w:t xml:space="preserve">“</w:t>
       </w:r>
       <w:r>
-        <w:t xml:space="preserve">PT60-Candidate: A Provenance-Tracked Candidate Dataset for Portuguese 60 kV Topology Reconstruction</w:t>
+        <w:t xml:space="preserve">OpenInfraMap</w:t>
       </w:r>
       <w:r>
         <w:t xml:space="preserve">.”</w:t>
@@ -4072,25 +4232,67 @@
         <w:t xml:space="preserve"> </w:t>
       </w:r>
       <w:r>
-        <w:t xml:space="preserve">figshare.</w:t>
-      </w:r>
-      <w:r>
-        <w:t xml:space="preserve"> </w:t>
-      </w:r>
-      <w:hyperlink r:id="rId20">
+        <w:t xml:space="preserve">Web map of infrastructure data derived from OpenStreetMap.</w:t>
+      </w:r>
+      <w:r>
+        <w:t xml:space="preserve"> </w:t>
+      </w:r>
+      <w:hyperlink r:id="rId94">
         <w:r>
           <w:rPr>
             <w:rStyle w:val="Hyperlink"/>
           </w:rPr>
-          <w:t xml:space="preserve">https://doi.org/10.6084/m9.figshare.32984021</w:t>
+          <w:t xml:space="preserve">https://www.openinframap.org/</w:t>
         </w:r>
       </w:hyperlink>
       <w:r>
         <w:t xml:space="preserve">.</w:t>
       </w:r>
     </w:p>
-    <w:bookmarkEnd w:id="94"/>
-    <w:bookmarkStart w:id="96" w:name="ref-Rivera2019"/>
+    <w:bookmarkEnd w:id="95"/>
+    <w:bookmarkStart w:id="97" w:name="ref-OSM2026"/>
+    <w:p>
+      <w:pPr>
+        <w:pStyle w:val="Bibliography"/>
+      </w:pPr>
+      <w:r>
+        <w:t xml:space="preserve">OpenStreetMap contributors. 2026.</w:t>
+      </w:r>
+      <w:r>
+        <w:t xml:space="preserve"> </w:t>
+      </w:r>
+      <w:r>
+        <w:t xml:space="preserve">“</w:t>
+      </w:r>
+      <w:r>
+        <w:t xml:space="preserve">OpenStreetMap</w:t>
+      </w:r>
+      <w:r>
+        <w:t xml:space="preserve">.”</w:t>
+      </w:r>
+      <w:r>
+        <w:t xml:space="preserve"> </w:t>
+      </w:r>
+      <w:r>
+        <w:t xml:space="preserve">Collaborative geospatial database.</w:t>
+      </w:r>
+      <w:r>
+        <w:t xml:space="preserve"> </w:t>
+      </w:r>
+      <w:hyperlink r:id="rId96">
+        <w:r>
+          <w:rPr>
+            <w:rStyle w:val="Hyperlink"/>
+          </w:rPr>
+          <w:t xml:space="preserve">https://www.openstreetmap.org/</w:t>
+        </w:r>
+      </w:hyperlink>
+      <w:r>
+        <w:t xml:space="preserve">.</w:t>
+      </w:r>
+    </w:p>
+    <w:bookmarkEnd w:id="97"/>
+    <w:bookmarkStart w:id="99" w:name="ref-Rivera2019"/>
     <w:p>
       <w:pPr>
         <w:pStyle w:val="Bibliography"/>
@@ -4123,7 +4325,7 @@
       <w:r>
         <w:t xml:space="preserve"> </w:t>
       </w:r>
-      <w:hyperlink r:id="rId95">
+      <w:hyperlink r:id="rId98">
         <w:r>
           <w:rPr>
             <w:rStyle w:val="Hyperlink"/>
@@ -4135,8 +4337,8 @@
         <w:t xml:space="preserve">.</w:t>
       </w:r>
     </w:p>
-    <w:bookmarkEnd w:id="96"/>
-    <w:bookmarkStart w:id="98" w:name="ref-Wiese2019"/>
+    <w:bookmarkEnd w:id="99"/>
+    <w:bookmarkStart w:id="101" w:name="ref-Wiese2019"/>
     <w:p>
       <w:pPr>
         <w:pStyle w:val="Bibliography"/>
@@ -4169,7 +4371,7 @@
       <w:r>
         <w:t xml:space="preserve"> </w:t>
       </w:r>
-      <w:hyperlink r:id="rId97">
+      <w:hyperlink r:id="rId100">
         <w:r>
           <w:rPr>
             <w:rStyle w:val="Hyperlink"/>
@@ -4181,8 +4383,8 @@
         <w:t xml:space="preserve">.</w:t>
       </w:r>
     </w:p>
-    <w:bookmarkEnd w:id="98"/>
-    <w:bookmarkStart w:id="100" w:name="ref-Xiong2025"/>
+    <w:bookmarkEnd w:id="101"/>
+    <w:bookmarkStart w:id="103" w:name="ref-Xiong2025"/>
     <w:p>
       <w:pPr>
         <w:pStyle w:val="Bibliography"/>
@@ -4215,7 +4417,7 @@
       <w:r>
         <w:t xml:space="preserve"> </w:t>
       </w:r>
-      <w:hyperlink r:id="rId99">
+      <w:hyperlink r:id="rId102">
         <w:r>
           <w:rPr>
             <w:rStyle w:val="Hyperlink"/>
@@ -4227,9 +4429,9 @@
         <w:t xml:space="preserve">.</w:t>
       </w:r>
     </w:p>
-    <w:bookmarkEnd w:id="100"/>
-    <w:bookmarkEnd w:id="101"/>
-    <w:bookmarkEnd w:id="102"/>
+    <w:bookmarkEnd w:id="103"/>
+    <w:bookmarkEnd w:id="104"/>
+    <w:bookmarkEnd w:id="105"/>
     <w:sectPr/>
   </w:body>
 </w:document>

</xml_diff>

<commit_message>
Finalize v1.0.1 archive and Scientific Data draft
</commit_message>
<xml_diff>
--- a/paper/PT60-Candidate_Scientific_Data_draft.docx
+++ b/paper/PT60-Candidate_Scientific_Data_draft.docx
@@ -1156,7 +1156,7 @@
         <w:rPr>
           <w:rStyle w:val="VerbatimChar"/>
         </w:rPr>
-        <w:t xml:space="preserve">f6af1d29af1487b4138eb2ada4ace9a3fa267faac4ea4e51adc8629388f18e3c</w:t>
+        <w:t xml:space="preserve">a4dd2d115caae0cd1c873fb7db3341e0aaed0ce62f7f0072ae92642898efb69a</w:t>
       </w:r>
       <w:r>
         <w:t xml:space="preserve">. The v1.0.1 file must replace the earlier uploaded draft before the item is published.</w:t>
@@ -3878,7 +3878,7 @@
         <w:rPr>
           <w:rStyle w:val="VerbatimChar"/>
         </w:rPr>
-        <w:t xml:space="preserve">f6af1d29af1487b4138eb2ada4ace9a3fa267faac4ea4e51adc8629388f18e3c</w:t>
+        <w:t xml:space="preserve">a4dd2d115caae0cd1c873fb7db3341e0aaed0ce62f7f0072ae92642898efb69a</w:t>
       </w:r>
       <w:r>
         <w:t xml:space="preserve">, must replace the earlier uploaded draft before publication. It contains the core topology, full circuit ledger, GraphML, sensitivity sweep, provenance, validation, corrected schema/data dictionary, licensing, attribution, manifest, and checksum records described in Data Records. Raw source downloads and optional diagnostic/interface artifacts are excluded as documented in</w:t>

</xml_diff>

<commit_message>
Finalize PT60-Candidate v1.0.1 release inputs
</commit_message>
<xml_diff>
--- a/paper/PT60-Candidate_Scientific_Data_draft.docx
+++ b/paper/PT60-Candidate_Scientific_Data_draft.docx
@@ -51,7 +51,7 @@
         <w:t xml:space="preserve">PT60-Candidate</w:t>
       </w:r>
       <w:r>
-        <w:t xml:space="preserve">, a provenance-tracked candidate dataset for the Portuguese E-REDES 60 kV layer and its fail-closed construction pipeline. From 5,334 line features and 586 facility records, the selected configuration yields 1,342 classified circuit candidates: 358 retained inter-facility branches and 984 downgraded or rejected records with reasons. Version 1.0.1 includes a 484-node multigraph, 216-configuration sensitivity sweep, source manifests, corrected schemas and data dictionary, checksums, and branch-level public-source evidence. Internal validation tests geometry, identifiers, graph–table parity, schema coverage, missingness, and archive integrity. OpenStreetMap/OpenInfraMap triangulation provides inspectable name or corridor evidence for every retained branch; endpoint-name permutation and displaced-geometry controls reduce the corresponding evidence rates by 95.1% and 99.7%. These results test matcher selectivity and public-data concordance, not physical topology accuracy. The dataset is not operator validated, precision and recall are unavailable, and electrical parameters remain incomplete. It supports topology-reconstruction, provenance, geospatial-integration, and interface research, not operational grid studies. Versioned data and code are provided separately.</w:t>
+        <w:t xml:space="preserve">, a provenance-tracked candidate dataset for the Portuguese E-REDES 60 kV layer and its fail-closed construction pipeline. From 5,334 line features and 586 facility records, the selected configuration yields 1,342 classified circuit candidates: 358 retained inter-facility branches and 984 downgraded or rejected records with reasons. Version 1.0.1 includes a 484-node multigraph, 216-configuration sensitivity sweep, source manifests, machine-readable schemas, a field-level data dictionary, checksums, and branch-level public evidence derived from OpenStreetMap (OSM). Internal validation tests geometry, identifiers, graph–table parity, schema coverage, missingness, and archive integrity. Endpoint-name permutation and displaced-geometry controls reduce corresponding OSM-evidence rates by 95.1% and 99.7%, testing matcher selectivity rather than topology accuracy. The dataset is not operator validated, precision and recall are unavailable, and electrical parameters remain incomplete. It supports topology-reconstruction, provenance, geospatial-integration, and interface research, not operational grid studies. Versioned data and code are provided separately.</w:t>
       </w:r>
     </w:p>
     <w:p>
@@ -72,7 +72,7 @@
         <w:t xml:space="preserve">power-grid dataset; data provenance; topology reconstruction; distribution networks; technical validation; open data</w:t>
       </w:r>
     </w:p>
-    <w:bookmarkStart w:id="20" w:name="background-summary"/>
+    <w:bookmarkStart w:id="9" w:name="background-summary"/>
     <w:p>
       <w:pPr>
         <w:pStyle w:val="Heading1"/>
@@ -135,13 +135,31 @@
         <w:pStyle w:val="BodyText"/>
       </w:pPr>
       <w:r>
-        <w:t xml:space="preserve">This framing differs from a conventional engineering paper. The central contribution is the release of a documented candidate dataset and its validation boundaries, not a claim of algorithmic novelty or a demonstration of predictive superiority. Prior open-grid resources have shown the value of transparent power-system model construction from public records</w:t>
-      </w:r>
-      <w:r>
-        <w:t xml:space="preserve"> </w:t>
-      </w:r>
-      <w:r>
-        <w:t xml:space="preserve">(Medjroubi et al. 2017; Rivera et al. 2019; Hörsch et al. 2018; Xiong et al. 2025; Wiese et al. 2019)</w:t>
+        <w:t xml:space="preserve">This framing differs from a conventional engineering paper. The central contribution is a documented candidate dataset and its validation boundaries, not algorithmic novelty or predictive superiority. European open-grid resources demonstrate the reuse value of transparent model construction and standardized public records</w:t>
+      </w:r>
+      <w:r>
+        <w:rPr>
+          <w:vertAlign w:val="superscript"/>
+        </w:rPr>
+        <w:t xml:space="preserve">1–4</w:t>
+      </w:r>
+      <w:r>
+        <w:t xml:space="preserve">; OSM-based reconstruction studies also show that public geometry requires explicit topology-building assumptions</w:t>
+      </w:r>
+      <w:r>
+        <w:rPr>
+          <w:vertAlign w:val="superscript"/>
+        </w:rPr>
+        <w:t xml:space="preserve">5,6</w:t>
+      </w:r>
+      <w:r>
+        <w:t xml:space="preserve">. Dataset documentation and FAIR practice motivate the release of provenance, field semantics, identifiers, and reuse constraints alongside the data</w:t>
+      </w:r>
+      <w:r>
+        <w:rPr>
+          <w:vertAlign w:val="superscript"/>
+        </w:rPr>
+        <w:t xml:space="preserve">7,8</w:t>
       </w:r>
       <w:r>
         <w:t xml:space="preserve">.</w:t>
@@ -159,11 +177,11 @@
         <w:t xml:space="preserve"> </w:t>
       </w:r>
       <w:r>
-        <w:t xml:space="preserve">extends that tradition to a Portuguese 60 kV distribution-layer reconstruction problem while making rejected circuits, semantic status fields, and downstream release contracts explicit.</w:t>
-      </w:r>
-    </w:p>
-    <w:bookmarkEnd w:id="20"/>
-    <w:bookmarkStart w:id="34" w:name="methods"/>
+        <w:t xml:space="preserve">applies these principles to a Portuguese 60 kV distribution-layer reconstruction while exposing rejected circuits and semantic status fields.</w:t>
+      </w:r>
+    </w:p>
+    <w:bookmarkEnd w:id="9"/>
+    <w:bookmarkStart w:id="26" w:name="methods"/>
     <w:p>
       <w:pPr>
         <w:pStyle w:val="Heading1"/>
@@ -172,7 +190,7 @@
         <w:t xml:space="preserve">Methods</w:t>
       </w:r>
     </w:p>
-    <w:bookmarkStart w:id="21" w:name="source-datasets"/>
+    <w:bookmarkStart w:id="12" w:name="source-datasets"/>
     <w:p>
       <w:pPr>
         <w:pStyle w:val="Heading2"/>
@@ -189,13 +207,27 @@
         <w:t xml:space="preserve">The source snapshot combines AT line geometries, AT substations, switching facilities, MT-substation context, network-characteristics tables, substation-load records, reception-capacity context, and load-diagram indices from the E-REDES Open Data Portal</w:t>
       </w:r>
       <w:r>
-        <w:t xml:space="preserve"> </w:t>
-      </w:r>
-      <w:r>
-        <w:t xml:space="preserve">(E-REDES 2026)</w:t>
-      </w:r>
-      <w:r>
-        <w:t xml:space="preserve">. The topology-critical inputs are</w:t>
+        <w:rPr>
+          <w:vertAlign w:val="superscript"/>
+        </w:rPr>
+        <w:t xml:space="preserve">9</w:t>
+      </w:r>
+      <w:r>
+        <w:t xml:space="preserve">. Table </w:t>
+      </w:r>
+      <w:hyperlink w:anchor="tab:source-inputs">
+        <w:r>
+          <w:rPr>
+            <w:rStyle w:val="Hyperlink"/>
+          </w:rPr>
+          <w:t xml:space="preserve">1</w:t>
+        </w:r>
+      </w:hyperlink>
+      <w:r>
+        <w:t xml:space="preserve"> </w:t>
+      </w:r>
+      <w:r>
+        <w:t xml:space="preserve">identifies the three topology-critical inputs; the 13-source inventory and exact legacy catalog, portal, CSV, and GeoJSON URLs are preserved in</w:t>
       </w:r>
       <w:r>
         <w:t xml:space="preserve"> </w:t>
@@ -204,13 +236,325 @@
         <w:rPr>
           <w:rStyle w:val="VerbatimChar"/>
         </w:rPr>
-        <w:t xml:space="preserve">rede-at-teste</w:t>
-      </w:r>
-      <w:r>
-        <w:t xml:space="preserve"> </w:t>
-      </w:r>
-      <w:r>
-        <w:t xml:space="preserve">(5,334 records; checked 2026-07-13 14:15:57 UTC),</w:t>
+        <w:t xml:space="preserve">provenance/reproduction_source_manifest.json</w:t>
+      </w:r>
+      <w:r>
+        <w:t xml:space="preserve">. For example, the line metadata route was</w:t>
+      </w:r>
+      <w:r>
+        <w:t xml:space="preserve"> </w:t>
+      </w:r>
+      <w:hyperlink r:id="rId10">
+        <w:r>
+          <w:rPr>
+            <w:rStyle w:val="Hyperlink"/>
+          </w:rPr>
+          <w:t xml:space="preserve">https://e-redes.opendatasoft.com/api/explore/v2.1/catalog/datasets/rede-at-teste</w:t>
+        </w:r>
+      </w:hyperlink>
+      <w:r>
+        <w:t xml:space="preserve">; the other routes substitute the identifiers shown in the table. The final reacquisition audit on 14 July 2026 returned HTTP 404 for all four recorded routes for each topology-critical dataset.</w:t>
+      </w:r>
+    </w:p>
+    <w:bookmarkStart w:id="11" w:name="tab:source-inputs"/>
+    <w:p>
+      <w:pPr>
+        <w:pStyle w:val="TableCaption"/>
+      </w:pPr>
+      <w:r>
+        <w:t xml:space="preserve">Topology-critical E-REDES inputs. Record counts and snapshot checks are frozen provenance values; the final column records the later clean-room URL audit, not the historical response.</w:t>
+      </w:r>
+    </w:p>
+    <w:tbl>
+      <w:tblPr>
+        <w:tblStyle w:val="Table"/>
+        <w:tblW w:type="auto" w:w="0"/>
+        <w:tblLook w:firstRow="1" w:lastRow="0" w:firstColumn="0" w:lastColumn="0" w:noHBand="0" w:noVBand="0" w:val="0020"/>
+        <w:tblCaption w:val="Topology-critical E-REDES inputs. Record counts and snapshot checks are frozen provenance values; the final column records the later clean-room URL audit, not the historical response."/>
+      </w:tblPr>
+      <w:tblGrid>
+        <w:gridCol w:w="1584"/>
+        <w:gridCol w:w="1584"/>
+        <w:gridCol w:w="1584"/>
+        <w:gridCol w:w="1584"/>
+        <w:gridCol w:w="1584"/>
+      </w:tblGrid>
+      <w:tr>
+        <w:trPr>
+          <w:tblHeader w:val="on"/>
+        </w:trPr>
+        <w:tc>
+          <w:tcPr/>
+          <w:p>
+            <w:pPr>
+              <w:pStyle w:val="Compact"/>
+              <w:jc w:val="left"/>
+            </w:pPr>
+            <w:r>
+              <w:t xml:space="preserve">Portal identifier</w:t>
+            </w:r>
+          </w:p>
+        </w:tc>
+        <w:tc>
+          <w:tcPr/>
+          <w:p>
+            <w:pPr>
+              <w:pStyle w:val="Compact"/>
+              <w:jc w:val="right"/>
+            </w:pPr>
+            <w:r>
+              <w:t xml:space="preserve">Records</w:t>
+            </w:r>
+          </w:p>
+        </w:tc>
+        <w:tc>
+          <w:tcPr/>
+          <w:p>
+            <w:pPr>
+              <w:pStyle w:val="Compact"/>
+              <w:jc w:val="left"/>
+            </w:pPr>
+            <w:r>
+              <w:t xml:space="preserve">Snapshot date</w:t>
+            </w:r>
+          </w:p>
+        </w:tc>
+        <w:tc>
+          <w:tcPr/>
+          <w:p>
+            <w:pPr>
+              <w:pStyle w:val="Compact"/>
+              <w:jc w:val="left"/>
+            </w:pPr>
+            <w:r>
+              <w:t xml:space="preserve">Role</w:t>
+            </w:r>
+          </w:p>
+        </w:tc>
+        <w:tc>
+          <w:tcPr/>
+          <w:p>
+            <w:pPr>
+              <w:pStyle w:val="Compact"/>
+              <w:jc w:val="left"/>
+            </w:pPr>
+            <w:r>
+              <w:t xml:space="preserve">Recheck</w:t>
+            </w:r>
+          </w:p>
+        </w:tc>
+      </w:tr>
+      <w:tr>
+        <w:tc>
+          <w:tcPr/>
+          <w:p>
+            <w:pPr>
+              <w:pStyle w:val="Compact"/>
+              <w:jc w:val="left"/>
+            </w:pPr>
+            <w:r>
+              <w:rPr>
+                <w:rStyle w:val="VerbatimChar"/>
+              </w:rPr>
+              <w:t xml:space="preserve">rede-at-teste</w:t>
+            </w:r>
+          </w:p>
+        </w:tc>
+        <w:tc>
+          <w:tcPr/>
+          <w:p>
+            <w:pPr>
+              <w:pStyle w:val="Compact"/>
+              <w:jc w:val="right"/>
+            </w:pPr>
+            <w:r>
+              <w:t xml:space="preserve">5,334</w:t>
+            </w:r>
+          </w:p>
+        </w:tc>
+        <w:tc>
+          <w:tcPr/>
+          <w:p>
+            <w:pPr>
+              <w:pStyle w:val="Compact"/>
+              <w:jc w:val="left"/>
+            </w:pPr>
+            <w:r>
+              <w:t xml:space="preserve">2026-07-13</w:t>
+            </w:r>
+          </w:p>
+        </w:tc>
+        <w:tc>
+          <w:tcPr/>
+          <w:p>
+            <w:pPr>
+              <w:pStyle w:val="Compact"/>
+              <w:jc w:val="left"/>
+            </w:pPr>
+            <w:r>
+              <w:t xml:space="preserve">AT line geometries</w:t>
+            </w:r>
+          </w:p>
+        </w:tc>
+        <w:tc>
+          <w:tcPr/>
+          <w:p>
+            <w:pPr>
+              <w:pStyle w:val="Compact"/>
+              <w:jc w:val="left"/>
+            </w:pPr>
+            <w:r>
+              <w:t xml:space="preserve">HTTP 404</w:t>
+            </w:r>
+          </w:p>
+        </w:tc>
+      </w:tr>
+      <w:tr>
+        <w:tc>
+          <w:tcPr/>
+          <w:p>
+            <w:pPr>
+              <w:pStyle w:val="Compact"/>
+              <w:jc w:val="left"/>
+            </w:pPr>
+            <w:r>
+              <w:rPr>
+                <w:rStyle w:val="VerbatimChar"/>
+              </w:rPr>
+              <w:t xml:space="preserve">se-at_2025</w:t>
+            </w:r>
+          </w:p>
+        </w:tc>
+        <w:tc>
+          <w:tcPr/>
+          <w:p>
+            <w:pPr>
+              <w:pStyle w:val="Compact"/>
+              <w:jc w:val="right"/>
+            </w:pPr>
+            <w:r>
+              <w:t xml:space="preserve">410</w:t>
+            </w:r>
+          </w:p>
+        </w:tc>
+        <w:tc>
+          <w:tcPr/>
+          <w:p>
+            <w:pPr>
+              <w:pStyle w:val="Compact"/>
+              <w:jc w:val="left"/>
+            </w:pPr>
+            <w:r>
+              <w:t xml:space="preserve">2026-07-13</w:t>
+            </w:r>
+          </w:p>
+        </w:tc>
+        <w:tc>
+          <w:tcPr/>
+          <w:p>
+            <w:pPr>
+              <w:pStyle w:val="Compact"/>
+              <w:jc w:val="left"/>
+            </w:pPr>
+            <w:r>
+              <w:t xml:space="preserve">AT substation facilities</w:t>
+            </w:r>
+          </w:p>
+        </w:tc>
+        <w:tc>
+          <w:tcPr/>
+          <w:p>
+            <w:pPr>
+              <w:pStyle w:val="Compact"/>
+              <w:jc w:val="left"/>
+            </w:pPr>
+            <w:r>
+              <w:t xml:space="preserve">HTTP 404</w:t>
+            </w:r>
+          </w:p>
+        </w:tc>
+      </w:tr>
+      <w:tr>
+        <w:tc>
+          <w:tcPr/>
+          <w:p>
+            <w:pPr>
+              <w:pStyle w:val="Compact"/>
+              <w:jc w:val="left"/>
+            </w:pPr>
+            <w:r>
+              <w:rPr>
+                <w:rStyle w:val="VerbatimChar"/>
+              </w:rPr>
+              <w:t xml:space="preserve">pc-at_2025</w:t>
+            </w:r>
+          </w:p>
+        </w:tc>
+        <w:tc>
+          <w:tcPr/>
+          <w:p>
+            <w:pPr>
+              <w:pStyle w:val="Compact"/>
+              <w:jc w:val="right"/>
+            </w:pPr>
+            <w:r>
+              <w:t xml:space="preserve">76</w:t>
+            </w:r>
+          </w:p>
+        </w:tc>
+        <w:tc>
+          <w:tcPr/>
+          <w:p>
+            <w:pPr>
+              <w:pStyle w:val="Compact"/>
+              <w:jc w:val="left"/>
+            </w:pPr>
+            <w:r>
+              <w:t xml:space="preserve">2026-07-13</w:t>
+            </w:r>
+          </w:p>
+        </w:tc>
+        <w:tc>
+          <w:tcPr/>
+          <w:p>
+            <w:pPr>
+              <w:pStyle w:val="Compact"/>
+              <w:jc w:val="left"/>
+            </w:pPr>
+            <w:r>
+              <w:t xml:space="preserve">Switching facilities</w:t>
+            </w:r>
+          </w:p>
+        </w:tc>
+        <w:tc>
+          <w:tcPr/>
+          <w:p>
+            <w:pPr>
+              <w:pStyle w:val="Compact"/>
+              <w:jc w:val="left"/>
+            </w:pPr>
+            <w:r>
+              <w:t xml:space="preserve">HTTP 404</w:t>
+            </w:r>
+          </w:p>
+        </w:tc>
+      </w:tr>
+    </w:tbl>
+    <w:bookmarkEnd w:id="11"/>
+    <w:p>
+      <w:pPr>
+        <w:pStyle w:val="BodyText"/>
+      </w:pPr>
+      <w:r>
+        <w:t xml:space="preserve">For the documented snapshot, the topology stage loads 586 technically relevant facilities, comprising 409 AT substations and 177 additional facilities. It also loads 5,334 valid AT line features: 5,323 labelled 60 kV and 11 labelled 130 kV. The 11 130 kV features merge into five candidates (three self-loops, one single-facility record, and one isolated record). All five remain in the classification ledger; none enters the 358 retained branches, and no mixed-voltage circuit is produced.</w:t>
+      </w:r>
+    </w:p>
+    <w:p>
+      <w:pPr>
+        <w:pStyle w:val="BodyText"/>
+      </w:pPr>
+      <w:r>
+        <w:t xml:space="preserve">The release uses the portal-level license statement reported by E-REDES for distributable data artifacts. The dataset package records publisher attribution, portal URL, source dataset identifiers, access dates, and transformation notices separately from the repository’s MIT code license. Where topology-critical API catalog responses did not repeat an explicit license field, the release policy follows the recorded portal-level statement rather than inferring a different license from the omission. The topology-critical catalog records were checked on 13 July 2026; per-source timestamps are preserved in</w:t>
       </w:r>
       <w:r>
         <w:t xml:space="preserve"> </w:t>
@@ -219,28 +563,28 @@
         <w:rPr>
           <w:rStyle w:val="VerbatimChar"/>
         </w:rPr>
-        <w:t xml:space="preserve">se-at_2025</w:t>
-      </w:r>
-      <w:r>
-        <w:t xml:space="preserve"> </w:t>
-      </w:r>
-      <w:r>
-        <w:t xml:space="preserve">(410 records; checked 2026-07-13 14:16:08 UTC), and</w:t>
-      </w:r>
-      <w:r>
-        <w:t xml:space="preserve"> </w:t>
-      </w:r>
-      <w:r>
-        <w:rPr>
-          <w:rStyle w:val="VerbatimChar"/>
-        </w:rPr>
-        <w:t xml:space="preserve">pc-at_2025</w:t>
-      </w:r>
-      <w:r>
-        <w:t xml:space="preserve"> </w:t>
-      </w:r>
-      <w:r>
-        <w:t xml:space="preserve">(76 records; checked 2026-07-13 14:15:31 UTC); their catalog, portal, CSV-export, and GeoJSON-export URLs are preserved in the source manifest. For the documented snapshot, the topology stage loads 586 technically relevant facilities, comprising 409 AT substations and 177 additional facilities. The same snapshot contains 5,334 valid AT line features, of which 5,323 are labeled 60 kV and 11 are labeled 130 kV in the current local build.</w:t>
+        <w:t xml:space="preserve">provenance/reproduction_source_manifest.json</w:t>
+      </w:r>
+      <w:r>
+        <w:t xml:space="preserve">.</w:t>
+      </w:r>
+    </w:p>
+    <w:bookmarkEnd w:id="12"/>
+    <w:bookmarkStart w:id="13" w:name="data-acquisition"/>
+    <w:p>
+      <w:pPr>
+        <w:pStyle w:val="Heading2"/>
+      </w:pPr>
+      <w:r>
+        <w:t xml:space="preserve">Data acquisition</w:t>
+      </w:r>
+    </w:p>
+    <w:p>
+      <w:pPr>
+        <w:pStyle w:val="FirstParagraph"/>
+      </w:pPr>
+      <w:r>
+        <w:t xml:space="preserve">Source files were downloaded and validated through a manifest-driven workflow that records dataset roles, retrieval checks, and release metadata. The released workflow is reproducible from the frozen derived inputs, not from newly downloaded raw/API responses. No raw E-REDES snapshot is included, and the recorded topology-critical URLs now return HTTP 404. The source manifest therefore preserves the available identifiers, URL forms, access times, record counts, roles, licence basis, and local-snapshot absence; it cannot provide retroactive raw-file hashes or byte sizes for files that were not retained. Geometry parsing and machine-readability checks occur before reconstruction so that parse failures become explicit blocking states rather than silent exclusions.</w:t>
       </w:r>
     </w:p>
     <w:p>
@@ -248,29 +592,17 @@
         <w:pStyle w:val="BodyText"/>
       </w:pPr>
       <w:r>
-        <w:t xml:space="preserve">The release uses the portal-level license statement reported by E-REDES for distributable data artifacts. The dataset package records publisher attribution, portal URL, source dataset identifiers, access dates, and transformation notices separately from the repository’s MIT code license. Where topology-critical API catalog responses did not repeat an explicit license field, the release policy follows the recorded portal-level statement rather than inferring a different license from the omission. The topology-critical catalog records were checked on 13 July 2026; per-source timestamps are preserved in</w:t>
-      </w:r>
-      <w:r>
-        <w:t xml:space="preserve"> </w:t>
-      </w:r>
-      <w:r>
-        <w:rPr>
-          <w:rStyle w:val="VerbatimChar"/>
-        </w:rPr>
-        <w:t xml:space="preserve">provenance/reproduction_source_manifest.json</w:t>
-      </w:r>
-      <w:r>
-        <w:t xml:space="preserve">.</w:t>
-      </w:r>
-    </w:p>
-    <w:bookmarkEnd w:id="21"/>
-    <w:bookmarkStart w:id="22" w:name="data-acquisition"/>
+        <w:t xml:space="preserve">The acquisition scope is limited to the E-REDES AT layer represented in the documented snapshot. It does not include a verified REN transmission boundary, complete national generation, measured operating conditions, or authoritative switching-state data. These omissions are treated as scope boundaries of the dataset rather than as gaps to be silently imputed.</w:t>
+      </w:r>
+    </w:p>
+    <w:bookmarkEnd w:id="13"/>
+    <w:bookmarkStart w:id="15" w:name="data-preprocessing"/>
     <w:p>
       <w:pPr>
         <w:pStyle w:val="Heading2"/>
       </w:pPr>
       <w:r>
-        <w:t xml:space="preserve">Data acquisition</w:t>
+        <w:t xml:space="preserve">Data preprocessing</w:t>
       </w:r>
     </w:p>
     <w:p>
@@ -278,33 +610,78 @@
         <w:pStyle w:val="FirstParagraph"/>
       </w:pPr>
       <w:r>
-        <w:t xml:space="preserve">Source files are downloaded and validated through a reproducible workflow that records dataset roles, retrieval checks, and release metadata in a source manifest. The source manifest currently covers 13 datasets and is intended to accompany any public release. Geometry parsing and machine-readability checks occur before reconstruction so that parse failures become explicit blocking states rather than silent exclusions.</w:t>
+        <w:t xml:space="preserve">Preprocessing harmonizes source geometries, facility identifiers, and facility classes before topology inference. Released geometries use WGS84 longitude–latitude coordinates (EPSG:4326). The frozen v1.0.1 pipeline projects them to a local equirectangular workspace centred at longitude</w:t>
+      </w:r>
+      <w:r>
+        <w:t xml:space="preserve"> </w:t>
+      </w:r>
+      <m:oMath>
+        <m:r>
+          <m:rPr>
+            <m:sty m:val="p"/>
+          </m:rPr>
+          <m:t>−</m:t>
+        </m:r>
+        <m:sSup>
+          <m:e>
+            <m:r>
+              <m:t>8.532604</m:t>
+            </m:r>
+          </m:e>
+          <m:sup>
+            <m:r>
+              <m:rPr>
+                <m:sty m:val="p"/>
+              </m:rPr>
+              <m:t>∘</m:t>
+            </m:r>
+          </m:sup>
+        </m:sSup>
+      </m:oMath>
+      <w:r>
+        <w:t xml:space="preserve"> </w:t>
+      </w:r>
+      <w:r>
+        <w:t xml:space="preserve">and latitude</w:t>
+      </w:r>
+      <w:r>
+        <w:t xml:space="preserve"> </w:t>
+      </w:r>
+      <m:oMath>
+        <m:sSup>
+          <m:e>
+            <m:r>
+              <m:t>39.567953</m:t>
+            </m:r>
+          </m:e>
+          <m:sup>
+            <m:r>
+              <m:rPr>
+                <m:sty m:val="p"/>
+              </m:rPr>
+              <m:t>∘</m:t>
+            </m:r>
+          </m:sup>
+        </m:sSup>
+      </m:oMath>
+      <w:r>
+        <w:t xml:space="preserve"> </w:t>
+      </w:r>
+      <w:r>
+        <w:t xml:space="preserve">for endpoint, buffer, and length calculations. These transformations and geometry-derived quantities are recorded as derived rather than observed values.</w:t>
       </w:r>
     </w:p>
     <w:p>
       <w:pPr>
         <w:pStyle w:val="BodyText"/>
       </w:pPr>
-      <w:r>
-        <w:t xml:space="preserve">The acquisition scope is limited to the E-REDES AT layer represented in the documented snapshot. It does not include a verified REN transmission boundary, complete national generation, measured operating conditions, or authoritative switching-state data. These omissions are treated as scope boundaries of the dataset rather than as gaps to be silently imputed.</w:t>
-      </w:r>
-    </w:p>
-    <w:bookmarkEnd w:id="22"/>
-    <w:bookmarkStart w:id="23" w:name="data-preprocessing"/>
-    <w:p>
-      <w:pPr>
-        <w:pStyle w:val="Heading2"/>
-      </w:pPr>
-      <w:r>
-        <w:t xml:space="preserve">Data preprocessing</w:t>
-      </w:r>
-    </w:p>
-    <w:p>
-      <w:pPr>
-        <w:pStyle w:val="FirstParagraph"/>
-      </w:pPr>
-      <w:r>
-        <w:t xml:space="preserve">Preprocessing harmonizes source geometries, facility identifiers, and facility classes before topology inference. The workflow validates geometry type and validity, repairs parseable geometry issues where permitted by the loader, performs coordinate-reference conversions needed for endpoint and corridor calculations, and derives geometry-based quantities such as length. These transformations are recorded as derived rather than observed values.</w:t>
+      <w:bookmarkStart w:id="14" w:name="sec:projection-error-audit"/>
+      <w:bookmarkEnd w:id="14"/>
+      <w:r>
+        <w:t xml:space="preserve"> </w:t>
+      </w:r>
+      <w:r>
+        <w:t xml:space="preserve">Because one national-scale centre introduces latitude-dependent scale distortion, we audited all 43,505 adjacent segments in the released branch geometries against spherical great-circle distance. The median and 95th-percentile relative errors were 0.47% and 2.36%; the maximum was 3.84%. Across the released latitude range, the worst east–west scale error was 3.91%, equivalent to 0.020, 1.96, 3.91, 9.78, and 19.55 m at the 0.5, 50, 100, 250, and 500 m thresholds, respectively. The selected 0.5 and 100 m settings are retained for version consistency; a future threshold-retuned release should use ETRS89 / Portugal TM06 (EPSG:3763) or ellipsoidal geodesic distances.</w:t>
       </w:r>
     </w:p>
     <w:p>
@@ -315,8 +692,8 @@
         <w:t xml:space="preserve">Facilities are standardized into node candidates with associated codes, names, types, source roles, and footprint-ready geometries. Source line features are standardized into endpoint-bearing line records. Ambiguous matches and unresolved endpoints are retained as explicit states for later classification. This preprocessing stage therefore prepares line and facility inputs for reconstruction without asserting that each input line already corresponds to a valid inter-facility branch.</w:t>
       </w:r>
     </w:p>
-    <w:bookmarkEnd w:id="23"/>
-    <w:bookmarkStart w:id="25" w:name="provenance-model"/>
+    <w:bookmarkEnd w:id="15"/>
+    <w:bookmarkStart w:id="17" w:name="provenance-model"/>
     <w:p>
       <w:pPr>
         <w:pStyle w:val="Heading2"/>
@@ -379,74 +756,78 @@
               </m:r>
             </m:sub>
           </m:sSub>
-          <m:d>
-            <m:dPr>
-              <m:begChr m:val="("/>
-              <m:endChr m:val=")"/>
-              <m:sepChr m:val=""/>
-              <m:grow/>
-            </m:dPr>
-            <m:e>
-              <m:r>
-                <m:t>o</m:t>
-              </m:r>
-            </m:e>
-          </m:d>
+          <m:r>
+            <m:rPr>
+              <m:sty m:val="p"/>
+            </m:rPr>
+            <m:t>(</m:t>
+          </m:r>
+          <m:r>
+            <m:t>o</m:t>
+          </m:r>
+          <m:r>
+            <m:rPr>
+              <m:sty m:val="p"/>
+            </m:rPr>
+            <m:t>)</m:t>
+          </m:r>
           <m:r>
             <m:rPr>
               <m:sty m:val="p"/>
             </m:rPr>
             <m:t>=</m:t>
           </m:r>
-          <m:d>
-            <m:dPr>
-              <m:begChr m:val="("/>
-              <m:endChr m:val=")"/>
-              <m:sepChr m:val=""/>
-              <m:grow/>
-            </m:dPr>
-            <m:e>
-              <m:r>
-                <m:t>v</m:t>
-              </m:r>
-              <m:r>
-                <m:rPr>
-                  <m:sty m:val="p"/>
-                </m:rPr>
-                <m:t>,</m:t>
-              </m:r>
-              <m:r>
-                <m:t>s</m:t>
-              </m:r>
-              <m:r>
-                <m:rPr>
-                  <m:sty m:val="p"/>
-                </m:rPr>
-                <m:t>,</m:t>
-              </m:r>
-              <m:r>
-                <m:t>q</m:t>
-              </m:r>
-              <m:r>
-                <m:rPr>
-                  <m:sty m:val="p"/>
-                </m:rPr>
-                <m:t>,</m:t>
-              </m:r>
-              <m:r>
-                <m:t>a</m:t>
-              </m:r>
-              <m:r>
-                <m:rPr>
-                  <m:sty m:val="p"/>
-                </m:rPr>
-                <m:t>,</m:t>
-              </m:r>
-              <m:r>
-                <m:t>e</m:t>
-              </m:r>
-            </m:e>
-          </m:d>
+          <m:r>
+            <m:rPr>
+              <m:sty m:val="p"/>
+            </m:rPr>
+            <m:t>(</m:t>
+          </m:r>
+          <m:r>
+            <m:t>v</m:t>
+          </m:r>
+          <m:r>
+            <m:rPr>
+              <m:sty m:val="p"/>
+            </m:rPr>
+            <m:t>,</m:t>
+          </m:r>
+          <m:r>
+            <m:t>s</m:t>
+          </m:r>
+          <m:r>
+            <m:rPr>
+              <m:sty m:val="p"/>
+            </m:rPr>
+            <m:t>,</m:t>
+          </m:r>
+          <m:r>
+            <m:t>q</m:t>
+          </m:r>
+          <m:r>
+            <m:rPr>
+              <m:sty m:val="p"/>
+            </m:rPr>
+            <m:t>,</m:t>
+          </m:r>
+          <m:r>
+            <m:t>a</m:t>
+          </m:r>
+          <m:r>
+            <m:rPr>
+              <m:sty m:val="p"/>
+            </m:rPr>
+            <m:t>,</m:t>
+          </m:r>
+          <m:r>
+            <m:t>e</m:t>
+          </m:r>
+          <m:r>
+            <m:rPr>
+              <m:sty m:val="p"/>
+            </m:rPr>
+            <m:t>)</m:t>
+          </m:r>
           <m:r>
             <m:rPr>
               <m:sty m:val="p"/>
@@ -534,7 +915,7 @@
         <w:t xml:space="preserve">an exclusion or blocking reason.</w:t>
       </w:r>
     </w:p>
-    <w:bookmarkStart w:id="24" w:name="tab:semantics"/>
+    <w:bookmarkStart w:id="16" w:name="tab:semantics"/>
     <w:p>
       <w:pPr>
         <w:pStyle w:val="TableCaption"/>
@@ -807,7 +1188,7 @@
         </w:tc>
       </w:tr>
     </w:tbl>
-    <w:bookmarkEnd w:id="24"/>
+    <w:bookmarkEnd w:id="16"/>
     <w:p>
       <w:pPr>
         <w:pStyle w:val="BodyText"/>
@@ -820,7 +1201,7 @@
           <w:rPr>
             <w:rStyle w:val="Hyperlink"/>
           </w:rPr>
-          <w:t xml:space="preserve">1</w:t>
+          <w:t xml:space="preserve">2</w:t>
         </w:r>
       </w:hyperlink>
       <w:r>
@@ -881,8 +1262,8 @@
         <w:t xml:space="preserve">provide file-level structure, joins, versions, roles, and checksums.</w:t>
       </w:r>
     </w:p>
-    <w:bookmarkEnd w:id="25"/>
-    <w:bookmarkStart w:id="30" w:name="reconstruction-pipeline"/>
+    <w:bookmarkEnd w:id="17"/>
+    <w:bookmarkStart w:id="22" w:name="reconstruction-pipeline"/>
     <w:p>
       <w:pPr>
         <w:pStyle w:val="Heading2"/>
@@ -929,7 +1310,7 @@
         <w:t xml:space="preserve">shows how retained and downgraded records pass through common validation and release-contract stages.</w:t>
       </w:r>
     </w:p>
-    <w:bookmarkStart w:id="29" w:name="fig:pipeline"/>
+    <w:bookmarkStart w:id="21" w:name="fig:pipeline"/>
     <w:p>
       <w:pPr>
         <w:pStyle w:val="CaptionedFigure"/>
@@ -939,18 +1320,18 @@
           <wp:inline>
             <wp:extent cx="5334000" cy="2667771"/>
             <wp:effectExtent b="0" l="0" r="0" t="0"/>
-            <wp:docPr descr="" title="" id="27" name="Picture"/>
+            <wp:docPr descr="" title="" id="19" name="Picture"/>
             <a:graphic>
               <a:graphicData uri="http://schemas.openxmlformats.org/drawingml/2006/picture">
                 <pic:pic>
                   <pic:nvPicPr>
-                    <pic:cNvPr descr="fig1_pipeline_overview.png" id="28" name="Picture"/>
+                    <pic:cNvPr descr="fig1_pipeline_overview.png" id="20" name="Picture"/>
                     <pic:cNvPicPr>
                       <a:picLocks noChangeArrowheads="1" noChangeAspect="1"/>
                     </pic:cNvPicPr>
                   </pic:nvPicPr>
                   <pic:blipFill>
-                    <a:blip r:embed="rId26"/>
+                    <a:blip r:embed="rId18"/>
                     <a:stretch>
                       <a:fillRect/>
                     </a:stretch>
@@ -997,9 +1378,9 @@
         <w:t xml:space="preserve">. Blue boxes denote transformations or validation, the yellow diamond is the declared retention gate, green boxes are deposited release layers, the red box preserves downgraded/rejected records, and the purple box records provenance and reuse contracts. The diagram summarizes workflow structure and claim boundaries rather than measured performance.</w:t>
       </w:r>
     </w:p>
-    <w:bookmarkEnd w:id="29"/>
-    <w:bookmarkEnd w:id="30"/>
-    <w:bookmarkStart w:id="31" w:name="candidate-selection"/>
+    <w:bookmarkEnd w:id="21"/>
+    <w:bookmarkEnd w:id="22"/>
+    <w:bookmarkStart w:id="23" w:name="candidate-selection"/>
     <w:p>
       <w:pPr>
         <w:pStyle w:val="Heading2"/>
@@ -1024,8 +1405,233 @@
         <w:t xml:space="preserve">This selection policy is intentionally conservative. It favors explicit preservation of non-retained outcomes over optimistic retention. Mixed voltage or status conflicts, suspicious spatial matches, and unresolved facility mappings are retained as audit information instead of being absorbed into a simplified final graph.</w:t>
       </w:r>
     </w:p>
-    <w:bookmarkEnd w:id="31"/>
-    <w:bookmarkStart w:id="32" w:name="parameter-sweep"/>
+    <w:p>
+      <w:pPr>
+        <w:pStyle w:val="BodyText"/>
+      </w:pPr>
+      <w:r>
+        <w:t xml:space="preserve">For each retained branch,</w:t>
+      </w:r>
+      <w:r>
+        <w:t xml:space="preserve"> </w:t>
+      </w:r>
+      <w:r>
+        <w:rPr>
+          <w:rStyle w:val="VerbatimChar"/>
+        </w:rPr>
+        <w:t xml:space="preserve">confidence_score</w:t>
+      </w:r>
+      <w:r>
+        <w:t xml:space="preserve"> </w:t>
+      </w:r>
+      <w:r>
+        <w:t xml:space="preserve">is an internal proximity score</w:t>
+      </w:r>
+    </w:p>
+    <w:p>
+      <w:pPr>
+        <w:pStyle w:val="BodyText"/>
+      </w:pPr>
+      <m:oMathPara>
+        <m:oMathParaPr>
+          <m:jc m:val="center"/>
+        </m:oMathParaPr>
+        <m:oMath>
+          <m:r>
+            <m:t>q</m:t>
+          </m:r>
+          <m:r>
+            <m:rPr>
+              <m:sty m:val="p"/>
+            </m:rPr>
+            <m:t>=</m:t>
+          </m:r>
+          <m:r>
+            <m:rPr>
+              <m:sty m:val="p"/>
+            </m:rPr>
+            <m:t>max</m:t>
+          </m:r>
+          <m:r>
+            <m:t>​</m:t>
+          </m:r>
+          <m:d>
+            <m:dPr>
+              <m:begChr m:val="("/>
+              <m:sepChr m:val=""/>
+              <m:endChr m:val=")"/>
+              <m:grow/>
+            </m:dPr>
+            <m:e>
+              <m:r>
+                <m:t>0</m:t>
+              </m:r>
+              <m:r>
+                <m:rPr>
+                  <m:sty m:val="p"/>
+                </m:rPr>
+                <m:t>,</m:t>
+              </m:r>
+              <m:r>
+                <m:rPr>
+                  <m:sty m:val="p"/>
+                </m:rPr>
+                <m:t>min</m:t>
+              </m:r>
+              <m:r>
+                <m:t>​</m:t>
+              </m:r>
+              <m:d>
+                <m:dPr>
+                  <m:begChr m:val="("/>
+                  <m:sepChr m:val=""/>
+                  <m:endChr m:val=")"/>
+                  <m:grow/>
+                </m:dPr>
+                <m:e>
+                  <m:r>
+                    <m:t>1</m:t>
+                  </m:r>
+                  <m:r>
+                    <m:rPr>
+                      <m:sty m:val="p"/>
+                    </m:rPr>
+                    <m:t>,</m:t>
+                  </m:r>
+                  <m:r>
+                    <m:t>1</m:t>
+                  </m:r>
+                  <m:r>
+                    <m:rPr>
+                      <m:sty m:val="p"/>
+                    </m:rPr>
+                    <m:t>−</m:t>
+                  </m:r>
+                  <m:r>
+                    <m:t>0.35</m:t>
+                  </m:r>
+                  <m:f>
+                    <m:fPr>
+                      <m:type m:val="bar"/>
+                    </m:fPr>
+                    <m:num>
+                      <m:sSub>
+                        <m:e>
+                          <m:r>
+                            <m:t>d</m:t>
+                          </m:r>
+                        </m:e>
+                        <m:sub>
+                          <m:r>
+                            <m:rPr>
+                              <m:sty m:val="p"/>
+                            </m:rPr>
+                            <m:t>max</m:t>
+                          </m:r>
+                        </m:sub>
+                      </m:sSub>
+                    </m:num>
+                    <m:den>
+                      <m:r>
+                        <m:t>b</m:t>
+                      </m:r>
+                    </m:den>
+                  </m:f>
+                </m:e>
+              </m:d>
+            </m:e>
+          </m:d>
+          <m:r>
+            <m:rPr>
+              <m:sty m:val="p"/>
+            </m:rPr>
+            <m:t>,</m:t>
+          </m:r>
+        </m:oMath>
+      </m:oMathPara>
+    </w:p>
+    <w:p>
+      <w:pPr>
+        <w:pStyle w:val="FirstParagraph"/>
+      </w:pPr>
+      <w:r>
+        <w:t xml:space="preserve">where</w:t>
+      </w:r>
+      <w:r>
+        <w:t xml:space="preserve"> </w:t>
+      </w:r>
+      <m:oMath>
+        <m:sSub>
+          <m:e>
+            <m:r>
+              <m:t>d</m:t>
+            </m:r>
+          </m:e>
+          <m:sub>
+            <m:r>
+              <m:rPr>
+                <m:sty m:val="p"/>
+              </m:rPr>
+              <m:t>max</m:t>
+            </m:r>
+          </m:sub>
+        </m:sSub>
+      </m:oMath>
+      <w:r>
+        <w:t xml:space="preserve"> </w:t>
+      </w:r>
+      <w:r>
+        <w:t xml:space="preserve">is the larger of the two endpoint-to-facility distances and</w:t>
+      </w:r>
+      <w:r>
+        <w:t xml:space="preserve"> </w:t>
+      </w:r>
+      <m:oMath>
+        <m:r>
+          <m:t>b</m:t>
+        </m:r>
+      </m:oMath>
+      <w:r>
+        <w:t xml:space="preserve"> </w:t>
+      </w:r>
+      <w:r>
+        <w:t xml:space="preserve">is the facility-buffer radius, both in metres. The value is rounded to four decimals and lies in</w:t>
+      </w:r>
+      <w:r>
+        <w:t xml:space="preserve"> </w:t>
+      </w:r>
+      <m:oMath>
+        <m:r>
+          <m:rPr>
+            <m:sty m:val="p"/>
+          </m:rPr>
+          <m:t>[</m:t>
+        </m:r>
+        <m:r>
+          <m:t>0</m:t>
+        </m:r>
+        <m:r>
+          <m:rPr>
+            <m:sty m:val="p"/>
+          </m:rPr>
+          <m:t>,</m:t>
+        </m:r>
+        <m:r>
+          <m:t>1</m:t>
+        </m:r>
+        <m:r>
+          <m:rPr>
+            <m:sty m:val="p"/>
+          </m:rPr>
+          <m:t>]</m:t>
+        </m:r>
+      </m:oMath>
+      <w:r>
+        <w:t xml:space="preserve">. It is a deterministic rule score, not a probability, precision estimate, or operator-validation measure. It is computed only after a circuit passes the inter-facility retention rule and does not affect merging, retention, the 216-setting selection score, or the OSM-derived evidence category.</w:t>
+      </w:r>
+    </w:p>
+    <w:bookmarkEnd w:id="23"/>
+    <w:bookmarkStart w:id="24" w:name="parameter-sweep"/>
     <w:p>
       <w:pPr>
         <w:pStyle w:val="Heading2"/>
@@ -1039,15 +1645,390 @@
         <w:pStyle w:val="FirstParagraph"/>
       </w:pPr>
       <w:r>
-        <w:t xml:space="preserve">The reconstruction workflow evaluates 216 settings generated by combining three facility sets, four footprint buffers, six endpoint snap thresholds, and three merge modes. The selection rule rewards retained inter-facility yield and interpretable component structure while penalizing ambiguity, explicit conflicts, suspicious matches, and the broadest thresholds. The selected release setting uses node set B, a 100 m facility buffer, a 0.5 m endpoint snap threshold, and voltage-plus-status-aware merging.</w:t>
+        <w:t xml:space="preserve">The reconstruction workflow evaluates 216 settings generated by combining three facility sets, four footprint buffers, six endpoint snap thresholds, and three merge modes. For configuration</w:t>
+      </w:r>
+      <w:r>
+        <w:t xml:space="preserve"> </w:t>
+      </w:r>
+      <m:oMath>
+        <m:r>
+          <m:t>i</m:t>
+        </m:r>
+      </m:oMath>
+      <w:r>
+        <w:t xml:space="preserve">, the unnormalised engineering score is</w:t>
       </w:r>
     </w:p>
     <w:p>
       <w:pPr>
         <w:pStyle w:val="BodyText"/>
       </w:pPr>
-      <w:r>
-        <w:t xml:space="preserve">The score is a reproducible engineering rule used to choose one documented release point from the 216-setting sweep. It is not a calibrated probability of correctness and is not presented as an external optimum.</w:t>
+      <m:oMathPara>
+        <m:oMathParaPr>
+          <m:jc m:val="center"/>
+        </m:oMathParaPr>
+        <m:oMath>
+          <m:sSub>
+            <m:e>
+              <m:r>
+                <m:t>S</m:t>
+              </m:r>
+            </m:e>
+            <m:sub>
+              <m:r>
+                <m:t>i</m:t>
+              </m:r>
+            </m:sub>
+          </m:sSub>
+          <m:r>
+            <m:rPr>
+              <m:sty m:val="p"/>
+            </m:rPr>
+            <m:t>=</m:t>
+          </m:r>
+          <m:r>
+            <m:t>100</m:t>
+          </m:r>
+          <m:sSub>
+            <m:e>
+              <m:r>
+                <m:t>C</m:t>
+              </m:r>
+            </m:e>
+            <m:sub>
+              <m:r>
+                <m:t>i</m:t>
+              </m:r>
+            </m:sub>
+          </m:sSub>
+          <m:r>
+            <m:rPr>
+              <m:sty m:val="p"/>
+            </m:rPr>
+            <m:t>+</m:t>
+          </m:r>
+          <m:r>
+            <m:t>50</m:t>
+          </m:r>
+          <m:sSub>
+            <m:e>
+              <m:r>
+                <m:t>L</m:t>
+              </m:r>
+            </m:e>
+            <m:sub>
+              <m:r>
+                <m:t>i</m:t>
+              </m:r>
+            </m:sub>
+          </m:sSub>
+          <m:r>
+            <m:rPr>
+              <m:sty m:val="p"/>
+            </m:rPr>
+            <m:t>−</m:t>
+          </m:r>
+          <m:r>
+            <m:t>50</m:t>
+          </m:r>
+          <m:sSub>
+            <m:e>
+              <m:r>
+                <m:t>A</m:t>
+              </m:r>
+            </m:e>
+            <m:sub>
+              <m:r>
+                <m:t>i</m:t>
+              </m:r>
+            </m:sub>
+          </m:sSub>
+          <m:r>
+            <m:rPr>
+              <m:sty m:val="p"/>
+            </m:rPr>
+            <m:t>−</m:t>
+          </m:r>
+          <m:r>
+            <m:t>100</m:t>
+          </m:r>
+          <m:sSub>
+            <m:e>
+              <m:r>
+                <m:t>V</m:t>
+              </m:r>
+            </m:e>
+            <m:sub>
+              <m:r>
+                <m:t>i</m:t>
+              </m:r>
+            </m:sub>
+          </m:sSub>
+          <m:r>
+            <m:rPr>
+              <m:sty m:val="p"/>
+            </m:rPr>
+            <m:t>−</m:t>
+          </m:r>
+          <m:r>
+            <m:t>10</m:t>
+          </m:r>
+          <m:sSub>
+            <m:e>
+              <m:r>
+                <m:t>T</m:t>
+              </m:r>
+            </m:e>
+            <m:sub>
+              <m:r>
+                <m:t>i</m:t>
+              </m:r>
+            </m:sub>
+          </m:sSub>
+          <m:r>
+            <m:rPr>
+              <m:sty m:val="p"/>
+            </m:rPr>
+            <m:t>−</m:t>
+          </m:r>
+          <m:r>
+            <m:t>50</m:t>
+          </m:r>
+          <m:sSub>
+            <m:e>
+              <m:r>
+                <m:t>Q</m:t>
+              </m:r>
+            </m:e>
+            <m:sub>
+              <m:r>
+                <m:t>i</m:t>
+              </m:r>
+            </m:sub>
+          </m:sSub>
+          <m:r>
+            <m:rPr>
+              <m:sty m:val="p"/>
+            </m:rPr>
+            <m:t>−</m:t>
+          </m:r>
+          <m:r>
+            <m:t>500</m:t>
+          </m:r>
+          <m:r>
+            <m:rPr>
+              <m:sty m:val="b"/>
+            </m:rPr>
+            <m:t>1</m:t>
+          </m:r>
+          <m:r>
+            <m:rPr>
+              <m:sty m:val="p"/>
+            </m:rPr>
+            <m:t>[</m:t>
+          </m:r>
+          <m:sSub>
+            <m:e>
+              <m:r>
+                <m:t>b</m:t>
+              </m:r>
+            </m:e>
+            <m:sub>
+              <m:r>
+                <m:t>i</m:t>
+              </m:r>
+            </m:sub>
+          </m:sSub>
+          <m:r>
+            <m:rPr>
+              <m:sty m:val="p"/>
+            </m:rPr>
+            <m:t>=</m:t>
+          </m:r>
+          <m:r>
+            <m:t>500</m:t>
+          </m:r>
+          <m:r>
+            <m:rPr>
+              <m:sty m:val="p"/>
+            </m:rPr>
+            <m:t>]</m:t>
+          </m:r>
+          <m:r>
+            <m:rPr>
+              <m:sty m:val="p"/>
+            </m:rPr>
+            <m:t>−</m:t>
+          </m:r>
+          <m:r>
+            <m:t>250</m:t>
+          </m:r>
+          <m:r>
+            <m:rPr>
+              <m:sty m:val="b"/>
+            </m:rPr>
+            <m:t>1</m:t>
+          </m:r>
+          <m:r>
+            <m:rPr>
+              <m:sty m:val="p"/>
+            </m:rPr>
+            <m:t>[</m:t>
+          </m:r>
+          <m:sSub>
+            <m:e>
+              <m:r>
+                <m:t>s</m:t>
+              </m:r>
+            </m:e>
+            <m:sub>
+              <m:r>
+                <m:t>i</m:t>
+              </m:r>
+            </m:sub>
+          </m:sSub>
+          <m:r>
+            <m:rPr>
+              <m:sty m:val="p"/>
+            </m:rPr>
+            <m:t>=</m:t>
+          </m:r>
+          <m:r>
+            <m:t>50</m:t>
+          </m:r>
+          <m:r>
+            <m:rPr>
+              <m:sty m:val="p"/>
+            </m:rPr>
+            <m:t>]</m:t>
+          </m:r>
+          <m:r>
+            <m:rPr>
+              <m:sty m:val="p"/>
+            </m:rPr>
+            <m:t>,</m:t>
+          </m:r>
+        </m:oMath>
+      </m:oMathPara>
+    </w:p>
+    <w:p>
+      <w:pPr>
+        <w:pStyle w:val="FirstParagraph"/>
+      </w:pPr>
+      <w:r>
+        <w:t xml:space="preserve">where</w:t>
+      </w:r>
+      <w:r>
+        <w:t xml:space="preserve"> </w:t>
+      </w:r>
+      <m:oMath>
+        <m:r>
+          <m:t>C</m:t>
+        </m:r>
+      </m:oMath>
+      <w:r>
+        <w:t xml:space="preserve"> </w:t>
+      </w:r>
+      <w:r>
+        <w:t xml:space="preserve">is the retained inter-facility count,</w:t>
+      </w:r>
+      <w:r>
+        <w:t xml:space="preserve"> </w:t>
+      </w:r>
+      <m:oMath>
+        <m:r>
+          <m:t>L</m:t>
+        </m:r>
+      </m:oMath>
+      <w:r>
+        <w:t xml:space="preserve"> </w:t>
+      </w:r>
+      <w:r>
+        <w:t xml:space="preserve">the largest edge-induced component size,</w:t>
+      </w:r>
+      <w:r>
+        <w:t xml:space="preserve"> </w:t>
+      </w:r>
+      <m:oMath>
+        <m:r>
+          <m:t>A</m:t>
+        </m:r>
+      </m:oMath>
+      <w:r>
+        <w:t xml:space="preserve"> </w:t>
+      </w:r>
+      <w:r>
+        <w:t xml:space="preserve">the ambiguous-circuit count,</w:t>
+      </w:r>
+      <w:r>
+        <w:t xml:space="preserve"> </w:t>
+      </w:r>
+      <m:oMath>
+        <m:r>
+          <m:t>V</m:t>
+        </m:r>
+      </m:oMath>
+      <w:r>
+        <w:t xml:space="preserve"> </w:t>
+      </w:r>
+      <w:r>
+        <w:t xml:space="preserve">and</w:t>
+      </w:r>
+      <w:r>
+        <w:t xml:space="preserve"> </w:t>
+      </w:r>
+      <m:oMath>
+        <m:r>
+          <m:t>T</m:t>
+        </m:r>
+      </m:oMath>
+      <w:r>
+        <w:t xml:space="preserve"> </w:t>
+      </w:r>
+      <w:r>
+        <w:t xml:space="preserve">the mixed-voltage and mixed-status counts,</w:t>
+      </w:r>
+      <w:r>
+        <w:t xml:space="preserve"> </w:t>
+      </w:r>
+      <m:oMath>
+        <m:r>
+          <m:t>Q</m:t>
+        </m:r>
+      </m:oMath>
+      <w:r>
+        <w:t xml:space="preserve"> </w:t>
+      </w:r>
+      <w:r>
+        <w:t xml:space="preserve">the ambiguous facility-match count,</w:t>
+      </w:r>
+      <w:r>
+        <w:t xml:space="preserve"> </w:t>
+      </w:r>
+      <m:oMath>
+        <m:r>
+          <m:t>b</m:t>
+        </m:r>
+      </m:oMath>
+      <w:r>
+        <w:t xml:space="preserve"> </w:t>
+      </w:r>
+      <w:r>
+        <w:t xml:space="preserve">the facility buffer in metres, and</w:t>
+      </w:r>
+      <w:r>
+        <w:t xml:space="preserve"> </w:t>
+      </w:r>
+      <m:oMath>
+        <m:r>
+          <m:t>s</m:t>
+        </m:r>
+      </m:oMath>
+      <w:r>
+        <w:t xml:space="preserve"> </w:t>
+      </w:r>
+      <w:r>
+        <w:t xml:space="preserve">the endpoint snap in metres. No term is normalized or fitted to truth labels. The maximum score is selected; an exact tie is resolved by the first configuration in the declared loop order: node sets A–C, buffers 50–500 m, snap thresholds 0.5–50 m, and merge modes geometry-only, voltage-aware, then voltage-plus-status-aware.</w:t>
       </w:r>
     </w:p>
     <w:p>
@@ -1055,11 +2036,45 @@
         <w:pStyle w:val="BodyText"/>
       </w:pPr>
       <w:r>
+        <w:t xml:space="preserve">This rule selects node set B, a 100 m facility buffer, a 0.5 m endpoint snap threshold, and voltage-plus-status-aware merging (</w:t>
+      </w:r>
+      <m:oMath>
+        <m:r>
+          <m:t>S</m:t>
+        </m:r>
+        <m:r>
+          <m:rPr>
+            <m:sty m:val="p"/>
+          </m:rPr>
+          <m:t>=</m:t>
+        </m:r>
+        <m:r>
+          <m:t>32</m:t>
+        </m:r>
+        <m:r>
+          <m:rPr>
+            <m:sty m:val="p"/>
+          </m:rPr>
+          <m:t>,</m:t>
+        </m:r>
+        <m:r>
+          <m:t>350</m:t>
+        </m:r>
+      </m:oMath>
+      <w:r>
+        <w:t xml:space="preserve">). The weights encode a documented pipeline design preference, not a calibrated probability or externally validated optimum; all 216 rows remain available for alternative selection rules.</w:t>
+      </w:r>
+    </w:p>
+    <w:p>
+      <w:pPr>
+        <w:pStyle w:val="BodyText"/>
+      </w:pPr>
+      <w:r>
         <w:t xml:space="preserve">Large-language-model assistance was used for code review, structural editing, and release-checklist support. The authors inspected the generated changes and remain responsible for the methods, numerical results, citations, release files, and claims. This disclosure must be confirmed against the authors’ actual use before submission.</w:t>
       </w:r>
     </w:p>
-    <w:bookmarkEnd w:id="32"/>
-    <w:bookmarkStart w:id="33" w:name="dataset-generation"/>
+    <w:bookmarkEnd w:id="24"/>
+    <w:bookmarkStart w:id="25" w:name="dataset-generation"/>
     <w:p>
       <w:pPr>
         <w:pStyle w:val="Heading2"/>
@@ -1084,18 +2099,18 @@
         <w:t xml:space="preserve">The same workflow packages the reconstruction-sensitivity table, public-source triangulation outputs, negative controls, an independence-risk audit, internal-validation results, source manifests, schemas, and checksum-linked inventory. Electrical diagnostics and Stage 1–5 learning interfaces are excluded from the main v1.0.1 public archive because they depend on incomplete, proxy, benchmark-only, or scenario-derived information.</w:t>
       </w:r>
     </w:p>
-    <w:bookmarkEnd w:id="33"/>
-    <w:bookmarkEnd w:id="34"/>
-    <w:bookmarkStart w:id="48" w:name="data-records"/>
+    <w:bookmarkEnd w:id="25"/>
+    <w:bookmarkEnd w:id="26"/>
+    <w:bookmarkStart w:id="40" w:name="data-record"/>
     <w:p>
       <w:pPr>
         <w:pStyle w:val="Heading1"/>
       </w:pPr>
       <w:r>
-        <w:t xml:space="preserve">Data Records</w:t>
-      </w:r>
-    </w:p>
-    <w:bookmarkStart w:id="36" w:name="repository-overview"/>
+        <w:t xml:space="preserve">Data Record</w:t>
+      </w:r>
+    </w:p>
+    <w:bookmarkStart w:id="28" w:name="repository-overview"/>
     <w:p>
       <w:pPr>
         <w:pStyle w:val="Heading2"/>
@@ -1118,12 +2133,21 @@
         <w:t xml:space="preserve"> </w:t>
       </w:r>
       <w:r>
-        <w:t xml:space="preserve">version 1.0.1 has been prepared for a reserved figshare record. Its DOI is</w:t>
-      </w:r>
-      <w:r>
-        <w:t xml:space="preserve"> </w:t>
-      </w:r>
-      <w:hyperlink r:id="rId35">
+        <w:t xml:space="preserve">version 1.0.1 has been prepared for a reserved figshare record</w:t>
+      </w:r>
+      <w:r>
+        <w:rPr>
+          <w:vertAlign w:val="superscript"/>
+        </w:rPr>
+        <w:t xml:space="preserve">10</w:t>
+      </w:r>
+      <w:r>
+        <w:t xml:space="preserve">. Its DOI is</w:t>
+      </w:r>
+      <w:r>
+        <w:t xml:space="preserve"> </w:t>
+      </w:r>
+      <w:hyperlink r:id="rId27">
         <w:r>
           <w:rPr>
             <w:rStyle w:val="Hyperlink"/>
@@ -1156,7 +2180,7 @@
         <w:rPr>
           <w:rStyle w:val="VerbatimChar"/>
         </w:rPr>
-        <w:t xml:space="preserve">a4dd2d115caae0cd1c873fb7db3341e0aaed0ce62f7f0072ae92642898efb69a</w:t>
+        <w:t xml:space="preserve">a8a17396830407a7d7ea16e50ebb67336a6015f2aee4781391fa59c54fde5459</w:t>
       </w:r>
       <w:r>
         <w:t xml:space="preserve">. The v1.0.1 file must replace the earlier uploaded draft before the item is published.</w:t>
@@ -1182,8 +2206,8 @@
         <w:t xml:space="preserve">.</w:t>
       </w:r>
     </w:p>
-    <w:bookmarkEnd w:id="36"/>
-    <w:bookmarkStart w:id="38" w:name="file-organization"/>
+    <w:bookmarkEnd w:id="28"/>
+    <w:bookmarkStart w:id="30" w:name="file-organization"/>
     <w:p>
       <w:pPr>
         <w:pStyle w:val="Heading2"/>
@@ -1330,7 +2354,7 @@
           <w:rPr>
             <w:rStyle w:val="Hyperlink"/>
           </w:rPr>
-          <w:t xml:space="preserve">2</w:t>
+          <w:t xml:space="preserve">3</w:t>
         </w:r>
       </w:hyperlink>
       <w:r>
@@ -1340,7 +2364,7 @@
         <w:t xml:space="preserve">summarizes the directory-level organization.</w:t>
       </w:r>
     </w:p>
-    <w:bookmarkStart w:id="37" w:name="tab:archive-layout"/>
+    <w:bookmarkStart w:id="29" w:name="tab:archive-layout"/>
     <w:p>
       <w:pPr>
         <w:pStyle w:val="TableCaption"/>
@@ -1661,9 +2685,9 @@
         </w:tc>
       </w:tr>
     </w:tbl>
-    <w:bookmarkEnd w:id="37"/>
-    <w:bookmarkEnd w:id="38"/>
-    <w:bookmarkStart w:id="46" w:name="released-artifacts"/>
+    <w:bookmarkEnd w:id="29"/>
+    <w:bookmarkEnd w:id="30"/>
+    <w:bookmarkStart w:id="38" w:name="released-artifacts"/>
     <w:p>
       <w:pPr>
         <w:pStyle w:val="Heading2"/>
@@ -1684,7 +2708,7 @@
           <w:rPr>
             <w:rStyle w:val="Hyperlink"/>
           </w:rPr>
-          <w:t xml:space="preserve">3</w:t>
+          <w:t xml:space="preserve">4</w:t>
         </w:r>
       </w:hyperlink>
       <w:r>
@@ -1694,7 +2718,7 @@
         <w:t xml:space="preserve">identifies the principal machine-readable records and their roles.</w:t>
       </w:r>
     </w:p>
-    <w:bookmarkStart w:id="39" w:name="tab:composition"/>
+    <w:bookmarkStart w:id="31" w:name="tab:composition"/>
     <w:p>
       <w:pPr>
         <w:pStyle w:val="TableCaption"/>
@@ -2061,8 +3085,8 @@
         </w:tc>
       </w:tr>
     </w:tbl>
-    <w:bookmarkEnd w:id="39"/>
-    <w:bookmarkStart w:id="40" w:name="retained-candidate-branches-csv."/>
+    <w:bookmarkEnd w:id="31"/>
+    <w:bookmarkStart w:id="32" w:name="retained-candidate-branches-csv."/>
     <w:p>
       <w:pPr>
         <w:pStyle w:val="Heading4"/>
@@ -2085,7 +3109,7 @@
         <w:t xml:space="preserve">core_topology/at_interfacility_candidate_branches.csv</w:t>
       </w:r>
       <w:r>
-        <w:t xml:space="preserve">) is the principal branch-level record. Its 358 rows contain generated branch and circuit identifiers, endpoint facility identifiers and labels, voltage and status fields, geometry-derived length, segment count, source-line membership, confidence metadata, and explicit electrical placeholders. Fields ending in</w:t>
+        <w:t xml:space="preserve">) is the principal branch-level record. Its 358 rows contain generated branch and circuit identifiers, endpoint facility identifiers and labels, voltage and status fields, geometry-derived length, segment count, source-line membership, the rule-based</w:t>
       </w:r>
       <w:r>
         <w:t xml:space="preserve"> </w:t>
@@ -2094,6 +3118,21 @@
         <w:rPr>
           <w:rStyle w:val="VerbatimChar"/>
         </w:rPr>
+        <w:t xml:space="preserve">confidence_score</w:t>
+      </w:r>
+      <w:r>
+        <w:t xml:space="preserve"> </w:t>
+      </w:r>
+      <w:r>
+        <w:t xml:space="preserve">defined in Methods, and explicit electrical placeholders. Fields ending in</w:t>
+      </w:r>
+      <w:r>
+        <w:t xml:space="preserve"> </w:t>
+      </w:r>
+      <w:r>
+        <w:rPr>
+          <w:rStyle w:val="VerbatimChar"/>
+        </w:rPr>
         <w:t xml:space="preserve">_m</w:t>
       </w:r>
       <w:r>
@@ -2118,8 +3157,8 @@
         <w:t xml:space="preserve">use metres and kilometres, respectively. Missing electrical fields are not backfilled with model defaults.</w:t>
       </w:r>
     </w:p>
-    <w:bookmarkEnd w:id="40"/>
-    <w:bookmarkStart w:id="41" w:name="circuit-classification-ledger-csv."/>
+    <w:bookmarkEnd w:id="32"/>
+    <w:bookmarkStart w:id="33" w:name="circuit-classification-ledger-csv."/>
     <w:p>
       <w:pPr>
         <w:pStyle w:val="Heading4"/>
@@ -2145,8 +3184,8 @@
         <w:t xml:space="preserve">) contains all 1,342 merged circuit candidates, including the 358 retained records and 984 downgraded or rejected outcomes. Rows include construction-setting identifiers, terminal structure, facility membership, ambiguity and conflict indicators, source-line membership, disposition, and downgrade reason. The ledger exposes what was not retained and why.</w:t>
       </w:r>
     </w:p>
-    <w:bookmarkEnd w:id="41"/>
-    <w:bookmarkStart w:id="42" w:name="reconstruction-sensitivity-csv."/>
+    <w:bookmarkEnd w:id="33"/>
+    <w:bookmarkStart w:id="34" w:name="reconstruction-sensitivity-csv."/>
     <w:p>
       <w:pPr>
         <w:pStyle w:val="Heading4"/>
@@ -2184,8 +3223,8 @@
         <w:t xml:space="preserve">.</w:t>
       </w:r>
     </w:p>
-    <w:bookmarkEnd w:id="42"/>
-    <w:bookmarkStart w:id="43" w:name="graphml-multigraph."/>
+    <w:bookmarkEnd w:id="34"/>
+    <w:bookmarkStart w:id="35" w:name="graphml-multigraph."/>
     <w:p>
       <w:pPr>
         <w:pStyle w:val="Heading4"/>
@@ -2226,8 +3265,8 @@
         <w:t xml:space="preserve">edge identifiers and facility identifiers link the GraphML to the retained branch table and facility summaries. Parallel edges are preserved.</w:t>
       </w:r>
     </w:p>
-    <w:bookmarkEnd w:id="43"/>
-    <w:bookmarkStart w:id="44" w:name="validation-and-public-evidence-records."/>
+    <w:bookmarkEnd w:id="35"/>
+    <w:bookmarkStart w:id="36" w:name="validation-and-public-evidence-records."/>
     <w:p>
       <w:pPr>
         <w:pStyle w:val="Heading4"/>
@@ -2256,7 +3295,7 @@
         <w:t xml:space="preserve"> </w:t>
       </w:r>
       <w:r>
-        <w:t xml:space="preserve">directory contains the 25 internal checks and missingness report; endpoint-name and spatial-alignment negative-control records; branch-level OSM/OpenInfraMap concordance; a source-role audit; and a sanitized independence-risk audit. The</w:t>
+        <w:t xml:space="preserve">directory contains the 25 internal checks and missingness report; endpoint-name and spatial-alignment negative controls; branch-level OSM-derived concordance; a source-role audit; and a sanitized independence-risk audit. The</w:t>
       </w:r>
       <w:r>
         <w:t xml:space="preserve"> </w:t>
@@ -2271,11 +3310,11 @@
         <w:t xml:space="preserve"> </w:t>
       </w:r>
       <w:r>
-        <w:t xml:space="preserve">field links branch-level validation records to the retained branch table. Evidence categories and independence-risk fields are audit variables, not confirmed topology labels.</w:t>
-      </w:r>
-    </w:p>
-    <w:bookmarkEnd w:id="44"/>
-    <w:bookmarkStart w:id="45" w:name="metadata-and-manifests."/>
+        <w:t xml:space="preserve">field links these records to the retained branch table. Evidence and independence-risk categories are audit variables, not confirmed topology labels.</w:t>
+      </w:r>
+    </w:p>
+    <w:bookmarkEnd w:id="36"/>
+    <w:bookmarkStart w:id="37" w:name="metadata-and-manifests."/>
     <w:p>
       <w:pPr>
         <w:pStyle w:val="Heading4"/>
@@ -2352,9 +3391,9 @@
         <w:t xml:space="preserve">provides an independently checkable path–digest list.</w:t>
       </w:r>
     </w:p>
-    <w:bookmarkEnd w:id="45"/>
-    <w:bookmarkEnd w:id="46"/>
-    <w:bookmarkStart w:id="47" w:name="X1b441bc8825d4205e2695a1ab561ef77fea70bc"/>
+    <w:bookmarkEnd w:id="37"/>
+    <w:bookmarkEnd w:id="38"/>
+    <w:bookmarkStart w:id="39" w:name="X1b441bc8825d4205e2695a1ab561ef77fea70bc"/>
     <w:p>
       <w:pPr>
         <w:pStyle w:val="Heading2"/>
@@ -2406,7 +3445,31 @@
         <w:pStyle w:val="BodyText"/>
       </w:pPr>
       <w:r>
-        <w:t xml:space="preserve">Released geometries use GeoJSON-style WGS 84 coordinates (EPSG:4326) in longitude–latitude order. Endpoint clustering, facility distances, corridor distances, and length diagnostics use a pipeline-defined local equirectangular metric workspace centred at longitude</w:t>
+        <w:t xml:space="preserve">The topology inputs were retrieved through Opendatasoft v2.1 GeoJSON export routes without an</w:t>
+      </w:r>
+      <w:r>
+        <w:t xml:space="preserve"> </w:t>
+      </w:r>
+      <w:r>
+        <w:rPr>
+          <w:rStyle w:val="VerbatimChar"/>
+        </w:rPr>
+        <w:t xml:space="preserve">epsg</w:t>
+      </w:r>
+      <w:r>
+        <w:t xml:space="preserve"> </w:t>
+      </w:r>
+      <w:r>
+        <w:t xml:space="preserve">override; the documented default for geometry-capable exports is EPSG:4326</w:t>
+      </w:r>
+      <w:r>
+        <w:rPr>
+          <w:vertAlign w:val="superscript"/>
+        </w:rPr>
+        <w:t xml:space="preserve">11</w:t>
+      </w:r>
+      <w:r>
+        <w:t xml:space="preserve">. Released geometries therefore use GeoJSON-style WGS 84 coordinates (EPSG:4326) in longitude–latitude order. The native CRS before portal ingestion, if different, is not recorded and was not used by the reconstruction pipeline. Endpoint clustering, facility distances, corridor distances, and length diagnostics use a pipeline-defined local equirectangular metric workspace centred at longitude</w:t>
       </w:r>
       <w:r>
         <w:t xml:space="preserve"> </w:t>
@@ -2437,7 +3500,18 @@
         </m:r>
       </m:oMath>
       <w:r>
-        <w:t xml:space="preserve">; this workspace has no EPSG identifier. Voltage fields preserve file-specific source encodings. Common missing representations are empty strings, JSON</w:t>
+        <w:t xml:space="preserve">; this workspace has no EPSG identifier. The projection-error audit is described in Methods (Section </w:t>
+      </w:r>
+      <w:hyperlink w:anchor="sec:projection-error-audit">
+        <w:r>
+          <w:rPr>
+            <w:rStyle w:val="Hyperlink"/>
+          </w:rPr>
+          <w:t xml:space="preserve">[sec:projection-error-audit]</w:t>
+        </w:r>
+      </w:hyperlink>
+      <w:r>
+        <w:t xml:space="preserve">). Voltage fields preserve file-specific source encodings. Common missing representations are empty strings, JSON</w:t>
       </w:r>
       <w:r>
         <w:t xml:space="preserve"> </w:t>
@@ -2491,9 +3565,9 @@
         <w:t xml:space="preserve">and its JSON equivalent.</w:t>
       </w:r>
     </w:p>
-    <w:bookmarkEnd w:id="47"/>
-    <w:bookmarkEnd w:id="48"/>
-    <w:bookmarkStart w:id="57" w:name="data-overview"/>
+    <w:bookmarkEnd w:id="39"/>
+    <w:bookmarkEnd w:id="40"/>
+    <w:bookmarkStart w:id="49" w:name="data-overview"/>
     <w:p>
       <w:pPr>
         <w:pStyle w:val="Heading1"/>
@@ -2535,10 +3609,10 @@
         <w:t xml:space="preserve"> </w:t>
       </w:r>
       <w:r>
-        <w:t xml:space="preserve">reports aggregate graph structure. This overview describes the contents of the deposited files; it does not estimate the correctness or completeness of the physical Portuguese network.</w:t>
-      </w:r>
-    </w:p>
-    <w:bookmarkStart w:id="52" w:name="fig:funnel"/>
+        <w:t xml:space="preserve">shows geographic coverage and component structure. These figures describe deposited records rather than physical-network accuracy or completeness.</w:t>
+      </w:r>
+    </w:p>
+    <w:bookmarkStart w:id="44" w:name="fig:funnel"/>
     <w:p>
       <w:pPr>
         <w:pStyle w:val="CaptionedFigure"/>
@@ -2548,18 +3622,18 @@
           <wp:inline>
             <wp:extent cx="5334000" cy="2398353"/>
             <wp:effectExtent b="0" l="0" r="0" t="0"/>
-            <wp:docPr descr="" title="" id="50" name="Picture"/>
+            <wp:docPr descr="" title="" id="42" name="Picture"/>
             <a:graphic>
               <a:graphicData uri="http://schemas.openxmlformats.org/drawingml/2006/picture">
                 <pic:pic>
                   <pic:nvPicPr>
-                    <pic:cNvPr descr="fig2_reconstruction_funnel.png" id="51" name="Picture"/>
+                    <pic:cNvPr descr="fig2_reconstruction_funnel.png" id="43" name="Picture"/>
                     <pic:cNvPicPr>
                       <a:picLocks noChangeArrowheads="1" noChangeAspect="1"/>
                     </pic:cNvPicPr>
                   </pic:nvPicPr>
                   <pic:blipFill>
-                    <a:blip r:embed="rId49"/>
+                    <a:blip r:embed="rId41"/>
                     <a:stretch>
                       <a:fillRect/>
                     </a:stretch>
@@ -2594,8 +3668,8 @@
         <w:t xml:space="preserve">Record disposition for the selected reconstruction setting. The workflow processes 5,334 source line features into 1,342 circuit candidates, retains 358 inter-facility candidate branches, and preserves downgraded classes in the ledger. Retention denotes rule satisfaction under the documented workflow, not operator confirmation.</w:t>
       </w:r>
     </w:p>
-    <w:bookmarkEnd w:id="52"/>
-    <w:bookmarkStart w:id="56" w:name="fig:topology-quality"/>
+    <w:bookmarkEnd w:id="44"/>
+    <w:bookmarkStart w:id="48" w:name="fig:topology-quality"/>
     <w:p>
       <w:pPr>
         <w:pStyle w:val="CaptionedFigure"/>
@@ -2603,20 +3677,20 @@
       <w:r>
         <w:drawing>
           <wp:inline>
-            <wp:extent cx="5334000" cy="2560206"/>
+            <wp:extent cx="5116358" cy="3033728"/>
             <wp:effectExtent b="0" l="0" r="0" t="0"/>
-            <wp:docPr descr="" title="" id="54" name="Picture"/>
+            <wp:docPr descr="" title="" id="46" name="Picture"/>
             <a:graphic>
               <a:graphicData uri="http://schemas.openxmlformats.org/drawingml/2006/picture">
                 <pic:pic>
                   <pic:nvPicPr>
-                    <pic:cNvPr descr="fig3_topology_quality.png" id="55" name="Picture"/>
+                    <pic:cNvPr descr="fig3_topology_quality.png" id="47" name="Picture"/>
                     <pic:cNvPicPr>
                       <a:picLocks noChangeArrowheads="1" noChangeAspect="1"/>
                     </pic:cNvPicPr>
                   </pic:nvPicPr>
                   <pic:blipFill>
-                    <a:blip r:embed="rId53"/>
+                    <a:blip r:embed="rId45"/>
                     <a:stretch>
                       <a:fillRect/>
                     </a:stretch>
@@ -2624,7 +3698,7 @@
                   <pic:spPr bwMode="auto">
                     <a:xfrm>
                       <a:off x="0" y="0"/>
-                      <a:ext cx="5334000" cy="2560206"/>
+                      <a:ext cx="5116358" cy="3033728"/>
                     </a:xfrm>
                     <a:prstGeom prst="rect">
                       <a:avLst/>
@@ -2648,12 +3722,12 @@
         <w:pStyle w:val="ImageCaption"/>
       </w:pPr>
       <w:r>
-        <w:t xml:space="preserve">Aggregate structure of the selected candidate multigraph. Component sizes are shown on a logarithmic vertical scale and the degree histogram retains parallel edges. The figure describes the deposited graph artifact rather than the physical Portuguese network.</w:t>
-      </w:r>
-    </w:p>
-    <w:bookmarkEnd w:id="56"/>
-    <w:bookmarkEnd w:id="57"/>
-    <w:bookmarkStart w:id="73" w:name="technical-validation"/>
+        <w:t xml:space="preserve">Geographic distribution and component structure of the selected candidate graph. Panel a uses released EPSG:4326 coordinates without a basemap or facility labels; blue branches belong to the 53-facility largest component, gray branches to other components, green points are connected facilities, and orange crosses are isolates. Panel b ranks all 170 components on a logarithmic scale. The graph contains 484 facilities, 358 candidate branches, and 109 isolates; these are inferred records, not an operator-validated network.</w:t>
+      </w:r>
+    </w:p>
+    <w:bookmarkEnd w:id="48"/>
+    <w:bookmarkEnd w:id="49"/>
+    <w:bookmarkStart w:id="65" w:name="technical-validation"/>
     <w:p>
       <w:pPr>
         <w:pStyle w:val="Heading1"/>
@@ -2662,7 +3736,7 @@
         <w:t xml:space="preserve">Technical Validation</w:t>
       </w:r>
     </w:p>
-    <w:bookmarkStart w:id="58" w:name="internal-validation"/>
+    <w:bookmarkStart w:id="50" w:name="internal-validation"/>
     <w:p>
       <w:pPr>
         <w:pStyle w:val="Heading2"/>
@@ -2687,8 +3761,8 @@
         <w:t xml:space="preserve">Archive-level validation additionally checks that all 63 released files are documented, all manifest and checksum paths resolve, all 54 machine-readable paths have dictionary coverage, and the frozen headline counts agree with the core records. These results support internal usability of the deposited records, but they do not constitute external topology or electrical validation.</w:t>
       </w:r>
     </w:p>
-    <w:bookmarkEnd w:id="58"/>
-    <w:bookmarkStart w:id="59" w:name="structural-validation"/>
+    <w:bookmarkEnd w:id="50"/>
+    <w:bookmarkStart w:id="51" w:name="structural-validation"/>
     <w:p>
       <w:pPr>
         <w:pStyle w:val="Heading2"/>
@@ -2705,8 +3779,8 @@
         <w:t xml:space="preserve">Structural validation focuses on whether the reconstructed records satisfy the declared topology-building rules. Under the selected setting, the workflow converts 5,334 line features into 1,342 merged circuit candidates, of which 358 are retained and 984 are downgraded. The downgraded outcomes comprise 496 single-facility records, 215 isolated records, 106 tap or multi-terminal records, 101 self-loops, 61 ambiguous records, and five loop records for the current snapshot. Preservation of these downgraded classes is itself a validation feature because it prevents silent loss of evidence about reconstruction uncertainty.</w:t>
       </w:r>
     </w:p>
-    <w:bookmarkEnd w:id="59"/>
-    <w:bookmarkStart w:id="60" w:name="schema-validation"/>
+    <w:bookmarkEnd w:id="51"/>
+    <w:bookmarkStart w:id="52" w:name="schema-validation"/>
     <w:p>
       <w:pPr>
         <w:pStyle w:val="Heading2"/>
@@ -2740,11 +3814,11 @@
         <w:t xml:space="preserve">PASS_WITH_WARNINGS</w:t>
       </w:r>
       <w:r>
-        <w:t xml:space="preserve">: 23 checks pass and two checks are release-review warnings rather than data-consistency failures. The release geometry and processing workspace are now documented in Data Records, while the exact wording of the upstream portal CRS remains unverified. Clean-room extraction validation of the v1.0.1 archive reports no manifest, checksum, dictionary-coverage, or headline-count failures. The earlier v1.0.0 tag rebuild remains the evidence for byte-for-byte reconstruction from frozen derived inputs; a v1.0.1 tagged rebuild is still required, and raw/API reacquisition remains subject to the limitation stated in Usage Notes. The same export records 5,334 valid source geometries and zero invalid/dropped geometries; zero missing required retained-branch fields; zero missing required ledger fields; 358 retained branches; 984 downgraded or rejected records; 1,342 ledger rows; 64,008 endpoint-index rows across six snap thresholds; and 216 sensitivity rows.</w:t>
-      </w:r>
-    </w:p>
-    <w:bookmarkEnd w:id="60"/>
-    <w:bookmarkStart w:id="61" w:name="referential-integrity"/>
+        <w:t xml:space="preserve">: 24 checks pass and one release-review warning remains rather than a data-consistency failure. The EPSG:4326 portal-export and release CRS is documented in the Data Record; the remaining warning concerns clean-room equality for the v1.0.1 tagged rebuild. Clean-room extraction validation of the v1.0.1 archive reports no manifest, checksum, dictionary-coverage, or headline-count failures. The earlier v1.0.0 tag rebuild remains the evidence for byte-for-byte reconstruction from frozen derived inputs; a v1.0.1 tagged rebuild is still required, and raw/API reacquisition remains subject to the limitation stated in Usage Notes. The same export records 5,334 valid source geometries and zero invalid/dropped geometries; zero missing required retained-branch fields; zero missing required ledger fields; 358 retained branches; 984 downgraded or rejected records; 1,342 ledger rows; 64,008 endpoint-index rows across six snap thresholds; and 216 sensitivity rows.</w:t>
+      </w:r>
+    </w:p>
+    <w:bookmarkEnd w:id="52"/>
+    <w:bookmarkStart w:id="53" w:name="referential-integrity"/>
     <w:p>
       <w:pPr>
         <w:pStyle w:val="Heading2"/>
@@ -2761,8 +3835,8 @@
         <w:t xml:space="preserve">Referential checks confirm that endpoint facility references, GraphML node and edge identifiers, branch-level validation records, source manifests, and manifest-linked artifact relationships resolve to valid upstream records. Graph and table views are checked for parity so that the GraphML, retained branch table, and selected facility set remain consistent with the documented isolate policy.</w:t>
       </w:r>
     </w:p>
-    <w:bookmarkEnd w:id="61"/>
-    <w:bookmarkStart w:id="62" w:name="graph-consistency"/>
+    <w:bookmarkEnd w:id="53"/>
+    <w:bookmarkStart w:id="54" w:name="graph-consistency"/>
     <w:p>
       <w:pPr>
         <w:pStyle w:val="Heading2"/>
@@ -2835,8 +3909,8 @@
         <w:t xml:space="preserve">; these missing values are part of the release semantics rather than silent nulls.</w:t>
       </w:r>
     </w:p>
-    <w:bookmarkEnd w:id="62"/>
-    <w:bookmarkStart w:id="67" w:name="sensitivity-analysis"/>
+    <w:bookmarkEnd w:id="54"/>
+    <w:bookmarkStart w:id="59" w:name="sensitivity-analysis"/>
     <w:p>
       <w:pPr>
         <w:pStyle w:val="Heading2"/>
@@ -2875,7 +3949,7 @@
         <w:t xml:space="preserve">shows these trade-offs and the selected operating point. These results support the claim that reconstruction outputs are sensitive to plausible preprocessing settings rather than identifying a uniquely correct solution.</w:t>
       </w:r>
     </w:p>
-    <w:bookmarkStart w:id="66" w:name="fig:sensitivity"/>
+    <w:bookmarkStart w:id="58" w:name="fig:sensitivity"/>
     <w:p>
       <w:pPr>
         <w:pStyle w:val="CaptionedFigure"/>
@@ -2885,18 +3959,18 @@
           <wp:inline>
             <wp:extent cx="5334000" cy="4585018"/>
             <wp:effectExtent b="0" l="0" r="0" t="0"/>
-            <wp:docPr descr="" title="" id="64" name="Picture"/>
+            <wp:docPr descr="" title="" id="56" name="Picture"/>
             <a:graphic>
               <a:graphicData uri="http://schemas.openxmlformats.org/drawingml/2006/picture">
                 <pic:pic>
                   <pic:nvPicPr>
-                    <pic:cNvPr descr="fig4_sensitivity_analysis.png" id="65" name="Picture"/>
+                    <pic:cNvPr descr="fig4_sensitivity_analysis.png" id="57" name="Picture"/>
                     <pic:cNvPicPr>
                       <a:picLocks noChangeArrowheads="1" noChangeAspect="1"/>
                     </pic:cNvPicPr>
                   </pic:nvPicPr>
                   <pic:blipFill>
-                    <a:blip r:embed="rId63"/>
+                    <a:blip r:embed="rId55"/>
                     <a:stretch>
                       <a:fillRect/>
                     </a:stretch>
@@ -2931,9 +4005,9 @@
         <w:t xml:space="preserve">Sensitivity of retained-branch counts, ambiguity, and graph connectivity to facility buffers and endpoint snap thresholds. The marked operating point indicates the documented selected setting for the release; it is not an externally calibrated optimum.</w:t>
       </w:r>
     </w:p>
-    <w:bookmarkEnd w:id="66"/>
-    <w:bookmarkEnd w:id="67"/>
-    <w:bookmarkStart w:id="69" w:name="external-triangulation"/>
+    <w:bookmarkEnd w:id="58"/>
+    <w:bookmarkEnd w:id="59"/>
+    <w:bookmarkStart w:id="61" w:name="external-triangulation"/>
     <w:p>
       <w:pPr>
         <w:pStyle w:val="Heading2"/>
@@ -2947,7 +4021,16 @@
         <w:pStyle w:val="FirstParagraph"/>
       </w:pPr>
       <w:r>
-        <w:t xml:space="preserve">The external triangulation workflow searches for branch-level public evidence outside the selected reconstruction rule. The current implementation uses OpenStreetMap/OpenInfraMap 60 kV</w:t>
+        <w:t xml:space="preserve">The external triangulation workflow searches for OSM-derived branch-level evidence outside the selected reconstruction rule. OpenInfraMap is used only to visualize OSM infrastructure data where applicable; it is not treated as an independent second topology source</w:t>
+      </w:r>
+      <w:r>
+        <w:rPr>
+          <w:vertAlign w:val="superscript"/>
+        </w:rPr>
+        <w:t xml:space="preserve">12,13</w:t>
+      </w:r>
+      <w:r>
+        <w:t xml:space="preserve">. The matcher parses 60 kV OSM</w:t>
       </w:r>
       <w:r>
         <w:t xml:space="preserve"> </w:t>
@@ -2977,16 +4060,7 @@
         <w:t xml:space="preserve"> </w:t>
       </w:r>
       <w:r>
-        <w:t xml:space="preserve">records in Portugal</w:t>
-      </w:r>
-      <w:r>
-        <w:t xml:space="preserve"> </w:t>
-      </w:r>
-      <w:r>
-        <w:t xml:space="preserve">(OpenStreetMap contributors 2026; OpenInfraMap contributors 2026)</w:t>
-      </w:r>
-      <w:r>
-        <w:t xml:space="preserve">, parses voltage, operator, name, reference, circuit, and geometry fields, and compares each retained branch by endpoint-name overlap and corridor proximity. A name score must be at least 0.8. Strong spatial evidence requires minimum distance no greater than 250 m, median branch-to-OSM distance no greater than 500 m, and branch or OSM coverage of at least 0.5 within 500 m; weak proximity is limited to 1,000 m. The operator condition requires a normalized tag containing</w:t>
+        <w:t xml:space="preserve">voltage, operator, name, reference, circuit, and geometry fields. A name score must be at least 0.8. Strong spatial evidence requires minimum distance no greater than 250 m, median branch-to-OSM distance no greater than 500 m, and branch or OSM coverage of at least 0.5 within 500 m; weak proximity is limited to 1,000 m. An operator-tag condition requires normalized text containing</w:t>
       </w:r>
       <w:r>
         <w:t xml:space="preserve"> </w:t>
@@ -2998,16 +4072,16 @@
         <w:t xml:space="preserve">e redes</w:t>
       </w:r>
       <w:r>
-        <w:t xml:space="preserve">.</w:t>
-      </w:r>
-    </w:p>
-    <w:bookmarkStart w:id="68" w:name="tab:osm-triangulation"/>
+        <w:t xml:space="preserve">, but that user-contributed tag is not operator confirmation.</w:t>
+      </w:r>
+    </w:p>
+    <w:bookmarkStart w:id="60" w:name="tab:osm-triangulation"/>
     <w:p>
       <w:pPr>
         <w:pStyle w:val="TableCaption"/>
       </w:pPr>
       <w:r>
-        <w:t xml:space="preserve">OSM/OpenInfraMap public-source triangulation for the 358 retained candidate branches. Categories describe review-prioritization evidence, not truth labels.</w:t>
+        <w:t xml:space="preserve">OSM-derived public-evidence categories for the 358 retained candidate branches. OpenInfraMap visualizes the same underlying OSM data where used; categories are review-prioritization evidence, not truth labels. Machine category codes remain in the deposited validation table.</w:t>
       </w:r>
     </w:p>
     <w:tbl>
@@ -3015,7 +4089,7 @@
         <w:tblStyle w:val="Table"/>
         <w:tblW w:type="auto" w:w="0"/>
         <w:tblLook w:firstRow="1" w:lastRow="0" w:firstColumn="0" w:lastColumn="0" w:noHBand="0" w:noVBand="0" w:val="0020"/>
-        <w:tblCaption w:val="OSM/OpenInfraMap public-source triangulation for the 358 retained candidate branches. Categories describe review-prioritization evidence, not truth labels."/>
+        <w:tblCaption w:val="OSM-derived public-evidence categories for the 358 retained candidate branches. OpenInfraMap visualizes the same underlying OSM data where used; categories are review-prioritization evidence, not truth labels. Machine category codes remain in the deposited validation table."/>
       </w:tblPr>
       <w:tblGrid>
         <w:gridCol w:w="2640"/>
@@ -3072,10 +4146,7 @@
               <w:jc w:val="left"/>
             </w:pPr>
             <w:r>
-              <w:rPr>
-                <w:smallCaps/>
-              </w:rPr>
-              <w:t xml:space="preserve">OSM_NAME_OPERATOR_STRONG</w:t>
+              <w:t xml:space="preserve">Strong endpoint-name and operator-tag evidence</w:t>
             </w:r>
           </w:p>
         </w:tc>
@@ -3099,7 +4170,7 @@
               <w:jc w:val="left"/>
             </w:pPr>
             <w:r>
-              <w:t xml:space="preserve">Endpoint names appear in a 60 kV E-REDES-labelled OSM record.</w:t>
+              <w:t xml:space="preserve">Both endpoint names appear in an E-REDES-tagged OSM record.</w:t>
             </w:r>
           </w:p>
         </w:tc>
@@ -3113,10 +4184,7 @@
               <w:jc w:val="left"/>
             </w:pPr>
             <w:r>
-              <w:rPr>
-                <w:smallCaps/>
-              </w:rPr>
-              <w:t xml:space="preserve">OSM_GEOMETRY_OPERATOR_STRONG</w:t>
+              <w:t xml:space="preserve">Strong corridor and operator-tag evidence</w:t>
             </w:r>
           </w:p>
         </w:tc>
@@ -3140,7 +4208,7 @@
               <w:jc w:val="left"/>
             </w:pPr>
             <w:r>
-              <w:t xml:space="preserve">Candidate corridor is close to a 60 kV E-REDES-labelled OSM corridor.</w:t>
+              <w:t xml:space="preserve">Candidate corridor is close to an E-REDES-tagged OSM corridor.</w:t>
             </w:r>
           </w:p>
         </w:tc>
@@ -3154,10 +4222,7 @@
               <w:jc w:val="left"/>
             </w:pPr>
             <w:r>
-              <w:rPr>
-                <w:smallCaps/>
-              </w:rPr>
-              <w:t xml:space="preserve">OSM_PARTIAL_NAME_NEARBY</w:t>
+              <w:t xml:space="preserve">Partial endpoint name with nearby corridor</w:t>
             </w:r>
           </w:p>
         </w:tc>
@@ -3195,10 +4260,7 @@
               <w:jc w:val="left"/>
             </w:pPr>
             <w:r>
-              <w:rPr>
-                <w:smallCaps/>
-              </w:rPr>
-              <w:t xml:space="preserve">OSM_GEOMETRY_MEDIUM</w:t>
+              <w:t xml:space="preserve">Medium corridor-overlap evidence</w:t>
             </w:r>
           </w:p>
         </w:tc>
@@ -3222,7 +4284,7 @@
               <w:jc w:val="left"/>
             </w:pPr>
             <w:r>
-              <w:t xml:space="preserve">Candidate overlaps a 60 kV public corridor without strong name evidence.</w:t>
+              <w:t xml:space="preserve">Candidate overlaps a 60 kV OSM corridor without strong name evidence.</w:t>
             </w:r>
           </w:p>
         </w:tc>
@@ -3236,10 +4298,7 @@
               <w:jc w:val="left"/>
             </w:pPr>
             <w:r>
-              <w:rPr>
-                <w:smallCaps/>
-              </w:rPr>
-              <w:t xml:space="preserve">OSM_NEARBY_WEAK</w:t>
+              <w:t xml:space="preserve">Weak nearby-feature evidence</w:t>
             </w:r>
           </w:p>
         </w:tc>
@@ -3263,7 +4322,7 @@
               <w:jc w:val="left"/>
             </w:pPr>
             <w:r>
-              <w:t xml:space="preserve">A nearby 60 kV public feature is present, but evidence is incomplete.</w:t>
+              <w:t xml:space="preserve">A nearby 60 kV OSM feature is present, but evidence is incomplete.</w:t>
             </w:r>
           </w:p>
         </w:tc>
@@ -3277,10 +4336,7 @@
               <w:jc w:val="left"/>
             </w:pPr>
             <w:r>
-              <w:rPr>
-                <w:smallCaps/>
-              </w:rPr>
-              <w:t xml:space="preserve">NO_EXTERNAL_OSM_MATCH</w:t>
+              <w:t xml:space="preserve">No matched OSM-derived evidence</w:t>
             </w:r>
           </w:p>
         </w:tc>
@@ -3310,7 +4366,7 @@
         </w:tc>
       </w:tr>
     </w:tbl>
-    <w:bookmarkEnd w:id="68"/>
+    <w:bookmarkEnd w:id="60"/>
     <w:p>
       <w:pPr>
         <w:pStyle w:val="BodyText"/>
@@ -3323,18 +4379,18 @@
           <w:rPr>
             <w:rStyle w:val="Hyperlink"/>
           </w:rPr>
-          <w:t xml:space="preserve">4</w:t>
+          <w:t xml:space="preserve">5</w:t>
         </w:r>
       </w:hyperlink>
       <w:r>
         <w:t xml:space="preserve"> </w:t>
       </w:r>
       <w:r>
-        <w:t xml:space="preserve">gives the category counts. For the current snapshot, 5,551 Portuguese 60 kV public ways were evaluated and all 358 retained candidate branches receive a non-empty public-evidence category, with 247 strong, 104 medium, and seven weak matches. This result provides public-source concordance and a branch-level evidence index. It does not establish operator validation or branch accuracy, because OSM coverage and tagging are non-authoritative. The internal independence audit inspected histories for the 271 unique matched OSM ways, covering 2,326 historical versions, and classifies 266 retained branches as having more-independent public evidence, 87 as unknown independence, and five as possibly same-source. The public archive contains only summary counts, evidence tables, and a sanitized branch-level audit; raw caches, user identifiers, changesets, and element-history dumps are excluded. These categories must not be interpreted as precision, recall, or confirmation of every retained branch.</w:t>
-      </w:r>
-    </w:p>
-    <w:bookmarkEnd w:id="69"/>
-    <w:bookmarkStart w:id="71" w:name="claim-bounded-validation-strategy"/>
+        <w:t xml:space="preserve">gives the category counts. Among 5,551 Portuguese 60 kV OSM ways, all 358 retained branches receive a non-empty evidence category: 247 strong, 104 medium, and seven weak. Complete category coverage is a matcher output, not independent external validation. The audit inspected 2,326 historical versions of 271 matched OSM ways and classifies 266 branches as lower provenance risk, 87 as unknown independence, and five as possibly same-source. OSM and E-REDES source independence cannot be established from these histories; the audit assesses risk rather than proving independence. The archive includes sanitized evidence tables but excludes raw caches, user identifiers, changesets, and history dumps.</w:t>
+      </w:r>
+    </w:p>
+    <w:bookmarkEnd w:id="61"/>
+    <w:bookmarkStart w:id="63" w:name="claim-bounded-validation-strategy"/>
     <w:p>
       <w:pPr>
         <w:pStyle w:val="Heading2"/>
@@ -3348,7 +4404,7 @@
         <w:pStyle w:val="FirstParagraph"/>
       </w:pPr>
       <w:r>
-        <w:t xml:space="preserve">The release does not use human-adjudicated truth labels and does not report an accuracy metric. The validation argument is deliberately claim-bounded. Internal tests establish that the released records satisfy their declared schema, classification, provenance, and graph contracts. The 216-setting sweep quantifies sensitivity to reconstruction choices. The external comparison records concordance with a separately maintained public geospatial layer while preserving the evidence category and source caveat for every retained branch. Together, these tests support reproducibility, internal consistency, sensitivity transparency, and public-source triangulation; they do not support a claim that the inferred connections reproduce the operator’s true network.</w:t>
+        <w:t xml:space="preserve">The release has no human-adjudicated truth labels and reports no accuracy metric. Internal tests establish declared schema, classification, provenance, and graph contracts; the 216-setting sweep quantifies design sensitivity; and the OSM-derived comparison records public concordance with source caveats. Together these tests support internal consistency, sensitivity transparency, and reuse from frozen derived inputs, not correspondence with the operator’s true network.</w:t>
       </w:r>
     </w:p>
     <w:p>
@@ -3383,7 +4439,7 @@
           <w:rPr>
             <w:rStyle w:val="Hyperlink"/>
           </w:rPr>
-          <w:t xml:space="preserve">5</w:t>
+          <w:t xml:space="preserve">6</w:t>
         </w:r>
       </w:hyperlink>
       <w:r>
@@ -3393,7 +4449,7 @@
         <w:t xml:space="preserve">states the supported and excluded interpretation for each validation layer.</w:t>
       </w:r>
     </w:p>
-    <w:bookmarkStart w:id="70" w:name="tab:claim-bounded-validation"/>
+    <w:bookmarkStart w:id="62" w:name="tab:claim-bounded-validation"/>
     <w:p>
       <w:pPr>
         <w:pStyle w:val="TableCaption"/>
@@ -3590,31 +4646,31 @@
               <w:jc w:val="left"/>
             </w:pPr>
             <w:r>
-              <w:t xml:space="preserve">OSM/OpenInfraMap triangulation</w:t>
-            </w:r>
-          </w:p>
-        </w:tc>
-        <w:tc>
-          <w:tcPr/>
-          <w:p>
-            <w:pPr>
-              <w:pStyle w:val="Compact"/>
-              <w:jc w:val="left"/>
-            </w:pPr>
-            <w:r>
-              <w:t xml:space="preserve">Public-source name and corridor concordance</w:t>
-            </w:r>
-          </w:p>
-        </w:tc>
-        <w:tc>
-          <w:tcPr/>
-          <w:p>
-            <w:pPr>
-              <w:pStyle w:val="Compact"/>
-              <w:jc w:val="left"/>
-            </w:pPr>
-            <w:r>
-              <w:t xml:space="preserve">Operator validation or statistical accuracy</w:t>
+              <w:t xml:space="preserve">OSM-derived public evidence</w:t>
+            </w:r>
+          </w:p>
+        </w:tc>
+        <w:tc>
+          <w:tcPr/>
+          <w:p>
+            <w:pPr>
+              <w:pStyle w:val="Compact"/>
+              <w:jc w:val="left"/>
+            </w:pPr>
+            <w:r>
+              <w:t xml:space="preserve">Public name and corridor concordance</w:t>
+            </w:r>
+          </w:p>
+        </w:tc>
+        <w:tc>
+          <w:tcPr/>
+          <w:p>
+            <w:pPr>
+              <w:pStyle w:val="Compact"/>
+              <w:jc w:val="left"/>
+            </w:pPr>
+            <w:r>
+              <w:t xml:space="preserve">Independent validation or statistical accuracy</w:t>
             </w:r>
           </w:p>
         </w:tc>
@@ -3658,23 +4714,239 @@
         </w:tc>
       </w:tr>
     </w:tbl>
+    <w:bookmarkEnd w:id="62"/>
+    <w:p>
+      <w:pPr>
+        <w:pStyle w:val="BodyText"/>
+      </w:pPr>
+      <w:r>
+        <w:t xml:space="preserve">Two deterministic controls test matcher selectivity on all 358 branches. With geometry and branch attributes fixed, a length-stratified cyclic shift of endpoint-name pairs (seed 20260714) reduces strong name evidence from 183 to 9 branches (95.1%). With names and attributes fixed, translation by</w:t>
+      </w:r>
+      <w:r>
+        <w:t xml:space="preserve"> </w:t>
+      </w:r>
+      <m:oMath>
+        <m:r>
+          <m:rPr>
+            <m:sty m:val="p"/>
+          </m:rPr>
+          <m:t>+</m:t>
+        </m:r>
+        <m:sSup>
+          <m:e>
+            <m:r>
+              <m:t>1.75</m:t>
+            </m:r>
+          </m:e>
+          <m:sup>
+            <m:r>
+              <m:rPr>
+                <m:sty m:val="p"/>
+              </m:rPr>
+              <m:t>∘</m:t>
+            </m:r>
+          </m:sup>
+        </m:sSup>
+      </m:oMath>
+      <w:r>
+        <w:t xml:space="preserve"> </w:t>
+      </w:r>
+      <w:r>
+        <w:t xml:space="preserve">longitude and</w:t>
+      </w:r>
+      <w:r>
+        <w:t xml:space="preserve"> </w:t>
+      </w:r>
+      <m:oMath>
+        <m:r>
+          <m:rPr>
+            <m:sty m:val="p"/>
+          </m:rPr>
+          <m:t>+</m:t>
+        </m:r>
+        <m:sSup>
+          <m:e>
+            <m:r>
+              <m:t>0.85</m:t>
+            </m:r>
+          </m:e>
+          <m:sup>
+            <m:r>
+              <m:rPr>
+                <m:sty m:val="p"/>
+              </m:rPr>
+              <m:t>∘</m:t>
+            </m:r>
+          </m:sup>
+        </m:sSup>
+      </m:oMath>
+      <w:r>
+        <w:t xml:space="preserve"> </w:t>
+      </w:r>
+      <w:r>
+        <w:t xml:space="preserve">latitude leaves all geometries valid but reduces corridor evidence from 290 to 1 branch (99.7%). These controls test the name and corridor channels; they do not estimate topology accuracy.</w:t>
+      </w:r>
+    </w:p>
+    <w:bookmarkEnd w:id="63"/>
+    <w:bookmarkStart w:id="64" w:name="validation-boundaries"/>
+    <w:p>
+      <w:pPr>
+        <w:pStyle w:val="Heading2"/>
+      </w:pPr>
+      <w:r>
+        <w:t xml:space="preserve">Validation boundaries</w:t>
+      </w:r>
+    </w:p>
+    <w:p>
+      <w:pPr>
+        <w:pStyle w:val="FirstParagraph"/>
+      </w:pPr>
+      <w:r>
+        <w:t xml:space="preserve">Optional electrical-readiness artifacts remain diagnostic because branch parameters, transformer details, controls, measured injections, and verified boundaries are incomplete or scenario-derived. The AC power-flow extension remains outside the validated core dataset.</w:t>
+      </w:r>
+    </w:p>
+    <w:bookmarkEnd w:id="64"/>
+    <w:bookmarkEnd w:id="65"/>
+    <w:bookmarkStart w:id="72" w:name="usage-notes"/>
+    <w:p>
+      <w:pPr>
+        <w:pStyle w:val="Heading1"/>
+      </w:pPr>
+      <w:r>
+        <w:t xml:space="preserve">Usage Notes</w:t>
+      </w:r>
+    </w:p>
+    <w:bookmarkStart w:id="66" w:name="intended-uses"/>
+    <w:p>
+      <w:pPr>
+        <w:pStyle w:val="Heading2"/>
+      </w:pPr>
+      <w:r>
+        <w:t xml:space="preserve">Intended uses</w:t>
+      </w:r>
+    </w:p>
+    <w:p>
+      <w:pPr>
+        <w:pStyle w:val="FirstParagraph"/>
+      </w:pPr>
+      <w:r>
+        <w:t xml:space="preserve">The core release is intended for topology-reconstruction studies, geospatial data integration, provenance-aware network analysis, uncertainty analysis, dataset-engineering experiments, and development of downstream graph or tabular interfaces that preserve release semantics. The retained branch table and circuit-classification ledger should be used together whenever a study depends on understanding what was retained, what was downgraded, and why.</w:t>
+      </w:r>
+    </w:p>
+    <w:bookmarkEnd w:id="66"/>
+    <w:bookmarkStart w:id="67" w:name="non-intended-uses"/>
+    <w:p>
+      <w:pPr>
+        <w:pStyle w:val="Heading2"/>
+      </w:pPr>
+      <w:r>
+        <w:t xml:space="preserve">Non-intended uses</w:t>
+      </w:r>
+    </w:p>
+    <w:p>
+      <w:pPr>
+        <w:pStyle w:val="FirstParagraph"/>
+      </w:pPr>
+      <w:r>
+        <w:t xml:space="preserve">The release is not intended for operational switching studies, protection analysis, security assessment, contingency analysis, congestion forecasting, infrastructure-targeting applications, emergency operations, asset-condition assessment, commercial network-capacity claims, regulatory network-capacity claims, or claims about the actual Portuguese grid. The candidate topology should not be described as operator-validated, and the optional diagnostic electrical and learning layers should not be described as measured system behavior.</w:t>
+      </w:r>
+    </w:p>
+    <w:bookmarkEnd w:id="67"/>
+    <w:bookmarkStart w:id="68" w:name="Xe8ef5dbe3d475aa708068de72ee1876c29669b6"/>
+    <w:p>
+      <w:pPr>
+        <w:pStyle w:val="Heading2"/>
+      </w:pPr>
+      <w:r>
+        <w:t xml:space="preserve">Reading provenance and semantic status fields</w:t>
+      </w:r>
+    </w:p>
+    <w:p>
+      <w:pPr>
+        <w:pStyle w:val="FirstParagraph"/>
+      </w:pPr>
+      <w:r>
+        <w:t xml:space="preserve">Users should read semantic status fields before aggregating or modeling the records. Observed, derived, inferred, source-backed, scenario-assumed, benchmark-only, proxy, and missing fields represent distinct evidence types. Studies that require source-backed physical parameters or operator-confirmed connectivity should filter the release accordingly and should not treat inferred or scenario-derived fields as interchangeable with observations.</w:t>
+      </w:r>
+    </w:p>
+    <w:bookmarkEnd w:id="68"/>
+    <w:bookmarkStart w:id="69" w:name="how-to-use-graphml"/>
+    <w:p>
+      <w:pPr>
+        <w:pStyle w:val="Heading2"/>
+      </w:pPr>
+      <w:r>
+        <w:t xml:space="preserve">How to use GraphML</w:t>
+      </w:r>
+    </w:p>
+    <w:p>
+      <w:pPr>
+        <w:pStyle w:val="FirstParagraph"/>
+      </w:pPr>
+      <w:r>
+        <w:t xml:space="preserve">The GraphML is the most direct representation of the released candidate multigraph for graph analysis. It preserves the selected all-facility node set, including isolates, and therefore aligns with the documented component and degree summaries. Users comparing the GraphML with edge-induced views should account for the explicit isolate policy. Parallel edges are part of the released graph structure and should not be collapsed without documenting the transformation.</w:t>
+      </w:r>
+    </w:p>
+    <w:bookmarkEnd w:id="69"/>
+    <w:bookmarkStart w:id="70" w:name="how-to-use-csv-records"/>
+    <w:p>
+      <w:pPr>
+        <w:pStyle w:val="Heading2"/>
+      </w:pPr>
+      <w:r>
+        <w:t xml:space="preserve">How to use CSV records</w:t>
+      </w:r>
+    </w:p>
+    <w:p>
+      <w:pPr>
+        <w:pStyle w:val="FirstParagraph"/>
+      </w:pPr>
+      <w:r>
+        <w:t xml:space="preserve">The retained candidate branch CSV is the preferred branch-level topology table. The circuit-classification ledger should be consulted whenever a downstream workflow depends on failure modes, ambiguity, or alternative selection rules. Validation CSV and JSON records document evidence categories, matcher controls, independence-risk categories, missingness, and archive-validation relationships. The six recommended joins in</w:t>
+      </w:r>
+      <w:r>
+        <w:t xml:space="preserve"> </w:t>
+      </w:r>
+      <w:r>
+        <w:rPr>
+          <w:rStyle w:val="VerbatimChar"/>
+        </w:rPr>
+        <w:t xml:space="preserve">schema/join_relationships.csv</w:t>
+      </w:r>
+      <w:r>
+        <w:t xml:space="preserve"> </w:t>
+      </w:r>
+      <w:r>
+        <w:t xml:space="preserve">should be used in preference to name-based joins.</w:t>
+      </w:r>
+    </w:p>
     <w:bookmarkEnd w:id="70"/>
-    <w:p>
-      <w:pPr>
-        <w:pStyle w:val="BodyText"/>
-      </w:pPr>
-      <w:r>
-        <w:t xml:space="preserve">Two deterministic negative controls test whether the public-source matcher responds to deliberately broken evidence channels. First, an endpoint-name control was run on all 358 retained branches. The control keeps each branch geometry, voltage, status, length, confidence score, and branch identifier fixed, but replaces the endpoint-name pair with a length-stratified cyclic shift from another retained branch using seed 20260714. Under the unmodified endpoint names, 183 of 358 branches receive strong name-based OSM/OpenInfraMap evidence. Under corrupted endpoint names, this falls to 9 of 358 branches, a 95.1% relative reduction. Second, a spatial-alignment control keeps endpoint names and tabular branch attributes fixed but translates every branch geometry by +1.75 degrees longitude and +0.85 degrees latitude. All 358 transformed geometries remain valid and no records are excluded after transformation. Under the unmodified geometries, 290 of 358 branches satisfy the corridor-evidence criterion; under displaced geometries, this falls to 1 of 358 branches, a 99.7% relative reduction. These controls support the selectivity of the endpoint-name and corridor components of the matcher. They do not estimate topology accuracy, precision, recall, or operator validation.</w:t>
+    <w:bookmarkStart w:id="71" w:name="limitations"/>
+    <w:p>
+      <w:pPr>
+        <w:pStyle w:val="Heading2"/>
+      </w:pPr>
+      <w:r>
+        <w:t xml:space="preserve">Limitations</w:t>
+      </w:r>
+    </w:p>
+    <w:p>
+      <w:pPr>
+        <w:pStyle w:val="FirstParagraph"/>
+      </w:pPr>
+      <w:r>
+        <w:t xml:space="preserve">The release has four main limitations. First, it is a candidate topology derived from public E-REDES records rather than an operator-confirmed network model. Second, external triangulation provides public-source concordance categories rather than truth labels: precision is not independently estimated, and national or real-network recall cannot be estimated from the available records. Third, electrical parameters, transformer details, operating controls, and injections are incomplete or absent, so the release is not AC power-flow or OPF ready. Fourth, the DOI archive preserves the versioned derived dataset but not the raw E-REDES snapshots. Source identifiers, URLs, access timestamps, roles, and attribution are recorded, but the three topology-critical v2.1 export URLs returned HTTP 404 during the final clean-room reacquisition audit; raw/API-to-release byte reproduction is therefore not claimed.</w:t>
       </w:r>
     </w:p>
     <w:bookmarkEnd w:id="71"/>
-    <w:bookmarkStart w:id="72" w:name="validation-boundaries"/>
-    <w:p>
-      <w:pPr>
-        <w:pStyle w:val="Heading2"/>
-      </w:pPr>
-      <w:r>
-        <w:t xml:space="preserve">Validation boundaries</w:t>
+    <w:bookmarkEnd w:id="72"/>
+    <w:bookmarkStart w:id="73" w:name="data-availability"/>
+    <w:p>
+      <w:pPr>
+        <w:pStyle w:val="Heading1"/>
+      </w:pPr>
+      <w:r>
+        <w:t xml:space="preserve">Data Availability</w:t>
       </w:r>
     </w:p>
     <w:p>
@@ -3682,158 +4954,6 @@
         <w:pStyle w:val="FirstParagraph"/>
       </w:pPr>
       <w:r>
-        <w:t xml:space="preserve">The current validation evidence supports internal consistency, release transparency, sensitivity analysis, and public-source triangulation. It does not support claims of operator-confirmed topology accuracy, independently estimated branch precision, national-grid recall or completeness, or electrical-operating realism. Optional electrical-readiness artifacts remain diagnostic because branch-specific parameters, transformer details, control states, measured injections, and verified boundaries are incomplete or scenario-derived. The full diagnostic AC power-flow extension therefore remains outside the validated core dataset and should not be used to imply AC power-flow or OPF readiness.</w:t>
-      </w:r>
-    </w:p>
-    <w:bookmarkEnd w:id="72"/>
-    <w:bookmarkEnd w:id="73"/>
-    <w:bookmarkStart w:id="80" w:name="usage-notes"/>
-    <w:p>
-      <w:pPr>
-        <w:pStyle w:val="Heading1"/>
-      </w:pPr>
-      <w:r>
-        <w:t xml:space="preserve">Usage Notes</w:t>
-      </w:r>
-    </w:p>
-    <w:bookmarkStart w:id="74" w:name="intended-uses"/>
-    <w:p>
-      <w:pPr>
-        <w:pStyle w:val="Heading2"/>
-      </w:pPr>
-      <w:r>
-        <w:t xml:space="preserve">Intended uses</w:t>
-      </w:r>
-    </w:p>
-    <w:p>
-      <w:pPr>
-        <w:pStyle w:val="FirstParagraph"/>
-      </w:pPr>
-      <w:r>
-        <w:t xml:space="preserve">The core release is intended for topology-reconstruction studies, geospatial data integration, provenance-aware network analysis, uncertainty analysis, dataset-engineering experiments, and development of downstream graph or tabular interfaces that preserve release semantics. The retained branch table and circuit-classification ledger should be used together whenever a study depends on understanding what was retained, what was downgraded, and why.</w:t>
-      </w:r>
-    </w:p>
-    <w:bookmarkEnd w:id="74"/>
-    <w:bookmarkStart w:id="75" w:name="non-intended-uses"/>
-    <w:p>
-      <w:pPr>
-        <w:pStyle w:val="Heading2"/>
-      </w:pPr>
-      <w:r>
-        <w:t xml:space="preserve">Non-intended uses</w:t>
-      </w:r>
-    </w:p>
-    <w:p>
-      <w:pPr>
-        <w:pStyle w:val="FirstParagraph"/>
-      </w:pPr>
-      <w:r>
-        <w:t xml:space="preserve">The release is not intended for operational switching studies, protection analysis, security assessment, contingency analysis, congestion forecasting, infrastructure-targeting applications, emergency operations, asset-condition assessment, commercial network-capacity claims, regulatory network-capacity claims, or claims about the actual Portuguese grid. The candidate topology should not be described as operator-validated, and the optional diagnostic electrical and learning layers should not be described as measured system behavior.</w:t>
-      </w:r>
-    </w:p>
-    <w:bookmarkEnd w:id="75"/>
-    <w:bookmarkStart w:id="76" w:name="Xe8ef5dbe3d475aa708068de72ee1876c29669b6"/>
-    <w:p>
-      <w:pPr>
-        <w:pStyle w:val="Heading2"/>
-      </w:pPr>
-      <w:r>
-        <w:t xml:space="preserve">Reading provenance and semantic status fields</w:t>
-      </w:r>
-    </w:p>
-    <w:p>
-      <w:pPr>
-        <w:pStyle w:val="FirstParagraph"/>
-      </w:pPr>
-      <w:r>
-        <w:t xml:space="preserve">Users should read semantic status fields before aggregating or modeling the records. Observed, derived, inferred, source-backed, scenario-assumed, benchmark-only, proxy, and missing fields represent distinct evidence types. Studies that require source-backed physical parameters or operator-confirmed connectivity should filter the release accordingly and should not treat inferred or scenario-derived fields as interchangeable with observations.</w:t>
-      </w:r>
-    </w:p>
-    <w:bookmarkEnd w:id="76"/>
-    <w:bookmarkStart w:id="77" w:name="how-to-use-graphml"/>
-    <w:p>
-      <w:pPr>
-        <w:pStyle w:val="Heading2"/>
-      </w:pPr>
-      <w:r>
-        <w:t xml:space="preserve">How to use GraphML</w:t>
-      </w:r>
-    </w:p>
-    <w:p>
-      <w:pPr>
-        <w:pStyle w:val="FirstParagraph"/>
-      </w:pPr>
-      <w:r>
-        <w:t xml:space="preserve">The GraphML is the most direct representation of the released candidate multigraph for graph analysis. It preserves the selected all-facility node set, including isolates, and therefore aligns with the documented component and degree summaries. Users comparing the GraphML with edge-induced views should account for the explicit isolate policy. Parallel edges are part of the released graph structure and should not be collapsed without documenting the transformation.</w:t>
-      </w:r>
-    </w:p>
-    <w:bookmarkEnd w:id="77"/>
-    <w:bookmarkStart w:id="78" w:name="how-to-use-csv-records"/>
-    <w:p>
-      <w:pPr>
-        <w:pStyle w:val="Heading2"/>
-      </w:pPr>
-      <w:r>
-        <w:t xml:space="preserve">How to use CSV records</w:t>
-      </w:r>
-    </w:p>
-    <w:p>
-      <w:pPr>
-        <w:pStyle w:val="FirstParagraph"/>
-      </w:pPr>
-      <w:r>
-        <w:t xml:space="preserve">The retained candidate branch CSV is the preferred branch-level topology table. The circuit-classification ledger should be consulted whenever a downstream workflow depends on failure modes, ambiguity, or alternative selection rules. Validation CSV and JSON records document evidence categories, matcher controls, independence-risk categories, missingness, and archive-validation relationships. The six recommended joins in</w:t>
-      </w:r>
-      <w:r>
-        <w:t xml:space="preserve"> </w:t>
-      </w:r>
-      <w:r>
-        <w:rPr>
-          <w:rStyle w:val="VerbatimChar"/>
-        </w:rPr>
-        <w:t xml:space="preserve">schema/join_relationships.csv</w:t>
-      </w:r>
-      <w:r>
-        <w:t xml:space="preserve"> </w:t>
-      </w:r>
-      <w:r>
-        <w:t xml:space="preserve">should be used in preference to name-based joins.</w:t>
-      </w:r>
-    </w:p>
-    <w:bookmarkEnd w:id="78"/>
-    <w:bookmarkStart w:id="79" w:name="limitations"/>
-    <w:p>
-      <w:pPr>
-        <w:pStyle w:val="Heading2"/>
-      </w:pPr>
-      <w:r>
-        <w:t xml:space="preserve">Limitations</w:t>
-      </w:r>
-    </w:p>
-    <w:p>
-      <w:pPr>
-        <w:pStyle w:val="FirstParagraph"/>
-      </w:pPr>
-      <w:r>
-        <w:t xml:space="preserve">The release has four main limitations. First, it is a candidate topology derived from public E-REDES records rather than an operator-confirmed network model. Second, external triangulation provides public-source concordance categories rather than truth labels: precision is not independently estimated, and national or real-network recall cannot be estimated from the available records. Third, electrical parameters, transformer details, operating controls, and injections are incomplete or absent, so the release is not AC power-flow or OPF ready. Fourth, the DOI archive preserves the versioned derived dataset but not the raw E-REDES snapshots. Source identifiers, URLs, access timestamps, roles, and attribution are recorded, but the three topology-critical v2.1 export URLs returned HTTP 404 during the final clean-room reacquisition audit; raw/API-to-release byte reproduction is therefore not claimed.</w:t>
-      </w:r>
-    </w:p>
-    <w:bookmarkEnd w:id="79"/>
-    <w:bookmarkEnd w:id="80"/>
-    <w:bookmarkStart w:id="81" w:name="data-availability"/>
-    <w:p>
-      <w:pPr>
-        <w:pStyle w:val="Heading1"/>
-      </w:pPr>
-      <w:r>
-        <w:t xml:space="preserve">Data Availability</w:t>
-      </w:r>
-    </w:p>
-    <w:p>
-      <w:pPr>
-        <w:pStyle w:val="FirstParagraph"/>
-      </w:pPr>
-      <w:r>
         <w:rPr>
           <w:smallCaps/>
         </w:rPr>
@@ -3848,7 +4968,7 @@
       <w:r>
         <w:t xml:space="preserve"> </w:t>
       </w:r>
-      <w:hyperlink r:id="rId35">
+      <w:hyperlink r:id="rId27">
         <w:r>
           <w:rPr>
             <w:rStyle w:val="Hyperlink"/>
@@ -3878,10 +4998,10 @@
         <w:rPr>
           <w:rStyle w:val="VerbatimChar"/>
         </w:rPr>
-        <w:t xml:space="preserve">a4dd2d115caae0cd1c873fb7db3341e0aaed0ce62f7f0072ae92642898efb69a</w:t>
-      </w:r>
-      <w:r>
-        <w:t xml:space="preserve">, must replace the earlier uploaded draft before publication. It contains the core topology, full circuit ledger, GraphML, sensitivity sweep, provenance, validation, corrected schema/data dictionary, licensing, attribution, manifest, and checksum records described in Data Records. Raw source downloads and optional diagnostic/interface artifacts are excluded as documented in</w:t>
+        <w:t xml:space="preserve">a8a17396830407a7d7ea16e50ebb67336a6015f2aee4781391fa59c54fde5459</w:t>
+      </w:r>
+      <w:r>
+        <w:t xml:space="preserve">, must replace the earlier uploaded draft before publication. It contains the core topology, full circuit ledger, GraphML, sensitivity sweep, provenance, validation, machine-readable schemas, a field-level data dictionary, licensing, attribution, manifest, and checksum records described in the Data Record. Raw source downloads and optional diagnostic/interface artifacts are excluded as documented in</w:t>
       </w:r>
       <w:r>
         <w:t xml:space="preserve"> </w:t>
@@ -3941,8 +5061,8 @@
         <w:t xml:space="preserve">; the software licence does not replace those data terms.</w:t>
       </w:r>
     </w:p>
-    <w:bookmarkEnd w:id="81"/>
-    <w:bookmarkStart w:id="83" w:name="code-availability"/>
+    <w:bookmarkEnd w:id="73"/>
+    <w:bookmarkStart w:id="75" w:name="code-availability"/>
     <w:p>
       <w:pPr>
         <w:pStyle w:val="Heading1"/>
@@ -3961,7 +5081,7 @@
       <w:r>
         <w:t xml:space="preserve"> </w:t>
       </w:r>
-      <w:hyperlink r:id="rId82">
+      <w:hyperlink r:id="rId74">
         <w:r>
           <w:rPr>
             <w:rStyle w:val="Hyperlink"/>
@@ -3985,119 +5105,600 @@
         <w:t xml:space="preserve">; the software is MIT licensed. The dataset archive is independently usable without installing the generation pipeline, but full regeneration from raw E-REDES/API responses is subject to the source-reacquisition limitation described in Usage Notes.</w:t>
       </w:r>
     </w:p>
+    <w:bookmarkEnd w:id="75"/>
+    <w:bookmarkStart w:id="76" w:name="author-contributions"/>
+    <w:p>
+      <w:pPr>
+        <w:pStyle w:val="Heading1"/>
+      </w:pPr>
+      <w:r>
+        <w:t xml:space="preserve">Author Contributions</w:t>
+      </w:r>
+    </w:p>
+    <w:p>
+      <w:pPr>
+        <w:pStyle w:val="FirstParagraph"/>
+      </w:pPr>
+      <w:r>
+        <w:t xml:space="preserve">The author-responsibility statement will be completed when the final author list is supplied and before submission.</w:t>
+      </w:r>
+    </w:p>
+    <w:bookmarkEnd w:id="76"/>
+    <w:bookmarkStart w:id="77" w:name="competing-interests"/>
+    <w:p>
+      <w:pPr>
+        <w:pStyle w:val="Heading1"/>
+      </w:pPr>
+      <w:r>
+        <w:t xml:space="preserve">Competing Interests</w:t>
+      </w:r>
+    </w:p>
+    <w:p>
+      <w:pPr>
+        <w:pStyle w:val="FirstParagraph"/>
+      </w:pPr>
+      <w:r>
+        <w:t xml:space="preserve">The final competing-interests declaration will be supplied before submission.</w:t>
+      </w:r>
+    </w:p>
+    <w:bookmarkEnd w:id="77"/>
+    <w:bookmarkStart w:id="78" w:name="acknowledgements"/>
+    <w:p>
+      <w:pPr>
+        <w:pStyle w:val="Heading1"/>
+      </w:pPr>
+      <w:r>
+        <w:t xml:space="preserve">Acknowledgements</w:t>
+      </w:r>
+    </w:p>
+    <w:p>
+      <w:pPr>
+        <w:pStyle w:val="FirstParagraph"/>
+      </w:pPr>
+      <w:r>
+        <w:t xml:space="preserve">Acknowledgements, if applicable, will be finalized before submission.</w:t>
+      </w:r>
+    </w:p>
+    <w:bookmarkEnd w:id="78"/>
+    <w:bookmarkStart w:id="79" w:name="funding"/>
+    <w:p>
+      <w:pPr>
+        <w:pStyle w:val="Heading1"/>
+      </w:pPr>
+      <w:r>
+        <w:t xml:space="preserve">Funding</w:t>
+      </w:r>
+    </w:p>
+    <w:p>
+      <w:pPr>
+        <w:pStyle w:val="FirstParagraph"/>
+      </w:pPr>
+      <w:r>
+        <w:t xml:space="preserve">The funding statement will be finalized before submission.</w:t>
+      </w:r>
+    </w:p>
+    <w:bookmarkEnd w:id="79"/>
+    <w:bookmarkStart w:id="106" w:name="bibliography"/>
+    <w:p>
+      <w:pPr>
+        <w:pStyle w:val="Heading1"/>
+      </w:pPr>
+      <w:r>
+        <w:t xml:space="preserve">References</w:t>
+      </w:r>
+    </w:p>
+    <w:bookmarkStart w:id="105" w:name="refs"/>
+    <w:bookmarkStart w:id="81" w:name="ref-Medjroubi2017"/>
+    <w:p>
+      <w:pPr>
+        <w:pStyle w:val="Bibliography"/>
+      </w:pPr>
+      <w:r>
+        <w:t xml:space="preserve">1.</w:t>
+      </w:r>
+      <w:r>
+        <w:t xml:space="preserve"> </w:t>
+      </w:r>
+      <w:r>
+        <w:t xml:space="preserve">	</w:t>
+      </w:r>
+      <w:r>
+        <w:t xml:space="preserve">W. Medjroubi, U. P. Müller, M. Scharf, C. Matke, &amp; D. Kleinhans. Open data in power grid modelling: New approaches towards transparent grid models.</w:t>
+      </w:r>
+      <w:r>
+        <w:t xml:space="preserve"> </w:t>
+      </w:r>
+      <w:r>
+        <w:rPr>
+          <w:i/>
+          <w:iCs/>
+        </w:rPr>
+        <w:t xml:space="preserve">Energy Reports</w:t>
+      </w:r>
+      <w:r>
+        <w:t xml:space="preserve"> </w:t>
+      </w:r>
+      <w:r>
+        <w:rPr>
+          <w:b/>
+          <w:bCs/>
+        </w:rPr>
+        <w:t xml:space="preserve">3</w:t>
+      </w:r>
+      <w:r>
+        <w:t xml:space="preserve"> </w:t>
+      </w:r>
+      <w:r>
+        <w:t xml:space="preserve">14–21 (2017) https://doi.org/</w:t>
+      </w:r>
+      <w:hyperlink r:id="rId80">
+        <w:r>
+          <w:rPr>
+            <w:rStyle w:val="Hyperlink"/>
+          </w:rPr>
+          <w:t xml:space="preserve">10.1016/j.egyr.2016.12.001</w:t>
+        </w:r>
+      </w:hyperlink>
+      <w:r>
+        <w:t xml:space="preserve">.</w:t>
+      </w:r>
+    </w:p>
+    <w:bookmarkEnd w:id="81"/>
+    <w:bookmarkStart w:id="83" w:name="ref-Horsch2018"/>
+    <w:p>
+      <w:pPr>
+        <w:pStyle w:val="Bibliography"/>
+      </w:pPr>
+      <w:r>
+        <w:t xml:space="preserve">2.</w:t>
+      </w:r>
+      <w:r>
+        <w:t xml:space="preserve"> </w:t>
+      </w:r>
+      <w:r>
+        <w:t xml:space="preserve">	</w:t>
+      </w:r>
+      <w:r>
+        <w:t xml:space="preserve">J. Hörsch, F. Hofmann, D. Schlachtberger, &amp; T. Brown.</w:t>
+      </w:r>
+      <w:r>
+        <w:t xml:space="preserve"> </w:t>
+      </w:r>
+      <w:r>
+        <w:t xml:space="preserve">PyPSA-Eur</w:t>
+      </w:r>
+      <w:r>
+        <w:t xml:space="preserve">: An open optimisation model of the european transmission system.</w:t>
+      </w:r>
+      <w:r>
+        <w:t xml:space="preserve"> </w:t>
+      </w:r>
+      <w:r>
+        <w:rPr>
+          <w:i/>
+          <w:iCs/>
+        </w:rPr>
+        <w:t xml:space="preserve">Energy Strategy Reviews</w:t>
+      </w:r>
+      <w:r>
+        <w:t xml:space="preserve"> </w:t>
+      </w:r>
+      <w:r>
+        <w:rPr>
+          <w:b/>
+          <w:bCs/>
+        </w:rPr>
+        <w:t xml:space="preserve">22</w:t>
+      </w:r>
+      <w:r>
+        <w:t xml:space="preserve"> </w:t>
+      </w:r>
+      <w:r>
+        <w:t xml:space="preserve">207–215 (2018) https://doi.org/</w:t>
+      </w:r>
+      <w:hyperlink r:id="rId82">
+        <w:r>
+          <w:rPr>
+            <w:rStyle w:val="Hyperlink"/>
+          </w:rPr>
+          <w:t xml:space="preserve">10.1016/j.esr.2018.08.012</w:t>
+        </w:r>
+      </w:hyperlink>
+      <w:r>
+        <w:t xml:space="preserve">.</w:t>
+      </w:r>
+    </w:p>
     <w:bookmarkEnd w:id="83"/>
-    <w:bookmarkStart w:id="84" w:name="author-contributions"/>
-    <w:p>
-      <w:pPr>
-        <w:pStyle w:val="Heading1"/>
-      </w:pPr>
-      <w:r>
-        <w:t xml:space="preserve">Author Contributions</w:t>
-      </w:r>
-    </w:p>
-    <w:p>
-      <w:pPr>
-        <w:pStyle w:val="FirstParagraph"/>
-      </w:pPr>
-      <w:r>
-        <w:t xml:space="preserve">The author-responsibility statement will be completed when the final author list is supplied and before submission.</w:t>
-      </w:r>
-    </w:p>
-    <w:bookmarkEnd w:id="84"/>
-    <w:bookmarkStart w:id="85" w:name="competing-interests"/>
-    <w:p>
-      <w:pPr>
-        <w:pStyle w:val="Heading1"/>
-      </w:pPr>
-      <w:r>
-        <w:t xml:space="preserve">Competing Interests</w:t>
-      </w:r>
-    </w:p>
-    <w:p>
-      <w:pPr>
-        <w:pStyle w:val="FirstParagraph"/>
-      </w:pPr>
-      <w:r>
-        <w:t xml:space="preserve">The final competing-interests declaration will be supplied before submission.</w:t>
+    <w:bookmarkStart w:id="85" w:name="ref-Wiese2019"/>
+    <w:p>
+      <w:pPr>
+        <w:pStyle w:val="Bibliography"/>
+      </w:pPr>
+      <w:r>
+        <w:t xml:space="preserve">3.</w:t>
+      </w:r>
+      <w:r>
+        <w:t xml:space="preserve"> </w:t>
+      </w:r>
+      <w:r>
+        <w:t xml:space="preserve">	</w:t>
+      </w:r>
+      <w:r>
+        <w:t xml:space="preserve">F. Wiese et al. Open power system data – frictionless data for electricity system modelling.</w:t>
+      </w:r>
+      <w:r>
+        <w:t xml:space="preserve"> </w:t>
+      </w:r>
+      <w:r>
+        <w:rPr>
+          <w:i/>
+          <w:iCs/>
+        </w:rPr>
+        <w:t xml:space="preserve">Applied Energy</w:t>
+      </w:r>
+      <w:r>
+        <w:t xml:space="preserve"> </w:t>
+      </w:r>
+      <w:r>
+        <w:rPr>
+          <w:b/>
+          <w:bCs/>
+        </w:rPr>
+        <w:t xml:space="preserve">236</w:t>
+      </w:r>
+      <w:r>
+        <w:t xml:space="preserve"> </w:t>
+      </w:r>
+      <w:r>
+        <w:t xml:space="preserve">401–409 (2019) https://doi.org/</w:t>
+      </w:r>
+      <w:hyperlink r:id="rId84">
+        <w:r>
+          <w:rPr>
+            <w:rStyle w:val="Hyperlink"/>
+          </w:rPr>
+          <w:t xml:space="preserve">10.1016/j.apenergy.2018.11.097</w:t>
+        </w:r>
+      </w:hyperlink>
+      <w:r>
+        <w:t xml:space="preserve">.</w:t>
       </w:r>
     </w:p>
     <w:bookmarkEnd w:id="85"/>
-    <w:bookmarkStart w:id="86" w:name="acknowledgements"/>
-    <w:p>
-      <w:pPr>
-        <w:pStyle w:val="Heading1"/>
-      </w:pPr>
-      <w:r>
-        <w:t xml:space="preserve">Acknowledgements</w:t>
-      </w:r>
-    </w:p>
-    <w:p>
-      <w:pPr>
-        <w:pStyle w:val="FirstParagraph"/>
-      </w:pPr>
-      <w:r>
-        <w:t xml:space="preserve">Acknowledgements, if applicable, will be finalized before submission.</w:t>
-      </w:r>
-    </w:p>
-    <w:bookmarkEnd w:id="86"/>
-    <w:bookmarkStart w:id="87" w:name="funding"/>
-    <w:p>
-      <w:pPr>
-        <w:pStyle w:val="Heading1"/>
-      </w:pPr>
-      <w:r>
-        <w:t xml:space="preserve">Funding</w:t>
-      </w:r>
-    </w:p>
-    <w:p>
-      <w:pPr>
-        <w:pStyle w:val="FirstParagraph"/>
-      </w:pPr>
-      <w:r>
-        <w:t xml:space="preserve">The funding statement will be finalized before submission.</w:t>
+    <w:bookmarkStart w:id="87" w:name="ref-Xiong2025"/>
+    <w:p>
+      <w:pPr>
+        <w:pStyle w:val="Bibliography"/>
+      </w:pPr>
+      <w:r>
+        <w:t xml:space="preserve">4.</w:t>
+      </w:r>
+      <w:r>
+        <w:t xml:space="preserve"> </w:t>
+      </w:r>
+      <w:r>
+        <w:t xml:space="preserve">	</w:t>
+      </w:r>
+      <w:r>
+        <w:t xml:space="preserve">B. Xiong, D. Fioriti, F. Neumann, I. Riepin, &amp; T. Brown. Modelling the high-voltage grid using open data for europe and beyond.</w:t>
+      </w:r>
+      <w:r>
+        <w:t xml:space="preserve"> </w:t>
+      </w:r>
+      <w:r>
+        <w:rPr>
+          <w:i/>
+          <w:iCs/>
+        </w:rPr>
+        <w:t xml:space="preserve">Scientific Data</w:t>
+      </w:r>
+      <w:r>
+        <w:t xml:space="preserve"> </w:t>
+      </w:r>
+      <w:r>
+        <w:rPr>
+          <w:b/>
+          <w:bCs/>
+        </w:rPr>
+        <w:t xml:space="preserve">12</w:t>
+      </w:r>
+      <w:r>
+        <w:t xml:space="preserve"> </w:t>
+      </w:r>
+      <w:r>
+        <w:t xml:space="preserve">277 (2025) https://doi.org/</w:t>
+      </w:r>
+      <w:hyperlink r:id="rId86">
+        <w:r>
+          <w:rPr>
+            <w:rStyle w:val="Hyperlink"/>
+          </w:rPr>
+          <w:t xml:space="preserve">10.1038/s41597-025-04550-7</w:t>
+        </w:r>
+      </w:hyperlink>
+      <w:r>
+        <w:t xml:space="preserve">.</w:t>
       </w:r>
     </w:p>
     <w:bookmarkEnd w:id="87"/>
-    <w:bookmarkStart w:id="105" w:name="bibliography"/>
-    <w:p>
-      <w:pPr>
-        <w:pStyle w:val="Heading1"/>
-      </w:pPr>
-      <w:r>
-        <w:t xml:space="preserve">References</w:t>
-      </w:r>
-    </w:p>
-    <w:bookmarkStart w:id="104" w:name="refs"/>
-    <w:bookmarkStart w:id="89" w:name="ref-EREDESOpenData2026"/>
+    <w:bookmarkStart w:id="89" w:name="ref-Rivera2019"/>
     <w:p>
       <w:pPr>
         <w:pStyle w:val="Bibliography"/>
       </w:pPr>
       <w:r>
-        <w:t xml:space="preserve">E-REDES. 2026.</w:t>
-      </w:r>
-      <w:r>
-        <w:t xml:space="preserve"> </w:t>
-      </w:r>
-      <w:r>
-        <w:t xml:space="preserve">“</w:t>
+        <w:t xml:space="preserve">5.</w:t>
+      </w:r>
+      <w:r>
+        <w:t xml:space="preserve"> </w:t>
+      </w:r>
+      <w:r>
+        <w:t xml:space="preserve">	</w:t>
+      </w:r>
+      <w:r>
+        <w:t xml:space="preserve">J. Rivera, P. Nasirifard, J. Leimhofer, &amp; H.-A. Jacobsen. Automatic generation of real power transmission grid models from crowdsourced data.</w:t>
+      </w:r>
+      <w:r>
+        <w:t xml:space="preserve"> </w:t>
+      </w:r>
+      <w:r>
+        <w:rPr>
+          <w:i/>
+          <w:iCs/>
+        </w:rPr>
+        <w:t xml:space="preserve">IEEE Transactions on Smart Grid</w:t>
+      </w:r>
+      <w:r>
+        <w:t xml:space="preserve"> </w:t>
+      </w:r>
+      <w:r>
+        <w:rPr>
+          <w:b/>
+          <w:bCs/>
+        </w:rPr>
+        <w:t xml:space="preserve">10</w:t>
+      </w:r>
+      <w:r>
+        <w:t xml:space="preserve"> </w:t>
+      </w:r>
+      <w:r>
+        <w:t xml:space="preserve">5436–5448 (2019) https://doi.org/</w:t>
+      </w:r>
+      <w:hyperlink r:id="rId88">
+        <w:r>
+          <w:rPr>
+            <w:rStyle w:val="Hyperlink"/>
+          </w:rPr>
+          <w:t xml:space="preserve">10.1109/TSG.2018.2882840</w:t>
+        </w:r>
+      </w:hyperlink>
+      <w:r>
+        <w:t xml:space="preserve">.</w:t>
+      </w:r>
+    </w:p>
+    <w:bookmarkEnd w:id="89"/>
+    <w:bookmarkStart w:id="91" w:name="ref-Haklay2008"/>
+    <w:p>
+      <w:pPr>
+        <w:pStyle w:val="Bibliography"/>
+      </w:pPr>
+      <w:r>
+        <w:t xml:space="preserve">6.</w:t>
+      </w:r>
+      <w:r>
+        <w:t xml:space="preserve"> </w:t>
+      </w:r>
+      <w:r>
+        <w:t xml:space="preserve">	</w:t>
+      </w:r>
+      <w:r>
+        <w:t xml:space="preserve">M. Haklay &amp; P. Weber.</w:t>
+      </w:r>
+      <w:r>
+        <w:t xml:space="preserve"> </w:t>
+      </w:r>
+      <w:r>
+        <w:t xml:space="preserve">OpenStreetMap</w:t>
+      </w:r>
+      <w:r>
+        <w:t xml:space="preserve">: User-generated street maps.</w:t>
+      </w:r>
+      <w:r>
+        <w:t xml:space="preserve"> </w:t>
+      </w:r>
+      <w:r>
+        <w:rPr>
+          <w:i/>
+          <w:iCs/>
+        </w:rPr>
+        <w:t xml:space="preserve">IEEE Pervasive Computing</w:t>
+      </w:r>
+      <w:r>
+        <w:t xml:space="preserve"> </w:t>
+      </w:r>
+      <w:r>
+        <w:rPr>
+          <w:b/>
+          <w:bCs/>
+        </w:rPr>
+        <w:t xml:space="preserve">7</w:t>
+      </w:r>
+      <w:r>
+        <w:t xml:space="preserve"> </w:t>
+      </w:r>
+      <w:r>
+        <w:t xml:space="preserve">12–18 (2008) https://doi.org/</w:t>
+      </w:r>
+      <w:hyperlink r:id="rId90">
+        <w:r>
+          <w:rPr>
+            <w:rStyle w:val="Hyperlink"/>
+          </w:rPr>
+          <w:t xml:space="preserve">10.1109/MPRV.2008.80</w:t>
+        </w:r>
+      </w:hyperlink>
+      <w:r>
+        <w:t xml:space="preserve">.</w:t>
+      </w:r>
+    </w:p>
+    <w:bookmarkEnd w:id="91"/>
+    <w:bookmarkStart w:id="93" w:name="ref-Wilkinson2016"/>
+    <w:p>
+      <w:pPr>
+        <w:pStyle w:val="Bibliography"/>
+      </w:pPr>
+      <w:r>
+        <w:t xml:space="preserve">7.</w:t>
+      </w:r>
+      <w:r>
+        <w:t xml:space="preserve"> </w:t>
+      </w:r>
+      <w:r>
+        <w:t xml:space="preserve">	</w:t>
+      </w:r>
+      <w:r>
+        <w:t xml:space="preserve">M. D. Wilkinson, M. Dumontier, Ij. J. Aalbersberg, et al.</w:t>
+      </w:r>
+      <w:r>
+        <w:t xml:space="preserve"> The</w:t>
+      </w:r>
+      <w:r>
+        <w:t xml:space="preserve"> </w:t>
+      </w:r>
+      <w:r>
+        <w:t xml:space="preserve">FAIR</w:t>
+      </w:r>
+      <w:r>
+        <w:t xml:space="preserve"> </w:t>
+      </w:r>
+      <w:r>
+        <w:t xml:space="preserve">guiding principles for scientific data management and stewardship.</w:t>
+      </w:r>
+      <w:r>
+        <w:t xml:space="preserve"> </w:t>
+      </w:r>
+      <w:r>
+        <w:rPr>
+          <w:i/>
+          <w:iCs/>
+        </w:rPr>
+        <w:t xml:space="preserve">Scientific Data</w:t>
+      </w:r>
+      <w:r>
+        <w:t xml:space="preserve"> </w:t>
+      </w:r>
+      <w:r>
+        <w:rPr>
+          <w:b/>
+          <w:bCs/>
+        </w:rPr>
+        <w:t xml:space="preserve">3</w:t>
+      </w:r>
+      <w:r>
+        <w:t xml:space="preserve"> </w:t>
+      </w:r>
+      <w:r>
+        <w:t xml:space="preserve">160018 (2016) https://doi.org/</w:t>
+      </w:r>
+      <w:hyperlink r:id="rId92">
+        <w:r>
+          <w:rPr>
+            <w:rStyle w:val="Hyperlink"/>
+          </w:rPr>
+          <w:t xml:space="preserve">10.1038/sdata.2016.18</w:t>
+        </w:r>
+      </w:hyperlink>
+      <w:r>
+        <w:t xml:space="preserve">.</w:t>
+      </w:r>
+    </w:p>
+    <w:bookmarkEnd w:id="93"/>
+    <w:bookmarkStart w:id="95" w:name="ref-Gebru2021"/>
+    <w:p>
+      <w:pPr>
+        <w:pStyle w:val="Bibliography"/>
+      </w:pPr>
+      <w:r>
+        <w:t xml:space="preserve">8.</w:t>
+      </w:r>
+      <w:r>
+        <w:t xml:space="preserve"> </w:t>
+      </w:r>
+      <w:r>
+        <w:t xml:space="preserve">	</w:t>
+      </w:r>
+      <w:r>
+        <w:t xml:space="preserve">T. Gebru et al. Datasheets for datasets.</w:t>
+      </w:r>
+      <w:r>
+        <w:t xml:space="preserve"> </w:t>
+      </w:r>
+      <w:r>
+        <w:rPr>
+          <w:i/>
+          <w:iCs/>
+        </w:rPr>
+        <w:t xml:space="preserve">Communications of the ACM</w:t>
+      </w:r>
+      <w:r>
+        <w:t xml:space="preserve"> </w:t>
+      </w:r>
+      <w:r>
+        <w:rPr>
+          <w:b/>
+          <w:bCs/>
+        </w:rPr>
+        <w:t xml:space="preserve">64</w:t>
+      </w:r>
+      <w:r>
+        <w:t xml:space="preserve"> </w:t>
+      </w:r>
+      <w:r>
+        <w:t xml:space="preserve">86–92 (2021) https://doi.org/</w:t>
+      </w:r>
+      <w:hyperlink r:id="rId94">
+        <w:r>
+          <w:rPr>
+            <w:rStyle w:val="Hyperlink"/>
+          </w:rPr>
+          <w:t xml:space="preserve">10.1145/3458723</w:t>
+        </w:r>
+      </w:hyperlink>
+      <w:r>
+        <w:t xml:space="preserve">.</w:t>
+      </w:r>
+    </w:p>
+    <w:bookmarkEnd w:id="95"/>
+    <w:bookmarkStart w:id="97" w:name="ref-EREDESOpenData2026"/>
+    <w:p>
+      <w:pPr>
+        <w:pStyle w:val="Bibliography"/>
+      </w:pPr>
+      <w:r>
+        <w:t xml:space="preserve">9.</w:t>
+      </w:r>
+      <w:r>
+        <w:t xml:space="preserve"> </w:t>
+      </w:r>
+      <w:r>
+        <w:t xml:space="preserve">	</w:t>
+      </w:r>
+      <w:r>
+        <w:t xml:space="preserve">E-REDES.</w:t>
+      </w:r>
+      <w:r>
+        <w:t xml:space="preserve"> </w:t>
       </w:r>
       <w:r>
         <w:t xml:space="preserve">E-REDES Open Data Portal</w:t>
       </w:r>
       <w:r>
-        <w:t xml:space="preserve">.”</w:t>
-      </w:r>
-      <w:r>
-        <w:t xml:space="preserve"> </w:t>
-      </w:r>
-      <w:r>
-        <w:t xml:space="preserve">Online data portal.</w:t>
-      </w:r>
-      <w:r>
-        <w:t xml:space="preserve"> </w:t>
-      </w:r>
-      <w:hyperlink r:id="rId88">
+        <w:t xml:space="preserve">. (2026)</w:t>
+      </w:r>
+      <w:r>
+        <w:t xml:space="preserve"> </w:t>
+      </w:r>
+      <w:hyperlink r:id="rId96">
         <w:r>
           <w:rPr>
             <w:rStyle w:val="Hyperlink"/>
@@ -4109,135 +5710,160 @@
         <w:t xml:space="preserve">.</w:t>
       </w:r>
     </w:p>
-    <w:bookmarkEnd w:id="89"/>
-    <w:bookmarkStart w:id="91" w:name="ref-Horsch2018"/>
+    <w:bookmarkEnd w:id="97"/>
+    <w:bookmarkStart w:id="98" w:name="ref-PT60Candidate2026"/>
     <w:p>
       <w:pPr>
         <w:pStyle w:val="Bibliography"/>
       </w:pPr>
       <w:r>
-        <w:t xml:space="preserve">Hörsch, Jonas, Fabian Hofmann, David Schlachtberger, and Tom Brown. 2018.</w:t>
-      </w:r>
-      <w:r>
-        <w:t xml:space="preserve"> </w:t>
-      </w:r>
-      <w:r>
-        <w:t xml:space="preserve">“</w:t>
-      </w:r>
-      <w:r>
-        <w:t xml:space="preserve">PyPSA-Eur</w:t>
-      </w:r>
-      <w:r>
-        <w:t xml:space="preserve">: An Open Optimisation Model of the European Transmission System.”</w:t>
-      </w:r>
-      <w:r>
-        <w:t xml:space="preserve"> </w:t>
-      </w:r>
-      <w:r>
-        <w:rPr>
-          <w:i/>
-          <w:iCs/>
-        </w:rPr>
-        <w:t xml:space="preserve">Energy Strategy Reviews</w:t>
-      </w:r>
-      <w:r>
-        <w:t xml:space="preserve"> </w:t>
-      </w:r>
-      <w:r>
-        <w:t xml:space="preserve">22: 207–15.</w:t>
-      </w:r>
-      <w:r>
-        <w:t xml:space="preserve"> </w:t>
-      </w:r>
-      <w:hyperlink r:id="rId90">
+        <w:t xml:space="preserve">10.</w:t>
+      </w:r>
+      <w:r>
+        <w:t xml:space="preserve"> </w:t>
+      </w:r>
+      <w:r>
+        <w:t xml:space="preserve">	</w:t>
+      </w:r>
+      <w:r>
+        <w:t xml:space="preserve">PortugueseOPD contributors.</w:t>
+      </w:r>
+      <w:r>
+        <w:t xml:space="preserve"> </w:t>
+      </w:r>
+      <w:r>
+        <w:t xml:space="preserve">PT60-Candidate: A Provenance-Tracked Candidate Dataset for Portuguese 60 kV Topology Reconstruction</w:t>
+      </w:r>
+      <w:r>
+        <w:t xml:space="preserve">. (2026) https://doi.org/</w:t>
+      </w:r>
+      <w:hyperlink r:id="rId27">
         <w:r>
           <w:rPr>
             <w:rStyle w:val="Hyperlink"/>
           </w:rPr>
-          <w:t xml:space="preserve">https://doi.org/10.1016/j.esr.2018.08.012</w:t>
+          <w:t xml:space="preserve">10.6084/m9.figshare.32984021</w:t>
         </w:r>
       </w:hyperlink>
       <w:r>
         <w:t xml:space="preserve">.</w:t>
       </w:r>
     </w:p>
-    <w:bookmarkEnd w:id="91"/>
-    <w:bookmarkStart w:id="93" w:name="ref-Medjroubi2017"/>
+    <w:bookmarkEnd w:id="98"/>
+    <w:bookmarkStart w:id="100" w:name="ref-OpendatasoftExploreAPI2026"/>
     <w:p>
       <w:pPr>
         <w:pStyle w:val="Bibliography"/>
       </w:pPr>
       <w:r>
-        <w:t xml:space="preserve">Medjroubi, Wided, Ulf Philipp Müller, Malte Scharf, Carsten Matke, and David Kleinhans. 2017.</w:t>
-      </w:r>
-      <w:r>
-        <w:t xml:space="preserve"> </w:t>
-      </w:r>
-      <w:r>
-        <w:t xml:space="preserve">“Open Data in Power Grid Modelling: New Approaches Towards Transparent Grid Models.”</w:t>
-      </w:r>
-      <w:r>
-        <w:t xml:space="preserve"> </w:t>
-      </w:r>
-      <w:r>
-        <w:rPr>
-          <w:i/>
-          <w:iCs/>
-        </w:rPr>
-        <w:t xml:space="preserve">Energy Reports</w:t>
-      </w:r>
-      <w:r>
-        <w:t xml:space="preserve"> </w:t>
-      </w:r>
-      <w:r>
-        <w:t xml:space="preserve">3: 14–21.</w:t>
-      </w:r>
-      <w:r>
-        <w:t xml:space="preserve"> </w:t>
-      </w:r>
-      <w:hyperlink r:id="rId92">
+        <w:t xml:space="preserve">11.</w:t>
+      </w:r>
+      <w:r>
+        <w:t xml:space="preserve"> </w:t>
+      </w:r>
+      <w:r>
+        <w:t xml:space="preserve">	</w:t>
+      </w:r>
+      <w:r>
+        <w:t xml:space="preserve">Opendatasoft.</w:t>
+      </w:r>
+      <w:r>
+        <w:t xml:space="preserve"> </w:t>
+      </w:r>
+      <w:r>
+        <w:t xml:space="preserve">Explore API v2.1 Reference: Geometry Export EPSG Parameter</w:t>
+      </w:r>
+      <w:r>
+        <w:t xml:space="preserve">. (2026)</w:t>
+      </w:r>
+      <w:r>
+        <w:t xml:space="preserve"> </w:t>
+      </w:r>
+      <w:hyperlink r:id="rId99">
         <w:r>
           <w:rPr>
             <w:rStyle w:val="Hyperlink"/>
           </w:rPr>
-          <w:t xml:space="preserve">https://doi.org/10.1016/j.egyr.2016.12.001</w:t>
+          <w:t xml:space="preserve">https://help.opendatasoft.com/apis/ods-explore-v2/</w:t>
         </w:r>
       </w:hyperlink>
       <w:r>
         <w:t xml:space="preserve">.</w:t>
       </w:r>
     </w:p>
-    <w:bookmarkEnd w:id="93"/>
-    <w:bookmarkStart w:id="95" w:name="ref-OpenInfraMap2026"/>
+    <w:bookmarkEnd w:id="100"/>
+    <w:bookmarkStart w:id="102" w:name="ref-OSM2026"/>
     <w:p>
       <w:pPr>
         <w:pStyle w:val="Bibliography"/>
       </w:pPr>
       <w:r>
-        <w:t xml:space="preserve">OpenInfraMap contributors. 2026.</w:t>
-      </w:r>
-      <w:r>
-        <w:t xml:space="preserve"> </w:t>
-      </w:r>
-      <w:r>
-        <w:t xml:space="preserve">“</w:t>
+        <w:t xml:space="preserve">12.</w:t>
+      </w:r>
+      <w:r>
+        <w:t xml:space="preserve"> </w:t>
+      </w:r>
+      <w:r>
+        <w:t xml:space="preserve">	</w:t>
+      </w:r>
+      <w:r>
+        <w:t xml:space="preserve">OpenStreetMap contributors.</w:t>
+      </w:r>
+      <w:r>
+        <w:t xml:space="preserve"> </w:t>
+      </w:r>
+      <w:r>
+        <w:t xml:space="preserve">OpenStreetMap</w:t>
+      </w:r>
+      <w:r>
+        <w:t xml:space="preserve">. (2026)</w:t>
+      </w:r>
+      <w:r>
+        <w:t xml:space="preserve"> </w:t>
+      </w:r>
+      <w:hyperlink r:id="rId101">
+        <w:r>
+          <w:rPr>
+            <w:rStyle w:val="Hyperlink"/>
+          </w:rPr>
+          <w:t xml:space="preserve">https://www.openstreetmap.org/</w:t>
+        </w:r>
+      </w:hyperlink>
+      <w:r>
+        <w:t xml:space="preserve">.</w:t>
+      </w:r>
+    </w:p>
+    <w:bookmarkEnd w:id="102"/>
+    <w:bookmarkStart w:id="104" w:name="ref-OpenInfraMap2026"/>
+    <w:p>
+      <w:pPr>
+        <w:pStyle w:val="Bibliography"/>
+      </w:pPr>
+      <w:r>
+        <w:t xml:space="preserve">13.</w:t>
+      </w:r>
+      <w:r>
+        <w:t xml:space="preserve"> </w:t>
+      </w:r>
+      <w:r>
+        <w:t xml:space="preserve">	</w:t>
+      </w:r>
+      <w:r>
+        <w:t xml:space="preserve">OpenInfraMap contributors.</w:t>
+      </w:r>
+      <w:r>
+        <w:t xml:space="preserve"> </w:t>
       </w:r>
       <w:r>
         <w:t xml:space="preserve">OpenInfraMap</w:t>
       </w:r>
       <w:r>
-        <w:t xml:space="preserve">.”</w:t>
-      </w:r>
-      <w:r>
-        <w:t xml:space="preserve"> </w:t>
-      </w:r>
-      <w:r>
-        <w:t xml:space="preserve">Web map of infrastructure data derived from OpenStreetMap.</w:t>
-      </w:r>
-      <w:r>
-        <w:t xml:space="preserve"> </w:t>
-      </w:r>
-      <w:hyperlink r:id="rId94">
+        <w:t xml:space="preserve">. (2026)</w:t>
+      </w:r>
+      <w:r>
+        <w:t xml:space="preserve"> </w:t>
+      </w:r>
+      <w:hyperlink r:id="rId103">
         <w:r>
           <w:rPr>
             <w:rStyle w:val="Hyperlink"/>
@@ -4249,190 +5875,14 @@
         <w:t xml:space="preserve">.</w:t>
       </w:r>
     </w:p>
-    <w:bookmarkEnd w:id="95"/>
-    <w:bookmarkStart w:id="97" w:name="ref-OSM2026"/>
-    <w:p>
-      <w:pPr>
-        <w:pStyle w:val="Bibliography"/>
-      </w:pPr>
-      <w:r>
-        <w:t xml:space="preserve">OpenStreetMap contributors. 2026.</w:t>
-      </w:r>
-      <w:r>
-        <w:t xml:space="preserve"> </w:t>
-      </w:r>
-      <w:r>
-        <w:t xml:space="preserve">“</w:t>
-      </w:r>
-      <w:r>
-        <w:t xml:space="preserve">OpenStreetMap</w:t>
-      </w:r>
-      <w:r>
-        <w:t xml:space="preserve">.”</w:t>
-      </w:r>
-      <w:r>
-        <w:t xml:space="preserve"> </w:t>
-      </w:r>
-      <w:r>
-        <w:t xml:space="preserve">Collaborative geospatial database.</w:t>
-      </w:r>
-      <w:r>
-        <w:t xml:space="preserve"> </w:t>
-      </w:r>
-      <w:hyperlink r:id="rId96">
-        <w:r>
-          <w:rPr>
-            <w:rStyle w:val="Hyperlink"/>
-          </w:rPr>
-          <w:t xml:space="preserve">https://www.openstreetmap.org/</w:t>
-        </w:r>
-      </w:hyperlink>
-      <w:r>
-        <w:t xml:space="preserve">.</w:t>
-      </w:r>
-    </w:p>
-    <w:bookmarkEnd w:id="97"/>
-    <w:bookmarkStart w:id="99" w:name="ref-Rivera2019"/>
-    <w:p>
-      <w:pPr>
-        <w:pStyle w:val="Bibliography"/>
-      </w:pPr>
-      <w:r>
-        <w:t xml:space="preserve">Rivera, Jose, Pezhman Nasirifard, Johannes Leimhofer, and Hans-Arno Jacobsen. 2019.</w:t>
-      </w:r>
-      <w:r>
-        <w:t xml:space="preserve"> </w:t>
-      </w:r>
-      <w:r>
-        <w:t xml:space="preserve">“Automatic Generation of Real Power Transmission Grid Models from Crowdsourced Data.”</w:t>
-      </w:r>
-      <w:r>
-        <w:t xml:space="preserve"> </w:t>
-      </w:r>
-      <w:r>
-        <w:rPr>
-          <w:i/>
-          <w:iCs/>
-        </w:rPr>
-        <w:t xml:space="preserve">IEEE Transactions on Smart Grid</w:t>
-      </w:r>
-      <w:r>
-        <w:t xml:space="preserve"> </w:t>
-      </w:r>
-      <w:r>
-        <w:t xml:space="preserve">10 (5): 5436–48.</w:t>
-      </w:r>
-      <w:r>
-        <w:t xml:space="preserve"> </w:t>
-      </w:r>
-      <w:hyperlink r:id="rId98">
-        <w:r>
-          <w:rPr>
-            <w:rStyle w:val="Hyperlink"/>
-          </w:rPr>
-          <w:t xml:space="preserve">https://doi.org/10.1109/TSG.2018.2882840</w:t>
-        </w:r>
-      </w:hyperlink>
-      <w:r>
-        <w:t xml:space="preserve">.</w:t>
-      </w:r>
-    </w:p>
-    <w:bookmarkEnd w:id="99"/>
-    <w:bookmarkStart w:id="101" w:name="ref-Wiese2019"/>
-    <w:p>
-      <w:pPr>
-        <w:pStyle w:val="Bibliography"/>
-      </w:pPr>
-      <w:r>
-        <w:t xml:space="preserve">Wiese, Frauke, Ingmar Schlecht, Wolf-Dieter Bunke, Clemens Gerbaulet, Lion Hirth, Martin Jahn, Friedrich Kunz, et al. 2019.</w:t>
-      </w:r>
-      <w:r>
-        <w:t xml:space="preserve"> </w:t>
-      </w:r>
-      <w:r>
-        <w:t xml:space="preserve">“Open Power System Data – Frictionless Data for Electricity System Modelling.”</w:t>
-      </w:r>
-      <w:r>
-        <w:t xml:space="preserve"> </w:t>
-      </w:r>
-      <w:r>
-        <w:rPr>
-          <w:i/>
-          <w:iCs/>
-        </w:rPr>
-        <w:t xml:space="preserve">Applied Energy</w:t>
-      </w:r>
-      <w:r>
-        <w:t xml:space="preserve"> </w:t>
-      </w:r>
-      <w:r>
-        <w:t xml:space="preserve">236: 401–9.</w:t>
-      </w:r>
-      <w:r>
-        <w:t xml:space="preserve"> </w:t>
-      </w:r>
-      <w:hyperlink r:id="rId100">
-        <w:r>
-          <w:rPr>
-            <w:rStyle w:val="Hyperlink"/>
-          </w:rPr>
-          <w:t xml:space="preserve">https://doi.org/10.1016/j.apenergy.2018.11.097</w:t>
-        </w:r>
-      </w:hyperlink>
-      <w:r>
-        <w:t xml:space="preserve">.</w:t>
-      </w:r>
-    </w:p>
-    <w:bookmarkEnd w:id="101"/>
-    <w:bookmarkStart w:id="103" w:name="ref-Xiong2025"/>
-    <w:p>
-      <w:pPr>
-        <w:pStyle w:val="Bibliography"/>
-      </w:pPr>
-      <w:r>
-        <w:t xml:space="preserve">Xiong, Bobby, Davide Fioriti, Fabian Neumann, Iegor Riepin, and Tom Brown. 2025.</w:t>
-      </w:r>
-      <w:r>
-        <w:t xml:space="preserve"> </w:t>
-      </w:r>
-      <w:r>
-        <w:t xml:space="preserve">“Modelling the High-Voltage Grid Using Open Data for Europe and Beyond.”</w:t>
-      </w:r>
-      <w:r>
-        <w:t xml:space="preserve"> </w:t>
-      </w:r>
-      <w:r>
-        <w:rPr>
-          <w:i/>
-          <w:iCs/>
-        </w:rPr>
-        <w:t xml:space="preserve">Scientific Data</w:t>
-      </w:r>
-      <w:r>
-        <w:t xml:space="preserve"> </w:t>
-      </w:r>
-      <w:r>
-        <w:t xml:space="preserve">12 (1): 277.</w:t>
-      </w:r>
-      <w:r>
-        <w:t xml:space="preserve"> </w:t>
-      </w:r>
-      <w:hyperlink r:id="rId102">
-        <w:r>
-          <w:rPr>
-            <w:rStyle w:val="Hyperlink"/>
-          </w:rPr>
-          <w:t xml:space="preserve">https://doi.org/10.1038/s41597-025-04550-7</w:t>
-        </w:r>
-      </w:hyperlink>
-      <w:r>
-        <w:t xml:space="preserve">.</w:t>
-      </w:r>
-    </w:p>
-    <w:bookmarkEnd w:id="103"/>
     <w:bookmarkEnd w:id="104"/>
     <w:bookmarkEnd w:id="105"/>
-    <w:sectPr/>
+    <w:bookmarkEnd w:id="106"/>
+    <w:sectPr>
+      <w:footnotePr>
+        <w:numRestart w:val="eachSect"/>
+      </w:footnotePr>
+    </w:sectPr>
   </w:body>
 </w:document>
 </file>
@@ -4549,10 +5999,10 @@
   <w:docDefaults>
     <w:rPrDefault>
       <w:rPr>
-        <w:rFonts w:asciiTheme="minorHAnsi" w:cstheme="minorBidi" w:eastAsiaTheme="minorHAnsi" w:hAnsiTheme="minorHAnsi"/>
+        <w:rFonts w:asciiTheme="minorHAnsi" w:cstheme="minorBidi" w:eastAsiaTheme="minorEastAsia" w:hAnsiTheme="minorHAnsi"/>
         <w:sz w:val="24"/>
         <w:szCs w:val="24"/>
-        <w:lang w:bidi="ar-SA" w:eastAsia="en-US" w:val="en-US"/>
+        <w:lang w:bidi="ar-SA" w:eastAsia="zh-CN" w:val="en-US"/>
       </w:rPr>
     </w:rPrDefault>
     <w:pPrDefault>
@@ -4604,8 +6054,6 @@
     </w:pPr>
     <w:rPr>
       <w:rFonts w:asciiTheme="majorHAnsi" w:cstheme="majorBidi" w:eastAsiaTheme="majorEastAsia" w:hAnsiTheme="majorHAnsi"/>
-      <w:spacing w:val="-10"/>
-      <w:kern w:val="28"/>
       <w:sz w:val="56"/>
       <w:szCs w:val="56"/>
     </w:rPr>
@@ -4618,8 +6066,6 @@
     <w:rsid w:val="00A10FD9"/>
     <w:rPr>
       <w:rFonts w:asciiTheme="majorHAnsi" w:cstheme="majorBidi" w:eastAsiaTheme="majorEastAsia" w:hAnsiTheme="majorHAnsi"/>
-      <w:spacing w:val="-10"/>
-      <w:kern w:val="28"/>
       <w:sz w:val="56"/>
       <w:szCs w:val="56"/>
     </w:rPr>
@@ -4660,23 +6106,31 @@
   </w:style>
   <w:style w:customStyle="1" w:styleId="Author" w:type="paragraph">
     <w:name w:val="Author"/>
+    <w:basedOn w:val="Title"/>
     <w:next w:val="BodyText"/>
     <w:qFormat/>
     <w:pPr>
       <w:keepNext/>
       <w:keepLines/>
-      <w:jc w:val="center"/>
     </w:pPr>
+    <w:rPr>
+      <w:sz w:val="24"/>
+      <w:szCs w:val="24"/>
+    </w:rPr>
   </w:style>
   <w:style w:styleId="Date" w:type="paragraph">
     <w:name w:val="Date"/>
+    <w:basedOn w:val="Title"/>
     <w:next w:val="BodyText"/>
     <w:qFormat/>
     <w:pPr>
       <w:keepNext/>
       <w:keepLines/>
-      <w:jc w:val="center"/>
     </w:pPr>
+    <w:rPr>
+      <w:sz w:val="24"/>
+      <w:szCs w:val="24"/>
+    </w:rPr>
   </w:style>
   <w:style w:customStyle="1" w:styleId="AbstractTitle" w:type="paragraph">
     <w:name w:val="Abstract Title"/>
@@ -5089,13 +6543,6 @@
       </w:tblCellMar>
     </w:tblPr>
     <w:tblStylePr w:type="firstRow">
-      <w:tblPr>
-        <w:jc w:val="left"/>
-        <w:tblInd w:type="dxa" w:w="0"/>
-      </w:tblPr>
-      <w:trPr>
-        <w:jc w:val="left"/>
-      </w:trPr>
       <w:tcPr>
         <w:tcBorders>
           <w:bottom w:val="single"/>

</xml_diff>

<commit_message>
Record v1.0.1 tagged rebuild and submission state
</commit_message>
<xml_diff>
--- a/paper/PT60-Candidate_Scientific_Data_draft.docx
+++ b/paper/PT60-Candidate_Scientific_Data_draft.docx
@@ -72,7 +72,7 @@
         <w:t xml:space="preserve">power-grid dataset; data provenance; topology reconstruction; distribution networks; technical validation; open data</w:t>
       </w:r>
     </w:p>
-    <w:bookmarkStart w:id="9" w:name="background-summary"/>
+    <w:bookmarkStart w:id="20" w:name="background-summary"/>
     <w:p>
       <w:pPr>
         <w:pStyle w:val="Heading1"/>
@@ -180,8 +180,8 @@
         <w:t xml:space="preserve">applies these principles to a Portuguese 60 kV distribution-layer reconstruction while exposing rejected circuits and semantic status fields.</w:t>
       </w:r>
     </w:p>
-    <w:bookmarkEnd w:id="9"/>
-    <w:bookmarkStart w:id="26" w:name="methods"/>
+    <w:bookmarkEnd w:id="20"/>
+    <w:bookmarkStart w:id="37" w:name="methods"/>
     <w:p>
       <w:pPr>
         <w:pStyle w:val="Heading1"/>
@@ -190,7 +190,7 @@
         <w:t xml:space="preserve">Methods</w:t>
       </w:r>
     </w:p>
-    <w:bookmarkStart w:id="12" w:name="source-datasets"/>
+    <w:bookmarkStart w:id="23" w:name="source-datasets"/>
     <w:p>
       <w:pPr>
         <w:pStyle w:val="Heading2"/>
@@ -244,7 +244,7 @@
       <w:r>
         <w:t xml:space="preserve"> </w:t>
       </w:r>
-      <w:hyperlink r:id="rId10">
+      <w:hyperlink r:id="rId21">
         <w:r>
           <w:rPr>
             <w:rStyle w:val="Hyperlink"/>
@@ -256,7 +256,7 @@
         <w:t xml:space="preserve">; the other routes substitute the identifiers shown in the table. The final reacquisition audit on 14 July 2026 returned HTTP 404 for all four recorded routes for each topology-critical dataset.</w:t>
       </w:r>
     </w:p>
-    <w:bookmarkStart w:id="11" w:name="tab:source-inputs"/>
+    <w:bookmarkStart w:id="22" w:name="tab:source-inputs"/>
     <w:p>
       <w:pPr>
         <w:pStyle w:val="TableCaption"/>
@@ -540,7 +540,7 @@
         </w:tc>
       </w:tr>
     </w:tbl>
-    <w:bookmarkEnd w:id="11"/>
+    <w:bookmarkEnd w:id="22"/>
     <w:p>
       <w:pPr>
         <w:pStyle w:val="BodyText"/>
@@ -569,8 +569,8 @@
         <w:t xml:space="preserve">.</w:t>
       </w:r>
     </w:p>
-    <w:bookmarkEnd w:id="12"/>
-    <w:bookmarkStart w:id="13" w:name="data-acquisition"/>
+    <w:bookmarkEnd w:id="23"/>
+    <w:bookmarkStart w:id="24" w:name="data-acquisition"/>
     <w:p>
       <w:pPr>
         <w:pStyle w:val="Heading2"/>
@@ -595,8 +595,8 @@
         <w:t xml:space="preserve">The acquisition scope is limited to the E-REDES AT layer represented in the documented snapshot. It does not include a verified REN transmission boundary, complete national generation, measured operating conditions, or authoritative switching-state data. These omissions are treated as scope boundaries of the dataset rather than as gaps to be silently imputed.</w:t>
       </w:r>
     </w:p>
-    <w:bookmarkEnd w:id="13"/>
-    <w:bookmarkStart w:id="15" w:name="data-preprocessing"/>
+    <w:bookmarkEnd w:id="24"/>
+    <w:bookmarkStart w:id="26" w:name="data-preprocessing"/>
     <w:p>
       <w:pPr>
         <w:pStyle w:val="Heading2"/>
@@ -675,8 +675,8 @@
       <w:pPr>
         <w:pStyle w:val="BodyText"/>
       </w:pPr>
-      <w:bookmarkStart w:id="14" w:name="sec:projection-error-audit"/>
-      <w:bookmarkEnd w:id="14"/>
+      <w:bookmarkStart w:id="25" w:name="sec:projection-error-audit"/>
+      <w:bookmarkEnd w:id="25"/>
       <w:r>
         <w:t xml:space="preserve"> </w:t>
       </w:r>
@@ -692,8 +692,8 @@
         <w:t xml:space="preserve">Facilities are standardized into node candidates with associated codes, names, types, source roles, and footprint-ready geometries. Source line features are standardized into endpoint-bearing line records. Ambiguous matches and unresolved endpoints are retained as explicit states for later classification. This preprocessing stage therefore prepares line and facility inputs for reconstruction without asserting that each input line already corresponds to a valid inter-facility branch.</w:t>
       </w:r>
     </w:p>
-    <w:bookmarkEnd w:id="15"/>
-    <w:bookmarkStart w:id="17" w:name="provenance-model"/>
+    <w:bookmarkEnd w:id="26"/>
+    <w:bookmarkStart w:id="28" w:name="provenance-model"/>
     <w:p>
       <w:pPr>
         <w:pStyle w:val="Heading2"/>
@@ -756,78 +756,74 @@
               </m:r>
             </m:sub>
           </m:sSub>
-          <m:r>
-            <m:rPr>
-              <m:sty m:val="p"/>
-            </m:rPr>
-            <m:t>(</m:t>
-          </m:r>
-          <m:r>
-            <m:t>o</m:t>
-          </m:r>
-          <m:r>
-            <m:rPr>
-              <m:sty m:val="p"/>
-            </m:rPr>
-            <m:t>)</m:t>
-          </m:r>
+          <m:d>
+            <m:dPr>
+              <m:begChr m:val="("/>
+              <m:endChr m:val=")"/>
+              <m:sepChr m:val=""/>
+              <m:grow/>
+            </m:dPr>
+            <m:e>
+              <m:r>
+                <m:t>o</m:t>
+              </m:r>
+            </m:e>
+          </m:d>
           <m:r>
             <m:rPr>
               <m:sty m:val="p"/>
             </m:rPr>
             <m:t>=</m:t>
           </m:r>
-          <m:r>
-            <m:rPr>
-              <m:sty m:val="p"/>
-            </m:rPr>
-            <m:t>(</m:t>
-          </m:r>
-          <m:r>
-            <m:t>v</m:t>
-          </m:r>
-          <m:r>
-            <m:rPr>
-              <m:sty m:val="p"/>
-            </m:rPr>
-            <m:t>,</m:t>
-          </m:r>
-          <m:r>
-            <m:t>s</m:t>
-          </m:r>
-          <m:r>
-            <m:rPr>
-              <m:sty m:val="p"/>
-            </m:rPr>
-            <m:t>,</m:t>
-          </m:r>
-          <m:r>
-            <m:t>q</m:t>
-          </m:r>
-          <m:r>
-            <m:rPr>
-              <m:sty m:val="p"/>
-            </m:rPr>
-            <m:t>,</m:t>
-          </m:r>
-          <m:r>
-            <m:t>a</m:t>
-          </m:r>
-          <m:r>
-            <m:rPr>
-              <m:sty m:val="p"/>
-            </m:rPr>
-            <m:t>,</m:t>
-          </m:r>
-          <m:r>
-            <m:t>e</m:t>
-          </m:r>
-          <m:r>
-            <m:rPr>
-              <m:sty m:val="p"/>
-            </m:rPr>
-            <m:t>)</m:t>
-          </m:r>
+          <m:d>
+            <m:dPr>
+              <m:begChr m:val="("/>
+              <m:endChr m:val=")"/>
+              <m:sepChr m:val=""/>
+              <m:grow/>
+            </m:dPr>
+            <m:e>
+              <m:r>
+                <m:t>v</m:t>
+              </m:r>
+              <m:r>
+                <m:rPr>
+                  <m:sty m:val="p"/>
+                </m:rPr>
+                <m:t>,</m:t>
+              </m:r>
+              <m:r>
+                <m:t>s</m:t>
+              </m:r>
+              <m:r>
+                <m:rPr>
+                  <m:sty m:val="p"/>
+                </m:rPr>
+                <m:t>,</m:t>
+              </m:r>
+              <m:r>
+                <m:t>q</m:t>
+              </m:r>
+              <m:r>
+                <m:rPr>
+                  <m:sty m:val="p"/>
+                </m:rPr>
+                <m:t>,</m:t>
+              </m:r>
+              <m:r>
+                <m:t>a</m:t>
+              </m:r>
+              <m:r>
+                <m:rPr>
+                  <m:sty m:val="p"/>
+                </m:rPr>
+                <m:t>,</m:t>
+              </m:r>
+              <m:r>
+                <m:t>e</m:t>
+              </m:r>
+            </m:e>
+          </m:d>
           <m:r>
             <m:rPr>
               <m:sty m:val="p"/>
@@ -915,7 +911,7 @@
         <w:t xml:space="preserve">an exclusion or blocking reason.</w:t>
       </w:r>
     </w:p>
-    <w:bookmarkStart w:id="16" w:name="tab:semantics"/>
+    <w:bookmarkStart w:id="27" w:name="tab:semantics"/>
     <w:p>
       <w:pPr>
         <w:pStyle w:val="TableCaption"/>
@@ -1188,7 +1184,7 @@
         </w:tc>
       </w:tr>
     </w:tbl>
-    <w:bookmarkEnd w:id="16"/>
+    <w:bookmarkEnd w:id="27"/>
     <w:p>
       <w:pPr>
         <w:pStyle w:val="BodyText"/>
@@ -1262,8 +1258,8 @@
         <w:t xml:space="preserve">provide file-level structure, joins, versions, roles, and checksums.</w:t>
       </w:r>
     </w:p>
-    <w:bookmarkEnd w:id="17"/>
-    <w:bookmarkStart w:id="22" w:name="reconstruction-pipeline"/>
+    <w:bookmarkEnd w:id="28"/>
+    <w:bookmarkStart w:id="33" w:name="reconstruction-pipeline"/>
     <w:p>
       <w:pPr>
         <w:pStyle w:val="Heading2"/>
@@ -1310,7 +1306,7 @@
         <w:t xml:space="preserve">shows how retained and downgraded records pass through common validation and release-contract stages.</w:t>
       </w:r>
     </w:p>
-    <w:bookmarkStart w:id="21" w:name="fig:pipeline"/>
+    <w:bookmarkStart w:id="32" w:name="fig:pipeline"/>
     <w:p>
       <w:pPr>
         <w:pStyle w:val="CaptionedFigure"/>
@@ -1320,18 +1316,18 @@
           <wp:inline>
             <wp:extent cx="5334000" cy="2667771"/>
             <wp:effectExtent b="0" l="0" r="0" t="0"/>
-            <wp:docPr descr="" title="" id="19" name="Picture"/>
+            <wp:docPr descr="" title="" id="30" name="Picture"/>
             <a:graphic>
               <a:graphicData uri="http://schemas.openxmlformats.org/drawingml/2006/picture">
                 <pic:pic>
                   <pic:nvPicPr>
-                    <pic:cNvPr descr="fig1_pipeline_overview.png" id="20" name="Picture"/>
+                    <pic:cNvPr descr="fig1_pipeline_overview.png" id="31" name="Picture"/>
                     <pic:cNvPicPr>
                       <a:picLocks noChangeArrowheads="1" noChangeAspect="1"/>
                     </pic:cNvPicPr>
                   </pic:nvPicPr>
                   <pic:blipFill>
-                    <a:blip r:embed="rId18"/>
+                    <a:blip r:embed="rId29"/>
                     <a:stretch>
                       <a:fillRect/>
                     </a:stretch>
@@ -1378,9 +1374,9 @@
         <w:t xml:space="preserve">. Blue boxes denote transformations or validation, the yellow diamond is the declared retention gate, green boxes are deposited release layers, the red box preserves downgraded/rejected records, and the purple box records provenance and reuse contracts. The diagram summarizes workflow structure and claim boundaries rather than measured performance.</w:t>
       </w:r>
     </w:p>
-    <w:bookmarkEnd w:id="21"/>
-    <w:bookmarkEnd w:id="22"/>
-    <w:bookmarkStart w:id="23" w:name="candidate-selection"/>
+    <w:bookmarkEnd w:id="32"/>
+    <w:bookmarkEnd w:id="33"/>
+    <w:bookmarkStart w:id="34" w:name="candidate-selection"/>
     <w:p>
       <w:pPr>
         <w:pStyle w:val="Heading2"/>
@@ -1458,8 +1454,8 @@
           <m:d>
             <m:dPr>
               <m:begChr m:val="("/>
+              <m:endChr m:val=")"/>
               <m:sepChr m:val=""/>
-              <m:endChr m:val=")"/>
               <m:grow/>
             </m:dPr>
             <m:e>
@@ -1484,8 +1480,8 @@
               <m:d>
                 <m:dPr>
                   <m:begChr m:val="("/>
+                  <m:endChr m:val=")"/>
                   <m:sepChr m:val=""/>
-                  <m:endChr m:val=")"/>
                   <m:grow/>
                 </m:dPr>
                 <m:e>
@@ -1601,37 +1597,35 @@
         <w:t xml:space="preserve"> </w:t>
       </w:r>
       <m:oMath>
-        <m:r>
-          <m:rPr>
-            <m:sty m:val="p"/>
-          </m:rPr>
-          <m:t>[</m:t>
-        </m:r>
-        <m:r>
-          <m:t>0</m:t>
-        </m:r>
-        <m:r>
-          <m:rPr>
-            <m:sty m:val="p"/>
-          </m:rPr>
-          <m:t>,</m:t>
-        </m:r>
-        <m:r>
-          <m:t>1</m:t>
-        </m:r>
-        <m:r>
-          <m:rPr>
-            <m:sty m:val="p"/>
-          </m:rPr>
-          <m:t>]</m:t>
-        </m:r>
+        <m:d>
+          <m:dPr>
+            <m:begChr m:val="["/>
+            <m:endChr m:val="]"/>
+            <m:sepChr m:val=""/>
+            <m:grow/>
+          </m:dPr>
+          <m:e>
+            <m:r>
+              <m:t>0</m:t>
+            </m:r>
+            <m:r>
+              <m:rPr>
+                <m:sty m:val="p"/>
+              </m:rPr>
+              <m:t>,</m:t>
+            </m:r>
+            <m:r>
+              <m:t>1</m:t>
+            </m:r>
+          </m:e>
+        </m:d>
       </m:oMath>
       <w:r>
         <w:t xml:space="preserve">. It is a deterministic rule score, not a probability, precision estimate, or operator-validation measure. It is computed only after a circuit passes the inter-facility retention rule and does not affect merging, retention, the 216-setting selection score, or the OSM-derived evidence category.</w:t>
       </w:r>
     </w:p>
-    <w:bookmarkEnd w:id="23"/>
-    <w:bookmarkStart w:id="24" w:name="parameter-sweep"/>
+    <w:bookmarkEnd w:id="34"/>
+    <w:bookmarkStart w:id="35" w:name="parameter-sweep"/>
     <w:p>
       <w:pPr>
         <w:pStyle w:val="Heading2"/>
@@ -1821,39 +1815,37 @@
             </m:rPr>
             <m:t>1</m:t>
           </m:r>
-          <m:r>
-            <m:rPr>
-              <m:sty m:val="p"/>
-            </m:rPr>
-            <m:t>[</m:t>
-          </m:r>
-          <m:sSub>
+          <m:d>
+            <m:dPr>
+              <m:begChr m:val="["/>
+              <m:endChr m:val="]"/>
+              <m:sepChr m:val=""/>
+              <m:grow/>
+            </m:dPr>
             <m:e>
+              <m:sSub>
+                <m:e>
+                  <m:r>
+                    <m:t>b</m:t>
+                  </m:r>
+                </m:e>
+                <m:sub>
+                  <m:r>
+                    <m:t>i</m:t>
+                  </m:r>
+                </m:sub>
+              </m:sSub>
               <m:r>
-                <m:t>b</m:t>
+                <m:rPr>
+                  <m:sty m:val="p"/>
+                </m:rPr>
+                <m:t>=</m:t>
+              </m:r>
+              <m:r>
+                <m:t>500</m:t>
               </m:r>
             </m:e>
-            <m:sub>
-              <m:r>
-                <m:t>i</m:t>
-              </m:r>
-            </m:sub>
-          </m:sSub>
-          <m:r>
-            <m:rPr>
-              <m:sty m:val="p"/>
-            </m:rPr>
-            <m:t>=</m:t>
-          </m:r>
-          <m:r>
-            <m:t>500</m:t>
-          </m:r>
-          <m:r>
-            <m:rPr>
-              <m:sty m:val="p"/>
-            </m:rPr>
-            <m:t>]</m:t>
-          </m:r>
+          </m:d>
           <m:r>
             <m:rPr>
               <m:sty m:val="p"/>
@@ -1869,39 +1861,37 @@
             </m:rPr>
             <m:t>1</m:t>
           </m:r>
-          <m:r>
-            <m:rPr>
-              <m:sty m:val="p"/>
-            </m:rPr>
-            <m:t>[</m:t>
-          </m:r>
-          <m:sSub>
+          <m:d>
+            <m:dPr>
+              <m:begChr m:val="["/>
+              <m:endChr m:val="]"/>
+              <m:sepChr m:val=""/>
+              <m:grow/>
+            </m:dPr>
             <m:e>
+              <m:sSub>
+                <m:e>
+                  <m:r>
+                    <m:t>s</m:t>
+                  </m:r>
+                </m:e>
+                <m:sub>
+                  <m:r>
+                    <m:t>i</m:t>
+                  </m:r>
+                </m:sub>
+              </m:sSub>
               <m:r>
-                <m:t>s</m:t>
+                <m:rPr>
+                  <m:sty m:val="p"/>
+                </m:rPr>
+                <m:t>=</m:t>
+              </m:r>
+              <m:r>
+                <m:t>50</m:t>
               </m:r>
             </m:e>
-            <m:sub>
-              <m:r>
-                <m:t>i</m:t>
-              </m:r>
-            </m:sub>
-          </m:sSub>
-          <m:r>
-            <m:rPr>
-              <m:sty m:val="p"/>
-            </m:rPr>
-            <m:t>=</m:t>
-          </m:r>
-          <m:r>
-            <m:t>50</m:t>
-          </m:r>
-          <m:r>
-            <m:rPr>
-              <m:sty m:val="p"/>
-            </m:rPr>
-            <m:t>]</m:t>
-          </m:r>
+          </m:d>
           <m:r>
             <m:rPr>
               <m:sty m:val="p"/>
@@ -2073,8 +2063,8 @@
         <w:t xml:space="preserve">Large-language-model assistance was used for code review, structural editing, and release-checklist support. The authors inspected the generated changes and remain responsible for the methods, numerical results, citations, release files, and claims. This disclosure must be confirmed against the authors’ actual use before submission.</w:t>
       </w:r>
     </w:p>
-    <w:bookmarkEnd w:id="24"/>
-    <w:bookmarkStart w:id="25" w:name="dataset-generation"/>
+    <w:bookmarkEnd w:id="35"/>
+    <w:bookmarkStart w:id="36" w:name="dataset-generation"/>
     <w:p>
       <w:pPr>
         <w:pStyle w:val="Heading2"/>
@@ -2099,9 +2089,9 @@
         <w:t xml:space="preserve">The same workflow packages the reconstruction-sensitivity table, public-source triangulation outputs, negative controls, an independence-risk audit, internal-validation results, source manifests, schemas, and checksum-linked inventory. Electrical diagnostics and Stage 1–5 learning interfaces are excluded from the main v1.0.1 public archive because they depend on incomplete, proxy, benchmark-only, or scenario-derived information.</w:t>
       </w:r>
     </w:p>
-    <w:bookmarkEnd w:id="25"/>
-    <w:bookmarkEnd w:id="26"/>
-    <w:bookmarkStart w:id="40" w:name="data-record"/>
+    <w:bookmarkEnd w:id="36"/>
+    <w:bookmarkEnd w:id="37"/>
+    <w:bookmarkStart w:id="51" w:name="data-record"/>
     <w:p>
       <w:pPr>
         <w:pStyle w:val="Heading1"/>
@@ -2110,7 +2100,7 @@
         <w:t xml:space="preserve">Data Record</w:t>
       </w:r>
     </w:p>
-    <w:bookmarkStart w:id="28" w:name="repository-overview"/>
+    <w:bookmarkStart w:id="39" w:name="repository-overview"/>
     <w:p>
       <w:pPr>
         <w:pStyle w:val="Heading2"/>
@@ -2133,7 +2123,7 @@
         <w:t xml:space="preserve"> </w:t>
       </w:r>
       <w:r>
-        <w:t xml:space="preserve">version 1.0.1 has been prepared for a reserved figshare record</w:t>
+        <w:t xml:space="preserve">version 1.0.1 has been deposited in the reserved figshare record</w:t>
       </w:r>
       <w:r>
         <w:rPr>
@@ -2147,7 +2137,7 @@
       <w:r>
         <w:t xml:space="preserve"> </w:t>
       </w:r>
-      <w:hyperlink r:id="rId27">
+      <w:hyperlink r:id="rId38">
         <w:r>
           <w:rPr>
             <w:rStyle w:val="Hyperlink"/>
@@ -2156,7 +2146,7 @@
         </w:r>
       </w:hyperlink>
       <w:r>
-        <w:t xml:space="preserve">. The archive</w:t>
+        <w:t xml:space="preserve">. The final tagged-build archive</w:t>
       </w:r>
       <w:r>
         <w:t xml:space="preserve"> </w:t>
@@ -2180,10 +2170,10 @@
         <w:rPr>
           <w:rStyle w:val="VerbatimChar"/>
         </w:rPr>
-        <w:t xml:space="preserve">a8a17396830407a7d7ea16e50ebb67336a6015f2aee4781391fa59c54fde5459</w:t>
-      </w:r>
-      <w:r>
-        <w:t xml:space="preserve">. The v1.0.1 file must replace the earlier uploaded draft before the item is published.</w:t>
+        <w:t xml:space="preserve">3240cd741e6af985c2d7e631856cc3482443ab56d0e4a687cdb3b63c6c957271</w:t>
+      </w:r>
+      <w:r>
+        <w:t xml:space="preserve">.</w:t>
       </w:r>
     </w:p>
     <w:p>
@@ -2206,8 +2196,8 @@
         <w:t xml:space="preserve">.</w:t>
       </w:r>
     </w:p>
-    <w:bookmarkEnd w:id="28"/>
-    <w:bookmarkStart w:id="30" w:name="file-organization"/>
+    <w:bookmarkEnd w:id="39"/>
+    <w:bookmarkStart w:id="41" w:name="file-organization"/>
     <w:p>
       <w:pPr>
         <w:pStyle w:val="Heading2"/>
@@ -2364,7 +2354,7 @@
         <w:t xml:space="preserve">summarizes the directory-level organization.</w:t>
       </w:r>
     </w:p>
-    <w:bookmarkStart w:id="29" w:name="tab:archive-layout"/>
+    <w:bookmarkStart w:id="40" w:name="tab:archive-layout"/>
     <w:p>
       <w:pPr>
         <w:pStyle w:val="TableCaption"/>
@@ -2685,9 +2675,9 @@
         </w:tc>
       </w:tr>
     </w:tbl>
-    <w:bookmarkEnd w:id="29"/>
-    <w:bookmarkEnd w:id="30"/>
-    <w:bookmarkStart w:id="38" w:name="released-artifacts"/>
+    <w:bookmarkEnd w:id="40"/>
+    <w:bookmarkEnd w:id="41"/>
+    <w:bookmarkStart w:id="49" w:name="released-artifacts"/>
     <w:p>
       <w:pPr>
         <w:pStyle w:val="Heading2"/>
@@ -2718,7 +2708,7 @@
         <w:t xml:space="preserve">identifies the principal machine-readable records and their roles.</w:t>
       </w:r>
     </w:p>
-    <w:bookmarkStart w:id="31" w:name="tab:composition"/>
+    <w:bookmarkStart w:id="42" w:name="tab:composition"/>
     <w:p>
       <w:pPr>
         <w:pStyle w:val="TableCaption"/>
@@ -3085,8 +3075,8 @@
         </w:tc>
       </w:tr>
     </w:tbl>
-    <w:bookmarkEnd w:id="31"/>
-    <w:bookmarkStart w:id="32" w:name="retained-candidate-branches-csv."/>
+    <w:bookmarkEnd w:id="42"/>
+    <w:bookmarkStart w:id="43" w:name="retained-candidate-branches-csv."/>
     <w:p>
       <w:pPr>
         <w:pStyle w:val="Heading4"/>
@@ -3157,8 +3147,8 @@
         <w:t xml:space="preserve">use metres and kilometres, respectively. Missing electrical fields are not backfilled with model defaults.</w:t>
       </w:r>
     </w:p>
-    <w:bookmarkEnd w:id="32"/>
-    <w:bookmarkStart w:id="33" w:name="circuit-classification-ledger-csv."/>
+    <w:bookmarkEnd w:id="43"/>
+    <w:bookmarkStart w:id="44" w:name="circuit-classification-ledger-csv."/>
     <w:p>
       <w:pPr>
         <w:pStyle w:val="Heading4"/>
@@ -3184,8 +3174,8 @@
         <w:t xml:space="preserve">) contains all 1,342 merged circuit candidates, including the 358 retained records and 984 downgraded or rejected outcomes. Rows include construction-setting identifiers, terminal structure, facility membership, ambiguity and conflict indicators, source-line membership, disposition, and downgrade reason. The ledger exposes what was not retained and why.</w:t>
       </w:r>
     </w:p>
-    <w:bookmarkEnd w:id="33"/>
-    <w:bookmarkStart w:id="34" w:name="reconstruction-sensitivity-csv."/>
+    <w:bookmarkEnd w:id="44"/>
+    <w:bookmarkStart w:id="45" w:name="reconstruction-sensitivity-csv."/>
     <w:p>
       <w:pPr>
         <w:pStyle w:val="Heading4"/>
@@ -3223,8 +3213,8 @@
         <w:t xml:space="preserve">.</w:t>
       </w:r>
     </w:p>
-    <w:bookmarkEnd w:id="34"/>
-    <w:bookmarkStart w:id="35" w:name="graphml-multigraph."/>
+    <w:bookmarkEnd w:id="45"/>
+    <w:bookmarkStart w:id="46" w:name="graphml-multigraph."/>
     <w:p>
       <w:pPr>
         <w:pStyle w:val="Heading4"/>
@@ -3265,8 +3255,8 @@
         <w:t xml:space="preserve">edge identifiers and facility identifiers link the GraphML to the retained branch table and facility summaries. Parallel edges are preserved.</w:t>
       </w:r>
     </w:p>
-    <w:bookmarkEnd w:id="35"/>
-    <w:bookmarkStart w:id="36" w:name="validation-and-public-evidence-records."/>
+    <w:bookmarkEnd w:id="46"/>
+    <w:bookmarkStart w:id="47" w:name="validation-and-public-evidence-records."/>
     <w:p>
       <w:pPr>
         <w:pStyle w:val="Heading4"/>
@@ -3313,8 +3303,8 @@
         <w:t xml:space="preserve">field links these records to the retained branch table. Evidence and independence-risk categories are audit variables, not confirmed topology labels.</w:t>
       </w:r>
     </w:p>
-    <w:bookmarkEnd w:id="36"/>
-    <w:bookmarkStart w:id="37" w:name="metadata-and-manifests."/>
+    <w:bookmarkEnd w:id="47"/>
+    <w:bookmarkStart w:id="48" w:name="metadata-and-manifests."/>
     <w:p>
       <w:pPr>
         <w:pStyle w:val="Heading4"/>
@@ -3391,9 +3381,9 @@
         <w:t xml:space="preserve">provides an independently checkable path–digest list.</w:t>
       </w:r>
     </w:p>
-    <w:bookmarkEnd w:id="37"/>
-    <w:bookmarkEnd w:id="38"/>
-    <w:bookmarkStart w:id="39" w:name="X1b441bc8825d4205e2695a1ab561ef77fea70bc"/>
+    <w:bookmarkEnd w:id="48"/>
+    <w:bookmarkEnd w:id="49"/>
+    <w:bookmarkStart w:id="50" w:name="X1b441bc8825d4205e2695a1ab561ef77fea70bc"/>
     <w:p>
       <w:pPr>
         <w:pStyle w:val="Heading2"/>
@@ -3565,9 +3555,9 @@
         <w:t xml:space="preserve">and its JSON equivalent.</w:t>
       </w:r>
     </w:p>
-    <w:bookmarkEnd w:id="39"/>
-    <w:bookmarkEnd w:id="40"/>
-    <w:bookmarkStart w:id="49" w:name="data-overview"/>
+    <w:bookmarkEnd w:id="50"/>
+    <w:bookmarkEnd w:id="51"/>
+    <w:bookmarkStart w:id="60" w:name="data-overview"/>
     <w:p>
       <w:pPr>
         <w:pStyle w:val="Heading1"/>
@@ -3612,7 +3602,7 @@
         <w:t xml:space="preserve">shows geographic coverage and component structure. These figures describe deposited records rather than physical-network accuracy or completeness.</w:t>
       </w:r>
     </w:p>
-    <w:bookmarkStart w:id="44" w:name="fig:funnel"/>
+    <w:bookmarkStart w:id="55" w:name="fig:funnel"/>
     <w:p>
       <w:pPr>
         <w:pStyle w:val="CaptionedFigure"/>
@@ -3622,18 +3612,18 @@
           <wp:inline>
             <wp:extent cx="5334000" cy="2398353"/>
             <wp:effectExtent b="0" l="0" r="0" t="0"/>
-            <wp:docPr descr="" title="" id="42" name="Picture"/>
+            <wp:docPr descr="" title="" id="53" name="Picture"/>
             <a:graphic>
               <a:graphicData uri="http://schemas.openxmlformats.org/drawingml/2006/picture">
                 <pic:pic>
                   <pic:nvPicPr>
-                    <pic:cNvPr descr="fig2_reconstruction_funnel.png" id="43" name="Picture"/>
+                    <pic:cNvPr descr="fig2_reconstruction_funnel.png" id="54" name="Picture"/>
                     <pic:cNvPicPr>
                       <a:picLocks noChangeArrowheads="1" noChangeAspect="1"/>
                     </pic:cNvPicPr>
                   </pic:nvPicPr>
                   <pic:blipFill>
-                    <a:blip r:embed="rId41"/>
+                    <a:blip r:embed="rId52"/>
                     <a:stretch>
                       <a:fillRect/>
                     </a:stretch>
@@ -3668,8 +3658,8 @@
         <w:t xml:space="preserve">Record disposition for the selected reconstruction setting. The workflow processes 5,334 source line features into 1,342 circuit candidates, retains 358 inter-facility candidate branches, and preserves downgraded classes in the ledger. Retention denotes rule satisfaction under the documented workflow, not operator confirmation.</w:t>
       </w:r>
     </w:p>
-    <w:bookmarkEnd w:id="44"/>
-    <w:bookmarkStart w:id="48" w:name="fig:topology-quality"/>
+    <w:bookmarkEnd w:id="55"/>
+    <w:bookmarkStart w:id="59" w:name="fig:topology-quality"/>
     <w:p>
       <w:pPr>
         <w:pStyle w:val="CaptionedFigure"/>
@@ -3679,18 +3669,18 @@
           <wp:inline>
             <wp:extent cx="5116358" cy="3033728"/>
             <wp:effectExtent b="0" l="0" r="0" t="0"/>
-            <wp:docPr descr="" title="" id="46" name="Picture"/>
+            <wp:docPr descr="" title="" id="57" name="Picture"/>
             <a:graphic>
               <a:graphicData uri="http://schemas.openxmlformats.org/drawingml/2006/picture">
                 <pic:pic>
                   <pic:nvPicPr>
-                    <pic:cNvPr descr="fig3_topology_quality.png" id="47" name="Picture"/>
+                    <pic:cNvPr descr="fig3_topology_quality.png" id="58" name="Picture"/>
                     <pic:cNvPicPr>
                       <a:picLocks noChangeArrowheads="1" noChangeAspect="1"/>
                     </pic:cNvPicPr>
                   </pic:nvPicPr>
                   <pic:blipFill>
-                    <a:blip r:embed="rId45"/>
+                    <a:blip r:embed="rId56"/>
                     <a:stretch>
                       <a:fillRect/>
                     </a:stretch>
@@ -3725,9 +3715,9 @@
         <w:t xml:space="preserve">Geographic distribution and component structure of the selected candidate graph. Panel a uses released EPSG:4326 coordinates without a basemap or facility labels; blue branches belong to the 53-facility largest component, gray branches to other components, green points are connected facilities, and orange crosses are isolates. Panel b ranks all 170 components on a logarithmic scale. The graph contains 484 facilities, 358 candidate branches, and 109 isolates; these are inferred records, not an operator-validated network.</w:t>
       </w:r>
     </w:p>
-    <w:bookmarkEnd w:id="48"/>
-    <w:bookmarkEnd w:id="49"/>
-    <w:bookmarkStart w:id="65" w:name="technical-validation"/>
+    <w:bookmarkEnd w:id="59"/>
+    <w:bookmarkEnd w:id="60"/>
+    <w:bookmarkStart w:id="76" w:name="technical-validation"/>
     <w:p>
       <w:pPr>
         <w:pStyle w:val="Heading1"/>
@@ -3736,7 +3726,7 @@
         <w:t xml:space="preserve">Technical Validation</w:t>
       </w:r>
     </w:p>
-    <w:bookmarkStart w:id="50" w:name="internal-validation"/>
+    <w:bookmarkStart w:id="61" w:name="internal-validation"/>
     <w:p>
       <w:pPr>
         <w:pStyle w:val="Heading2"/>
@@ -3761,8 +3751,8 @@
         <w:t xml:space="preserve">Archive-level validation additionally checks that all 63 released files are documented, all manifest and checksum paths resolve, all 54 machine-readable paths have dictionary coverage, and the frozen headline counts agree with the core records. These results support internal usability of the deposited records, but they do not constitute external topology or electrical validation.</w:t>
       </w:r>
     </w:p>
-    <w:bookmarkEnd w:id="50"/>
-    <w:bookmarkStart w:id="51" w:name="structural-validation"/>
+    <w:bookmarkEnd w:id="61"/>
+    <w:bookmarkStart w:id="62" w:name="structural-validation"/>
     <w:p>
       <w:pPr>
         <w:pStyle w:val="Heading2"/>
@@ -3779,8 +3769,8 @@
         <w:t xml:space="preserve">Structural validation focuses on whether the reconstructed records satisfy the declared topology-building rules. Under the selected setting, the workflow converts 5,334 line features into 1,342 merged circuit candidates, of which 358 are retained and 984 are downgraded. The downgraded outcomes comprise 496 single-facility records, 215 isolated records, 106 tap or multi-terminal records, 101 self-loops, 61 ambiguous records, and five loop records for the current snapshot. Preservation of these downgraded classes is itself a validation feature because it prevents silent loss of evidence about reconstruction uncertainty.</w:t>
       </w:r>
     </w:p>
-    <w:bookmarkEnd w:id="51"/>
-    <w:bookmarkStart w:id="52" w:name="schema-validation"/>
+    <w:bookmarkEnd w:id="62"/>
+    <w:bookmarkStart w:id="63" w:name="schema-validation"/>
     <w:p>
       <w:pPr>
         <w:pStyle w:val="Heading2"/>
@@ -3802,7 +3792,114 @@
         <w:pStyle w:val="BodyText"/>
       </w:pPr>
       <w:r>
-        <w:t xml:space="preserve">For the frozen public-validation route, the internal validation export records 25 machine-readable checks across source geometry parsing, retained-branch completeness, ledger accounting, endpoint summaries, facility footprints, GraphML/table parity, sensitivity rows, and artifact hashes. The result is</w:t>
+        <w:t xml:space="preserve">For the frozen public-validation route, the internal validation export records 25 machine-readable checks across source geometry parsing, retained-branch completeness, ledger accounting, endpoint summaries, facility footprints, GraphML/table parity, sensitivity rows, and artifact hashes. The deposited export records 24 passes and one release-review warning rather than a data-consistency failure; that warning concerned clean-room equality before the v1.0.1 source tag existed. It was subsequently closed by rebuilding the archive twice from a detached clean worktree of the annotated</w:t>
+      </w:r>
+      <w:r>
+        <w:t xml:space="preserve"> </w:t>
+      </w:r>
+      <w:r>
+        <w:rPr>
+          <w:rStyle w:val="VerbatimChar"/>
+        </w:rPr>
+        <w:t xml:space="preserve">pt60-candidate-v1.0.1</w:t>
+      </w:r>
+      <w:r>
+        <w:t xml:space="preserve"> </w:t>
+      </w:r>
+      <w:r>
+        <w:t xml:space="preserve">tag with the frozen derived inputs: both stabilized builds produced SHA-256</w:t>
+      </w:r>
+      <w:r>
+        <w:t xml:space="preserve"> </w:t>
+      </w:r>
+      <w:r>
+        <w:rPr>
+          <w:rStyle w:val="VerbatimChar"/>
+        </w:rPr>
+        <w:t xml:space="preserve">3240cd741e6af985c2d7e631856cc3482443ab56d0e4a687cdb3b63c6c957271</w:t>
+      </w:r>
+      <w:r>
+        <w:t xml:space="preserve">. Clean-room extraction validation reports no manifest, checksum, dictionary-coverage, or headline-count failures. Raw/API reacquisition remains subject to the limitation stated in Usage Notes. The same export records 5,334 valid source geometries and zero invalid/dropped geometries; zero missing required retained-branch fields; zero missing required ledger fields; 358 retained branches; 984 downgraded or rejected records; 1,342 ledger rows; 64,008 endpoint-index rows across six snap thresholds; and 216 sensitivity rows.</w:t>
+      </w:r>
+    </w:p>
+    <w:bookmarkEnd w:id="63"/>
+    <w:bookmarkStart w:id="64" w:name="referential-integrity"/>
+    <w:p>
+      <w:pPr>
+        <w:pStyle w:val="Heading2"/>
+      </w:pPr>
+      <w:r>
+        <w:t xml:space="preserve">Referential integrity</w:t>
+      </w:r>
+    </w:p>
+    <w:p>
+      <w:pPr>
+        <w:pStyle w:val="FirstParagraph"/>
+      </w:pPr>
+      <w:r>
+        <w:t xml:space="preserve">Referential checks confirm that endpoint facility references, GraphML node and edge identifiers, branch-level validation records, source manifests, and manifest-linked artifact relationships resolve to valid upstream records. Graph and table views are checked for parity so that the GraphML, retained branch table, and selected facility set remain consistent with the documented isolate policy.</w:t>
+      </w:r>
+    </w:p>
+    <w:bookmarkEnd w:id="64"/>
+    <w:bookmarkStart w:id="65" w:name="graph-consistency"/>
+    <w:p>
+      <w:pPr>
+        <w:pStyle w:val="Heading2"/>
+      </w:pPr>
+      <w:r>
+        <w:t xml:space="preserve">Graph consistency</w:t>
+      </w:r>
+    </w:p>
+    <w:p>
+      <w:pPr>
+        <w:pStyle w:val="FirstParagraph"/>
+      </w:pPr>
+      <w:r>
+        <w:t xml:space="preserve">The selected all-facility graph contains 484 facilities, 358 multiedges, 170 connected components, a largest component of size 53, 109 isolates, and 28 parallel edges. The edge-induced graph contains 375 incident facilities, while the all-facility GraphML additionally preserves selected isolates. This accounting distinction is stored explicitly because graph artifacts with different isolate policies can otherwise appear inconsistent. Graph-level summaries therefore validate the released artifact against its own declared representation rather than against an external ground-truth network.</w:t>
+      </w:r>
+    </w:p>
+    <w:p>
+      <w:pPr>
+        <w:pStyle w:val="BodyText"/>
+      </w:pPr>
+      <w:r>
+        <w:t xml:space="preserve">The GraphML/table parity check confirms that all 358 retained branch identifiers appear as GraphML edge identifiers, that no extra GraphML branch identifiers are present, and that every retained branch endpoint facility resolves to a GraphML node. The GraphML has 27 parallel facility pairs, 55 edge records participating in parallel pairs, and 28 extra parallel-edge records beyond one edge per facility pair. The missingness export also confirms that all retained-branch electrical fields</w:t>
+      </w:r>
+      <w:r>
+        <w:t xml:space="preserve"> </w:t>
+      </w:r>
+      <w:r>
+        <w:rPr>
+          <w:rStyle w:val="VerbatimChar"/>
+        </w:rPr>
+        <w:t xml:space="preserve">r</w:t>
+      </w:r>
+      <w:r>
+        <w:t xml:space="preserve">,</w:t>
+      </w:r>
+      <w:r>
+        <w:t xml:space="preserve"> </w:t>
+      </w:r>
+      <w:r>
+        <w:rPr>
+          <w:rStyle w:val="VerbatimChar"/>
+        </w:rPr>
+        <w:t xml:space="preserve">x</w:t>
+      </w:r>
+      <w:r>
+        <w:t xml:space="preserve">,</w:t>
+      </w:r>
+      <w:r>
+        <w:t xml:space="preserve"> </w:t>
+      </w:r>
+      <w:r>
+        <w:rPr>
+          <w:rStyle w:val="VerbatimChar"/>
+        </w:rPr>
+        <w:t xml:space="preserve">b</w:t>
+      </w:r>
+      <w:r>
+        <w:t xml:space="preserve">, thermal limits, transformer impedance, and tap settings remain explicitly marked as</w:t>
       </w:r>
       <w:r>
         <w:t xml:space="preserve"> </w:t>
@@ -3811,106 +3908,14 @@
         <w:rPr>
           <w:smallCaps/>
         </w:rPr>
-        <w:t xml:space="preserve">PASS_WITH_WARNINGS</w:t>
-      </w:r>
-      <w:r>
-        <w:t xml:space="preserve">: 24 checks pass and one release-review warning remains rather than a data-consistency failure. The EPSG:4326 portal-export and release CRS is documented in the Data Record; the remaining warning concerns clean-room equality for the v1.0.1 tagged rebuild. Clean-room extraction validation of the v1.0.1 archive reports no manifest, checksum, dictionary-coverage, or headline-count failures. The earlier v1.0.0 tag rebuild remains the evidence for byte-for-byte reconstruction from frozen derived inputs; a v1.0.1 tagged rebuild is still required, and raw/API reacquisition remains subject to the limitation stated in Usage Notes. The same export records 5,334 valid source geometries and zero invalid/dropped geometries; zero missing required retained-branch fields; zero missing required ledger fields; 358 retained branches; 984 downgraded or rejected records; 1,342 ledger rows; 64,008 endpoint-index rows across six snap thresholds; and 216 sensitivity rows.</w:t>
-      </w:r>
-    </w:p>
-    <w:bookmarkEnd w:id="52"/>
-    <w:bookmarkStart w:id="53" w:name="referential-integrity"/>
-    <w:p>
-      <w:pPr>
-        <w:pStyle w:val="Heading2"/>
-      </w:pPr>
-      <w:r>
-        <w:t xml:space="preserve">Referential integrity</w:t>
-      </w:r>
-    </w:p>
-    <w:p>
-      <w:pPr>
-        <w:pStyle w:val="FirstParagraph"/>
-      </w:pPr>
-      <w:r>
-        <w:t xml:space="preserve">Referential checks confirm that endpoint facility references, GraphML node and edge identifiers, branch-level validation records, source manifests, and manifest-linked artifact relationships resolve to valid upstream records. Graph and table views are checked for parity so that the GraphML, retained branch table, and selected facility set remain consistent with the documented isolate policy.</w:t>
-      </w:r>
-    </w:p>
-    <w:bookmarkEnd w:id="53"/>
-    <w:bookmarkStart w:id="54" w:name="graph-consistency"/>
-    <w:p>
-      <w:pPr>
-        <w:pStyle w:val="Heading2"/>
-      </w:pPr>
-      <w:r>
-        <w:t xml:space="preserve">Graph consistency</w:t>
-      </w:r>
-    </w:p>
-    <w:p>
-      <w:pPr>
-        <w:pStyle w:val="FirstParagraph"/>
-      </w:pPr>
-      <w:r>
-        <w:t xml:space="preserve">The selected all-facility graph contains 484 facilities, 358 multiedges, 170 connected components, a largest component of size 53, 109 isolates, and 28 parallel edges. The edge-induced graph contains 375 incident facilities, while the all-facility GraphML additionally preserves selected isolates. This accounting distinction is stored explicitly because graph artifacts with different isolate policies can otherwise appear inconsistent. Graph-level summaries therefore validate the released artifact against its own declared representation rather than against an external ground-truth network.</w:t>
-      </w:r>
-    </w:p>
-    <w:p>
-      <w:pPr>
-        <w:pStyle w:val="BodyText"/>
-      </w:pPr>
-      <w:r>
-        <w:t xml:space="preserve">The GraphML/table parity check confirms that all 358 retained branch identifiers appear as GraphML edge identifiers, that no extra GraphML branch identifiers are present, and that every retained branch endpoint facility resolves to a GraphML node. The GraphML has 27 parallel facility pairs, 55 edge records participating in parallel pairs, and 28 extra parallel-edge records beyond one edge per facility pair. The missingness export also confirms that all retained-branch electrical fields</w:t>
-      </w:r>
-      <w:r>
-        <w:t xml:space="preserve"> </w:t>
-      </w:r>
-      <w:r>
-        <w:rPr>
-          <w:rStyle w:val="VerbatimChar"/>
-        </w:rPr>
-        <w:t xml:space="preserve">r</w:t>
-      </w:r>
-      <w:r>
-        <w:t xml:space="preserve">,</w:t>
-      </w:r>
-      <w:r>
-        <w:t xml:space="preserve"> </w:t>
-      </w:r>
-      <w:r>
-        <w:rPr>
-          <w:rStyle w:val="VerbatimChar"/>
-        </w:rPr>
-        <w:t xml:space="preserve">x</w:t>
-      </w:r>
-      <w:r>
-        <w:t xml:space="preserve">,</w:t>
-      </w:r>
-      <w:r>
-        <w:t xml:space="preserve"> </w:t>
-      </w:r>
-      <w:r>
-        <w:rPr>
-          <w:rStyle w:val="VerbatimChar"/>
-        </w:rPr>
-        <w:t xml:space="preserve">b</w:t>
-      </w:r>
-      <w:r>
-        <w:t xml:space="preserve">, thermal limits, transformer impedance, and tap settings remain explicitly marked as</w:t>
-      </w:r>
-      <w:r>
-        <w:t xml:space="preserve"> </w:t>
-      </w:r>
-      <w:r>
-        <w:rPr>
-          <w:smallCaps/>
-        </w:rPr>
         <w:t xml:space="preserve">MISSING_NOT_ESTIMATED</w:t>
       </w:r>
       <w:r>
         <w:t xml:space="preserve">; these missing values are part of the release semantics rather than silent nulls.</w:t>
       </w:r>
     </w:p>
-    <w:bookmarkEnd w:id="54"/>
-    <w:bookmarkStart w:id="59" w:name="sensitivity-analysis"/>
+    <w:bookmarkEnd w:id="65"/>
+    <w:bookmarkStart w:id="70" w:name="sensitivity-analysis"/>
     <w:p>
       <w:pPr>
         <w:pStyle w:val="Heading2"/>
@@ -3949,7 +3954,7 @@
         <w:t xml:space="preserve">shows these trade-offs and the selected operating point. These results support the claim that reconstruction outputs are sensitive to plausible preprocessing settings rather than identifying a uniquely correct solution.</w:t>
       </w:r>
     </w:p>
-    <w:bookmarkStart w:id="58" w:name="fig:sensitivity"/>
+    <w:bookmarkStart w:id="69" w:name="fig:sensitivity"/>
     <w:p>
       <w:pPr>
         <w:pStyle w:val="CaptionedFigure"/>
@@ -3959,18 +3964,18 @@
           <wp:inline>
             <wp:extent cx="5334000" cy="4585018"/>
             <wp:effectExtent b="0" l="0" r="0" t="0"/>
-            <wp:docPr descr="" title="" id="56" name="Picture"/>
+            <wp:docPr descr="" title="" id="67" name="Picture"/>
             <a:graphic>
               <a:graphicData uri="http://schemas.openxmlformats.org/drawingml/2006/picture">
                 <pic:pic>
                   <pic:nvPicPr>
-                    <pic:cNvPr descr="fig4_sensitivity_analysis.png" id="57" name="Picture"/>
+                    <pic:cNvPr descr="fig4_sensitivity_analysis.png" id="68" name="Picture"/>
                     <pic:cNvPicPr>
                       <a:picLocks noChangeArrowheads="1" noChangeAspect="1"/>
                     </pic:cNvPicPr>
                   </pic:nvPicPr>
                   <pic:blipFill>
-                    <a:blip r:embed="rId55"/>
+                    <a:blip r:embed="rId66"/>
                     <a:stretch>
                       <a:fillRect/>
                     </a:stretch>
@@ -4005,9 +4010,9 @@
         <w:t xml:space="preserve">Sensitivity of retained-branch counts, ambiguity, and graph connectivity to facility buffers and endpoint snap thresholds. The marked operating point indicates the documented selected setting for the release; it is not an externally calibrated optimum.</w:t>
       </w:r>
     </w:p>
-    <w:bookmarkEnd w:id="58"/>
-    <w:bookmarkEnd w:id="59"/>
-    <w:bookmarkStart w:id="61" w:name="external-triangulation"/>
+    <w:bookmarkEnd w:id="69"/>
+    <w:bookmarkEnd w:id="70"/>
+    <w:bookmarkStart w:id="72" w:name="external-triangulation"/>
     <w:p>
       <w:pPr>
         <w:pStyle w:val="Heading2"/>
@@ -4075,7 +4080,7 @@
         <w:t xml:space="preserve">, but that user-contributed tag is not operator confirmation.</w:t>
       </w:r>
     </w:p>
-    <w:bookmarkStart w:id="60" w:name="tab:osm-triangulation"/>
+    <w:bookmarkStart w:id="71" w:name="tab:osm-triangulation"/>
     <w:p>
       <w:pPr>
         <w:pStyle w:val="TableCaption"/>
@@ -4366,7 +4371,7 @@
         </w:tc>
       </w:tr>
     </w:tbl>
-    <w:bookmarkEnd w:id="60"/>
+    <w:bookmarkEnd w:id="71"/>
     <w:p>
       <w:pPr>
         <w:pStyle w:val="BodyText"/>
@@ -4389,8 +4394,8 @@
         <w:t xml:space="preserve">gives the category counts. Among 5,551 Portuguese 60 kV OSM ways, all 358 retained branches receive a non-empty evidence category: 247 strong, 104 medium, and seven weak. Complete category coverage is a matcher output, not independent external validation. The audit inspected 2,326 historical versions of 271 matched OSM ways and classifies 266 branches as lower provenance risk, 87 as unknown independence, and five as possibly same-source. OSM and E-REDES source independence cannot be established from these histories; the audit assesses risk rather than proving independence. The archive includes sanitized evidence tables but excludes raw caches, user identifiers, changesets, and history dumps.</w:t>
       </w:r>
     </w:p>
-    <w:bookmarkEnd w:id="61"/>
-    <w:bookmarkStart w:id="63" w:name="claim-bounded-validation-strategy"/>
+    <w:bookmarkEnd w:id="72"/>
+    <w:bookmarkStart w:id="74" w:name="claim-bounded-validation-strategy"/>
     <w:p>
       <w:pPr>
         <w:pStyle w:val="Heading2"/>
@@ -4449,7 +4454,7 @@
         <w:t xml:space="preserve">states the supported and excluded interpretation for each validation layer.</w:t>
       </w:r>
     </w:p>
-    <w:bookmarkStart w:id="62" w:name="tab:claim-bounded-validation"/>
+    <w:bookmarkStart w:id="73" w:name="tab:claim-bounded-validation"/>
     <w:p>
       <w:pPr>
         <w:pStyle w:val="TableCaption"/>
@@ -4714,7 +4719,7 @@
         </w:tc>
       </w:tr>
     </w:tbl>
-    <w:bookmarkEnd w:id="62"/>
+    <w:bookmarkEnd w:id="73"/>
     <w:p>
       <w:pPr>
         <w:pStyle w:val="BodyText"/>
@@ -4787,8 +4792,8 @@
         <w:t xml:space="preserve">latitude leaves all geometries valid but reduces corridor evidence from 290 to 1 branch (99.7%). These controls test the name and corridor channels; they do not estimate topology accuracy.</w:t>
       </w:r>
     </w:p>
-    <w:bookmarkEnd w:id="63"/>
-    <w:bookmarkStart w:id="64" w:name="validation-boundaries"/>
+    <w:bookmarkEnd w:id="74"/>
+    <w:bookmarkStart w:id="75" w:name="validation-boundaries"/>
     <w:p>
       <w:pPr>
         <w:pStyle w:val="Heading2"/>
@@ -4805,9 +4810,9 @@
         <w:t xml:space="preserve">Optional electrical-readiness artifacts remain diagnostic because branch parameters, transformer details, controls, measured injections, and verified boundaries are incomplete or scenario-derived. The AC power-flow extension remains outside the validated core dataset.</w:t>
       </w:r>
     </w:p>
-    <w:bookmarkEnd w:id="64"/>
-    <w:bookmarkEnd w:id="65"/>
-    <w:bookmarkStart w:id="72" w:name="usage-notes"/>
+    <w:bookmarkEnd w:id="75"/>
+    <w:bookmarkEnd w:id="76"/>
+    <w:bookmarkStart w:id="83" w:name="usage-notes"/>
     <w:p>
       <w:pPr>
         <w:pStyle w:val="Heading1"/>
@@ -4816,7 +4821,7 @@
         <w:t xml:space="preserve">Usage Notes</w:t>
       </w:r>
     </w:p>
-    <w:bookmarkStart w:id="66" w:name="intended-uses"/>
+    <w:bookmarkStart w:id="77" w:name="intended-uses"/>
     <w:p>
       <w:pPr>
         <w:pStyle w:val="Heading2"/>
@@ -4833,8 +4838,8 @@
         <w:t xml:space="preserve">The core release is intended for topology-reconstruction studies, geospatial data integration, provenance-aware network analysis, uncertainty analysis, dataset-engineering experiments, and development of downstream graph or tabular interfaces that preserve release semantics. The retained branch table and circuit-classification ledger should be used together whenever a study depends on understanding what was retained, what was downgraded, and why.</w:t>
       </w:r>
     </w:p>
-    <w:bookmarkEnd w:id="66"/>
-    <w:bookmarkStart w:id="67" w:name="non-intended-uses"/>
+    <w:bookmarkEnd w:id="77"/>
+    <w:bookmarkStart w:id="78" w:name="non-intended-uses"/>
     <w:p>
       <w:pPr>
         <w:pStyle w:val="Heading2"/>
@@ -4851,8 +4856,8 @@
         <w:t xml:space="preserve">The release is not intended for operational switching studies, protection analysis, security assessment, contingency analysis, congestion forecasting, infrastructure-targeting applications, emergency operations, asset-condition assessment, commercial network-capacity claims, regulatory network-capacity claims, or claims about the actual Portuguese grid. The candidate topology should not be described as operator-validated, and the optional diagnostic electrical and learning layers should not be described as measured system behavior.</w:t>
       </w:r>
     </w:p>
-    <w:bookmarkEnd w:id="67"/>
-    <w:bookmarkStart w:id="68" w:name="Xe8ef5dbe3d475aa708068de72ee1876c29669b6"/>
+    <w:bookmarkEnd w:id="78"/>
+    <w:bookmarkStart w:id="79" w:name="Xe8ef5dbe3d475aa708068de72ee1876c29669b6"/>
     <w:p>
       <w:pPr>
         <w:pStyle w:val="Heading2"/>
@@ -4869,8 +4874,8 @@
         <w:t xml:space="preserve">Users should read semantic status fields before aggregating or modeling the records. Observed, derived, inferred, source-backed, scenario-assumed, benchmark-only, proxy, and missing fields represent distinct evidence types. Studies that require source-backed physical parameters or operator-confirmed connectivity should filter the release accordingly and should not treat inferred or scenario-derived fields as interchangeable with observations.</w:t>
       </w:r>
     </w:p>
-    <w:bookmarkEnd w:id="68"/>
-    <w:bookmarkStart w:id="69" w:name="how-to-use-graphml"/>
+    <w:bookmarkEnd w:id="79"/>
+    <w:bookmarkStart w:id="80" w:name="how-to-use-graphml"/>
     <w:p>
       <w:pPr>
         <w:pStyle w:val="Heading2"/>
@@ -4887,8 +4892,8 @@
         <w:t xml:space="preserve">The GraphML is the most direct representation of the released candidate multigraph for graph analysis. It preserves the selected all-facility node set, including isolates, and therefore aligns with the documented component and degree summaries. Users comparing the GraphML with edge-induced views should account for the explicit isolate policy. Parallel edges are part of the released graph structure and should not be collapsed without documenting the transformation.</w:t>
       </w:r>
     </w:p>
-    <w:bookmarkEnd w:id="69"/>
-    <w:bookmarkStart w:id="70" w:name="how-to-use-csv-records"/>
+    <w:bookmarkEnd w:id="80"/>
+    <w:bookmarkStart w:id="81" w:name="how-to-use-csv-records"/>
     <w:p>
       <w:pPr>
         <w:pStyle w:val="Heading2"/>
@@ -4920,8 +4925,8 @@
         <w:t xml:space="preserve">should be used in preference to name-based joins.</w:t>
       </w:r>
     </w:p>
-    <w:bookmarkEnd w:id="70"/>
-    <w:bookmarkStart w:id="71" w:name="limitations"/>
+    <w:bookmarkEnd w:id="81"/>
+    <w:bookmarkStart w:id="82" w:name="limitations"/>
     <w:p>
       <w:pPr>
         <w:pStyle w:val="Heading2"/>
@@ -4938,9 +4943,9 @@
         <w:t xml:space="preserve">The release has four main limitations. First, it is a candidate topology derived from public E-REDES records rather than an operator-confirmed network model. Second, external triangulation provides public-source concordance categories rather than truth labels: precision is not independently estimated, and national or real-network recall cannot be estimated from the available records. Third, electrical parameters, transformer details, operating controls, and injections are incomplete or absent, so the release is not AC power-flow or OPF ready. Fourth, the DOI archive preserves the versioned derived dataset but not the raw E-REDES snapshots. Source identifiers, URLs, access timestamps, roles, and attribution are recorded, but the three topology-critical v2.1 export URLs returned HTTP 404 during the final clean-room reacquisition audit; raw/API-to-release byte reproduction is therefore not claimed.</w:t>
       </w:r>
     </w:p>
-    <w:bookmarkEnd w:id="71"/>
-    <w:bookmarkEnd w:id="72"/>
-    <w:bookmarkStart w:id="73" w:name="data-availability"/>
+    <w:bookmarkEnd w:id="82"/>
+    <w:bookmarkEnd w:id="83"/>
+    <w:bookmarkStart w:id="84" w:name="data-availability"/>
     <w:p>
       <w:pPr>
         <w:pStyle w:val="Heading1"/>
@@ -4963,12 +4968,12 @@
         <w:t xml:space="preserve"> </w:t>
       </w:r>
       <w:r>
-        <w:t xml:space="preserve">version 1.0.1 is prepared for the reserved figshare DOI</w:t>
-      </w:r>
-      <w:r>
-        <w:t xml:space="preserve"> </w:t>
-      </w:r>
-      <w:hyperlink r:id="rId27">
+        <w:t xml:space="preserve">version 1.0.1 is deposited under the reserved figshare DOI</w:t>
+      </w:r>
+      <w:r>
+        <w:t xml:space="preserve"> </w:t>
+      </w:r>
+      <w:hyperlink r:id="rId38">
         <w:r>
           <w:rPr>
             <w:rStyle w:val="Hyperlink"/>
@@ -4977,7 +4982,7 @@
         </w:r>
       </w:hyperlink>
       <w:r>
-        <w:t xml:space="preserve">. The file</w:t>
+        <w:t xml:space="preserve">. The final tagged-build file</w:t>
       </w:r>
       <w:r>
         <w:t xml:space="preserve"> </w:t>
@@ -4989,7 +4994,10 @@
         <w:t xml:space="preserve">PT60-Candidate-v1.0.1.tar.gz</w:t>
       </w:r>
       <w:r>
-        <w:t xml:space="preserve">, SHA-256</w:t>
+        <w:t xml:space="preserve"> </w:t>
+      </w:r>
+      <w:r>
+        <w:t xml:space="preserve">has SHA-256</w:t>
       </w:r>
       <w:r>
         <w:t xml:space="preserve"> </w:t>
@@ -4998,10 +5006,10 @@
         <w:rPr>
           <w:rStyle w:val="VerbatimChar"/>
         </w:rPr>
-        <w:t xml:space="preserve">a8a17396830407a7d7ea16e50ebb67336a6015f2aee4781391fa59c54fde5459</w:t>
-      </w:r>
-      <w:r>
-        <w:t xml:space="preserve">, must replace the earlier uploaded draft before publication. It contains the core topology, full circuit ledger, GraphML, sensitivity sweep, provenance, validation, machine-readable schemas, a field-level data dictionary, licensing, attribution, manifest, and checksum records described in the Data Record. Raw source downloads and optional diagnostic/interface artifacts are excluded as documented in</w:t>
+        <w:t xml:space="preserve">3240cd741e6af985c2d7e631856cc3482443ab56d0e4a687cdb3b63c6c957271</w:t>
+      </w:r>
+      <w:r>
+        <w:t xml:space="preserve">. It contains the core topology, full circuit ledger, GraphML, sensitivity sweep, provenance, validation, machine-readable schemas, a field-level data dictionary, licensing, attribution, manifest, and checksum records described in the Data Record. Raw source downloads and optional diagnostic/interface artifacts are excluded as documented in</w:t>
       </w:r>
       <w:r>
         <w:t xml:space="preserve"> </w:t>
@@ -5061,8 +5069,8 @@
         <w:t xml:space="preserve">; the software licence does not replace those data terms.</w:t>
       </w:r>
     </w:p>
-    <w:bookmarkEnd w:id="73"/>
-    <w:bookmarkStart w:id="75" w:name="code-availability"/>
+    <w:bookmarkEnd w:id="84"/>
+    <w:bookmarkStart w:id="86" w:name="code-availability"/>
     <w:p>
       <w:pPr>
         <w:pStyle w:val="Heading1"/>
@@ -5081,7 +5089,7 @@
       <w:r>
         <w:t xml:space="preserve"> </w:t>
       </w:r>
-      <w:hyperlink r:id="rId74">
+      <w:hyperlink r:id="rId85">
         <w:r>
           <w:rPr>
             <w:rStyle w:val="Hyperlink"/>
@@ -5090,7 +5098,7 @@
         </w:r>
       </w:hyperlink>
       <w:r>
-        <w:t xml:space="preserve">. The existing v1.0.0 tags preserve the prior release; an immutable v1.0.1 source tag and DOI-providing software archive remain to be created before submission. The reference environment uses Python 3.12.9 and the versioned</w:t>
+        <w:t xml:space="preserve">. The v1.0.1 release source is preserved by the annotated tag</w:t>
       </w:r>
       <w:r>
         <w:t xml:space="preserve"> </w:t>
@@ -5099,14 +5107,41 @@
         <w:rPr>
           <w:rStyle w:val="VerbatimChar"/>
         </w:rPr>
+        <w:t xml:space="preserve">pt60-candidate-v1.0.1</w:t>
+      </w:r>
+      <w:r>
+        <w:t xml:space="preserve"> </w:t>
+      </w:r>
+      <w:r>
+        <w:t xml:space="preserve">at commit</w:t>
+      </w:r>
+      <w:r>
+        <w:t xml:space="preserve"> </w:t>
+      </w:r>
+      <w:r>
+        <w:rPr>
+          <w:rStyle w:val="VerbatimChar"/>
+        </w:rPr>
+        <w:t xml:space="preserve">ab6cf36</w:t>
+      </w:r>
+      <w:r>
+        <w:t xml:space="preserve">; a detached clean worktree of this tag produced the final archive reproducibly from the frozen derived inputs. The reference environment uses Python 3.12.9 and the versioned</w:t>
+      </w:r>
+      <w:r>
+        <w:t xml:space="preserve"> </w:t>
+      </w:r>
+      <w:r>
+        <w:rPr>
+          <w:rStyle w:val="VerbatimChar"/>
+        </w:rPr>
         <w:t xml:space="preserve">requirements.txt</w:t>
       </w:r>
       <w:r>
-        <w:t xml:space="preserve">; the software is MIT licensed. The dataset archive is independently usable without installing the generation pipeline, but full regeneration from raw E-REDES/API responses is subject to the source-reacquisition limitation described in Usage Notes.</w:t>
-      </w:r>
-    </w:p>
-    <w:bookmarkEnd w:id="75"/>
-    <w:bookmarkStart w:id="76" w:name="author-contributions"/>
+        <w:t xml:space="preserve">; the software is MIT licensed. No separate software DOI is claimed. The dataset archive is independently usable without installing the generation pipeline, but full regeneration from raw E-REDES/API responses is subject to the source-reacquisition limitation described in Usage Notes.</w:t>
+      </w:r>
+    </w:p>
+    <w:bookmarkEnd w:id="86"/>
+    <w:bookmarkStart w:id="87" w:name="author-contributions"/>
     <w:p>
       <w:pPr>
         <w:pStyle w:val="Heading1"/>
@@ -5123,8 +5158,8 @@
         <w:t xml:space="preserve">The author-responsibility statement will be completed when the final author list is supplied and before submission.</w:t>
       </w:r>
     </w:p>
-    <w:bookmarkEnd w:id="76"/>
-    <w:bookmarkStart w:id="77" w:name="competing-interests"/>
+    <w:bookmarkEnd w:id="87"/>
+    <w:bookmarkStart w:id="88" w:name="competing-interests"/>
     <w:p>
       <w:pPr>
         <w:pStyle w:val="Heading1"/>
@@ -5141,8 +5176,8 @@
         <w:t xml:space="preserve">The final competing-interests declaration will be supplied before submission.</w:t>
       </w:r>
     </w:p>
-    <w:bookmarkEnd w:id="77"/>
-    <w:bookmarkStart w:id="78" w:name="acknowledgements"/>
+    <w:bookmarkEnd w:id="88"/>
+    <w:bookmarkStart w:id="89" w:name="acknowledgements"/>
     <w:p>
       <w:pPr>
         <w:pStyle w:val="Heading1"/>
@@ -5159,8 +5194,8 @@
         <w:t xml:space="preserve">Acknowledgements, if applicable, will be finalized before submission.</w:t>
       </w:r>
     </w:p>
-    <w:bookmarkEnd w:id="78"/>
-    <w:bookmarkStart w:id="79" w:name="funding"/>
+    <w:bookmarkEnd w:id="89"/>
+    <w:bookmarkStart w:id="90" w:name="funding"/>
     <w:p>
       <w:pPr>
         <w:pStyle w:val="Heading1"/>
@@ -5177,8 +5212,8 @@
         <w:t xml:space="preserve">The funding statement will be finalized before submission.</w:t>
       </w:r>
     </w:p>
-    <w:bookmarkEnd w:id="79"/>
-    <w:bookmarkStart w:id="106" w:name="bibliography"/>
+    <w:bookmarkEnd w:id="90"/>
+    <w:bookmarkStart w:id="117" w:name="bibliography"/>
     <w:p>
       <w:pPr>
         <w:pStyle w:val="Heading1"/>
@@ -5187,8 +5222,8 @@
         <w:t xml:space="preserve">References</w:t>
       </w:r>
     </w:p>
-    <w:bookmarkStart w:id="105" w:name="refs"/>
-    <w:bookmarkStart w:id="81" w:name="ref-Medjroubi2017"/>
+    <w:bookmarkStart w:id="116" w:name="refs"/>
+    <w:bookmarkStart w:id="92" w:name="ref-Medjroubi2017"/>
     <w:p>
       <w:pPr>
         <w:pStyle w:val="Bibliography"/>
@@ -5231,7 +5266,7 @@
       <w:r>
         <w:t xml:space="preserve">14–21 (2017) https://doi.org/</w:t>
       </w:r>
-      <w:hyperlink r:id="rId80">
+      <w:hyperlink r:id="rId91">
         <w:r>
           <w:rPr>
             <w:rStyle w:val="Hyperlink"/>
@@ -5243,8 +5278,8 @@
         <w:t xml:space="preserve">.</w:t>
       </w:r>
     </w:p>
-    <w:bookmarkEnd w:id="81"/>
-    <w:bookmarkStart w:id="83" w:name="ref-Horsch2018"/>
+    <w:bookmarkEnd w:id="92"/>
+    <w:bookmarkStart w:id="94" w:name="ref-Horsch2018"/>
     <w:p>
       <w:pPr>
         <w:pStyle w:val="Bibliography"/>
@@ -5296,7 +5331,7 @@
       <w:r>
         <w:t xml:space="preserve">207–215 (2018) https://doi.org/</w:t>
       </w:r>
-      <w:hyperlink r:id="rId82">
+      <w:hyperlink r:id="rId93">
         <w:r>
           <w:rPr>
             <w:rStyle w:val="Hyperlink"/>
@@ -5308,8 +5343,8 @@
         <w:t xml:space="preserve">.</w:t>
       </w:r>
     </w:p>
-    <w:bookmarkEnd w:id="83"/>
-    <w:bookmarkStart w:id="85" w:name="ref-Wiese2019"/>
+    <w:bookmarkEnd w:id="94"/>
+    <w:bookmarkStart w:id="96" w:name="ref-Wiese2019"/>
     <w:p>
       <w:pPr>
         <w:pStyle w:val="Bibliography"/>
@@ -5352,7 +5387,7 @@
       <w:r>
         <w:t xml:space="preserve">401–409 (2019) https://doi.org/</w:t>
       </w:r>
-      <w:hyperlink r:id="rId84">
+      <w:hyperlink r:id="rId95">
         <w:r>
           <w:rPr>
             <w:rStyle w:val="Hyperlink"/>
@@ -5364,8 +5399,8 @@
         <w:t xml:space="preserve">.</w:t>
       </w:r>
     </w:p>
-    <w:bookmarkEnd w:id="85"/>
-    <w:bookmarkStart w:id="87" w:name="ref-Xiong2025"/>
+    <w:bookmarkEnd w:id="96"/>
+    <w:bookmarkStart w:id="98" w:name="ref-Xiong2025"/>
     <w:p>
       <w:pPr>
         <w:pStyle w:val="Bibliography"/>
@@ -5408,7 +5443,7 @@
       <w:r>
         <w:t xml:space="preserve">277 (2025) https://doi.org/</w:t>
       </w:r>
-      <w:hyperlink r:id="rId86">
+      <w:hyperlink r:id="rId97">
         <w:r>
           <w:rPr>
             <w:rStyle w:val="Hyperlink"/>
@@ -5420,8 +5455,8 @@
         <w:t xml:space="preserve">.</w:t>
       </w:r>
     </w:p>
-    <w:bookmarkEnd w:id="87"/>
-    <w:bookmarkStart w:id="89" w:name="ref-Rivera2019"/>
+    <w:bookmarkEnd w:id="98"/>
+    <w:bookmarkStart w:id="100" w:name="ref-Rivera2019"/>
     <w:p>
       <w:pPr>
         <w:pStyle w:val="Bibliography"/>
@@ -5464,7 +5499,7 @@
       <w:r>
         <w:t xml:space="preserve">5436–5448 (2019) https://doi.org/</w:t>
       </w:r>
-      <w:hyperlink r:id="rId88">
+      <w:hyperlink r:id="rId99">
         <w:r>
           <w:rPr>
             <w:rStyle w:val="Hyperlink"/>
@@ -5476,8 +5511,8 @@
         <w:t xml:space="preserve">.</w:t>
       </w:r>
     </w:p>
-    <w:bookmarkEnd w:id="89"/>
-    <w:bookmarkStart w:id="91" w:name="ref-Haklay2008"/>
+    <w:bookmarkEnd w:id="100"/>
+    <w:bookmarkStart w:id="102" w:name="ref-Haklay2008"/>
     <w:p>
       <w:pPr>
         <w:pStyle w:val="Bibliography"/>
@@ -5529,7 +5564,7 @@
       <w:r>
         <w:t xml:space="preserve">12–18 (2008) https://doi.org/</w:t>
       </w:r>
-      <w:hyperlink r:id="rId90">
+      <w:hyperlink r:id="rId101">
         <w:r>
           <w:rPr>
             <w:rStyle w:val="Hyperlink"/>
@@ -5541,8 +5576,8 @@
         <w:t xml:space="preserve">.</w:t>
       </w:r>
     </w:p>
-    <w:bookmarkEnd w:id="91"/>
-    <w:bookmarkStart w:id="93" w:name="ref-Wilkinson2016"/>
+    <w:bookmarkEnd w:id="102"/>
+    <w:bookmarkStart w:id="104" w:name="ref-Wilkinson2016"/>
     <w:p>
       <w:pPr>
         <w:pStyle w:val="Bibliography"/>
@@ -5557,10 +5592,7 @@
         <w:t xml:space="preserve">	</w:t>
       </w:r>
       <w:r>
-        <w:t xml:space="preserve">M. D. Wilkinson, M. Dumontier, Ij. J. Aalbersberg, et al.</w:t>
-      </w:r>
-      <w:r>
-        <w:t xml:space="preserve"> The</w:t>
+        <w:t xml:space="preserve">M. D. Wilkinson, M. Dumontier, Ij. J. Aalbersberg, et al. The</w:t>
       </w:r>
       <w:r>
         <w:t xml:space="preserve"> </w:t>
@@ -5600,7 +5632,7 @@
       <w:r>
         <w:t xml:space="preserve">160018 (2016) https://doi.org/</w:t>
       </w:r>
-      <w:hyperlink r:id="rId92">
+      <w:hyperlink r:id="rId103">
         <w:r>
           <w:rPr>
             <w:rStyle w:val="Hyperlink"/>
@@ -5612,8 +5644,8 @@
         <w:t xml:space="preserve">.</w:t>
       </w:r>
     </w:p>
-    <w:bookmarkEnd w:id="93"/>
-    <w:bookmarkStart w:id="95" w:name="ref-Gebru2021"/>
+    <w:bookmarkEnd w:id="104"/>
+    <w:bookmarkStart w:id="106" w:name="ref-Gebru2021"/>
     <w:p>
       <w:pPr>
         <w:pStyle w:val="Bibliography"/>
@@ -5656,7 +5688,7 @@
       <w:r>
         <w:t xml:space="preserve">86–92 (2021) https://doi.org/</w:t>
       </w:r>
-      <w:hyperlink r:id="rId94">
+      <w:hyperlink r:id="rId105">
         <w:r>
           <w:rPr>
             <w:rStyle w:val="Hyperlink"/>
@@ -5668,8 +5700,8 @@
         <w:t xml:space="preserve">.</w:t>
       </w:r>
     </w:p>
-    <w:bookmarkEnd w:id="95"/>
-    <w:bookmarkStart w:id="97" w:name="ref-EREDESOpenData2026"/>
+    <w:bookmarkEnd w:id="106"/>
+    <w:bookmarkStart w:id="108" w:name="ref-EREDESOpenData2026"/>
     <w:p>
       <w:pPr>
         <w:pStyle w:val="Bibliography"/>
@@ -5698,7 +5730,7 @@
       <w:r>
         <w:t xml:space="preserve"> </w:t>
       </w:r>
-      <w:hyperlink r:id="rId96">
+      <w:hyperlink r:id="rId107">
         <w:r>
           <w:rPr>
             <w:rStyle w:val="Hyperlink"/>
@@ -5710,8 +5742,8 @@
         <w:t xml:space="preserve">.</w:t>
       </w:r>
     </w:p>
-    <w:bookmarkEnd w:id="97"/>
-    <w:bookmarkStart w:id="98" w:name="ref-PT60Candidate2026"/>
+    <w:bookmarkEnd w:id="108"/>
+    <w:bookmarkStart w:id="109" w:name="ref-PT60Candidate2026"/>
     <w:p>
       <w:pPr>
         <w:pStyle w:val="Bibliography"/>
@@ -5737,7 +5769,7 @@
       <w:r>
         <w:t xml:space="preserve">. (2026) https://doi.org/</w:t>
       </w:r>
-      <w:hyperlink r:id="rId27">
+      <w:hyperlink r:id="rId38">
         <w:r>
           <w:rPr>
             <w:rStyle w:val="Hyperlink"/>
@@ -5749,8 +5781,8 @@
         <w:t xml:space="preserve">.</w:t>
       </w:r>
     </w:p>
-    <w:bookmarkEnd w:id="98"/>
-    <w:bookmarkStart w:id="100" w:name="ref-OpendatasoftExploreAPI2026"/>
+    <w:bookmarkEnd w:id="109"/>
+    <w:bookmarkStart w:id="111" w:name="ref-OpendatasoftExploreAPI2026"/>
     <w:p>
       <w:pPr>
         <w:pStyle w:val="Bibliography"/>
@@ -5779,7 +5811,7 @@
       <w:r>
         <w:t xml:space="preserve"> </w:t>
       </w:r>
-      <w:hyperlink r:id="rId99">
+      <w:hyperlink r:id="rId110">
         <w:r>
           <w:rPr>
             <w:rStyle w:val="Hyperlink"/>
@@ -5791,8 +5823,8 @@
         <w:t xml:space="preserve">.</w:t>
       </w:r>
     </w:p>
-    <w:bookmarkEnd w:id="100"/>
-    <w:bookmarkStart w:id="102" w:name="ref-OSM2026"/>
+    <w:bookmarkEnd w:id="111"/>
+    <w:bookmarkStart w:id="113" w:name="ref-OSM2026"/>
     <w:p>
       <w:pPr>
         <w:pStyle w:val="Bibliography"/>
@@ -5821,7 +5853,7 @@
       <w:r>
         <w:t xml:space="preserve"> </w:t>
       </w:r>
-      <w:hyperlink r:id="rId101">
+      <w:hyperlink r:id="rId112">
         <w:r>
           <w:rPr>
             <w:rStyle w:val="Hyperlink"/>
@@ -5833,8 +5865,8 @@
         <w:t xml:space="preserve">.</w:t>
       </w:r>
     </w:p>
-    <w:bookmarkEnd w:id="102"/>
-    <w:bookmarkStart w:id="104" w:name="ref-OpenInfraMap2026"/>
+    <w:bookmarkEnd w:id="113"/>
+    <w:bookmarkStart w:id="115" w:name="ref-OpenInfraMap2026"/>
     <w:p>
       <w:pPr>
         <w:pStyle w:val="Bibliography"/>
@@ -5863,7 +5895,7 @@
       <w:r>
         <w:t xml:space="preserve"> </w:t>
       </w:r>
-      <w:hyperlink r:id="rId103">
+      <w:hyperlink r:id="rId114">
         <w:r>
           <w:rPr>
             <w:rStyle w:val="Hyperlink"/>
@@ -5875,14 +5907,10 @@
         <w:t xml:space="preserve">.</w:t>
       </w:r>
     </w:p>
-    <w:bookmarkEnd w:id="104"/>
-    <w:bookmarkEnd w:id="105"/>
-    <w:bookmarkEnd w:id="106"/>
-    <w:sectPr>
-      <w:footnotePr>
-        <w:numRestart w:val="eachSect"/>
-      </w:footnotePr>
-    </w:sectPr>
+    <w:bookmarkEnd w:id="115"/>
+    <w:bookmarkEnd w:id="116"/>
+    <w:bookmarkEnd w:id="117"/>
+    <w:sectPr/>
   </w:body>
 </w:document>
 </file>
@@ -5999,10 +6027,10 @@
   <w:docDefaults>
     <w:rPrDefault>
       <w:rPr>
-        <w:rFonts w:asciiTheme="minorHAnsi" w:cstheme="minorBidi" w:eastAsiaTheme="minorEastAsia" w:hAnsiTheme="minorHAnsi"/>
+        <w:rFonts w:asciiTheme="minorHAnsi" w:cstheme="minorBidi" w:eastAsiaTheme="minorHAnsi" w:hAnsiTheme="minorHAnsi"/>
         <w:sz w:val="24"/>
         <w:szCs w:val="24"/>
-        <w:lang w:bidi="ar-SA" w:eastAsia="zh-CN" w:val="en-US"/>
+        <w:lang w:bidi="ar-SA" w:eastAsia="en-US" w:val="en-US"/>
       </w:rPr>
     </w:rPrDefault>
     <w:pPrDefault>
@@ -6054,6 +6082,8 @@
     </w:pPr>
     <w:rPr>
       <w:rFonts w:asciiTheme="majorHAnsi" w:cstheme="majorBidi" w:eastAsiaTheme="majorEastAsia" w:hAnsiTheme="majorHAnsi"/>
+      <w:spacing w:val="-10"/>
+      <w:kern w:val="28"/>
       <w:sz w:val="56"/>
       <w:szCs w:val="56"/>
     </w:rPr>
@@ -6066,6 +6096,8 @@
     <w:rsid w:val="00A10FD9"/>
     <w:rPr>
       <w:rFonts w:asciiTheme="majorHAnsi" w:cstheme="majorBidi" w:eastAsiaTheme="majorEastAsia" w:hAnsiTheme="majorHAnsi"/>
+      <w:spacing w:val="-10"/>
+      <w:kern w:val="28"/>
       <w:sz w:val="56"/>
       <w:szCs w:val="56"/>
     </w:rPr>
@@ -6106,31 +6138,23 @@
   </w:style>
   <w:style w:customStyle="1" w:styleId="Author" w:type="paragraph">
     <w:name w:val="Author"/>
-    <w:basedOn w:val="Title"/>
     <w:next w:val="BodyText"/>
     <w:qFormat/>
     <w:pPr>
       <w:keepNext/>
       <w:keepLines/>
+      <w:jc w:val="center"/>
     </w:pPr>
-    <w:rPr>
-      <w:sz w:val="24"/>
-      <w:szCs w:val="24"/>
-    </w:rPr>
   </w:style>
   <w:style w:styleId="Date" w:type="paragraph">
     <w:name w:val="Date"/>
-    <w:basedOn w:val="Title"/>
     <w:next w:val="BodyText"/>
     <w:qFormat/>
     <w:pPr>
       <w:keepNext/>
       <w:keepLines/>
+      <w:jc w:val="center"/>
     </w:pPr>
-    <w:rPr>
-      <w:sz w:val="24"/>
-      <w:szCs w:val="24"/>
-    </w:rPr>
   </w:style>
   <w:style w:customStyle="1" w:styleId="AbstractTitle" w:type="paragraph">
     <w:name w:val="Abstract Title"/>
@@ -6543,6 +6567,13 @@
       </w:tblCellMar>
     </w:tblPr>
     <w:tblStylePr w:type="firstRow">
+      <w:tblPr>
+        <w:jc w:val="left"/>
+        <w:tblInd w:type="dxa" w:w="0"/>
+      </w:tblPr>
+      <w:trPr>
+        <w:jc w:val="left"/>
+      </w:trPr>
       <w:tcPr>
         <w:tcBorders>
           <w:bottom w:val="single"/>

</xml_diff>